<commit_message>
docs(kltn): old-vs-new benchmark (Lighthouse 13.4.0) + weave novelty/feasibility/necessity into C1 per samples
Co-Authored-By: Claude Fable 5 <noreply@anthropic.com>
</commit_message>
<xml_diff>
--- a/thesis/KLTN_BANTHAO.docx
+++ b/thesis/KLTN_BANTHAO.docx
@@ -48,7 +48,7 @@
         <w:pStyle w:val="BodyText"/>
       </w:pPr>
       <w:r>
-        <w:t xml:space="preserve">Sản phẩm của khóa luận là một hệ thống hoàn chỉnh gồm ba thành phần: máy chủ ứng dụng NestJS quản lý dữ liệu trên PostgreSQL với bộ nhớ đệm Redis, trang quản trị Next.js tích hợp Visual Builder, và trang công khai Next.js được tối ưu cho công cụ tìm kiếm. Hệ thống đã di trú thành công hơn 1.600 bài viết và khoảng 3,9 GB tư liệu hình ảnh từ website cũ, hiện thực cơ chế phân quyền theo bộ môn cho mô hình quản trị nhiều đơn vị, và được đóng gói bằng Docker để triển khai trên hạ tầng máy chủ của Khoa.</w:t>
+        <w:t xml:space="preserve">Sản phẩm của khóa luận là một hệ thống hoàn chỉnh gồm ba thành phần: máy chủ ứng dụng NestJS quản lý dữ liệu trên PostgreSQL với bộ nhớ đệm Redis, trang quản trị Next.js tích hợp Visual Builder, và trang công khai Next.js được tối ưu cho công cụ tìm kiếm. Hệ thống đã di trú thành công hơn 1.600 bài viết và khoảng 3,9 GB tư liệu hình ảnh từ website cũ, hiện thực cơ chế phân quyền theo bộ môn cho mô hình quản trị nhiều đơn vị, và được đóng gói bằng Docker để triển khai trên hạ tầng máy chủ của Khoa. Đo cùng điều kiện với website hiện hành, trang chủ mới giảm trọng lượng từ 21,2 MB còn 0,82 MB và nâng điểm hiệu năng Lighthouse từ 13 lên 74 trên thang 100, trong khi toàn bộ liên kết cũ được chuyển hướng nguyên vẹn sang địa chỉ mới.</w:t>
       </w:r>
     </w:p>
     <w:p>
@@ -142,18 +142,75 @@
         <w:t xml:space="preserve"> </w:t>
       </w:r>
       <w:r>
-        <w:t xml:space="preserve">Trang được kết xuất hoàn toàn phía máy chủ PHP không có tầng bộ nhớ đệm, tốc độ tải chậm; các thẻ metadata, sitemap và dữ liệu có cấu trúc không được sinh tự động, làm giảm thứ hạng trên công cụ tìm kiếm — kênh tiếp cận chính của sinh viên tương lai khi tìm hiểu về ngành học.</w:t>
-      </w:r>
-    </w:p>
-    <w:p>
-      <w:pPr>
-        <w:pStyle w:val="BodyText"/>
-      </w:pPr>
+        <w:t xml:space="preserve">Kết quả đo thực tế trang chủ website hiện hành bằng công cụ Lighthouse (phiên bản 13.4.0, mô phỏng thiết bị di động với mạng Slow 4G, ngày 12/07/2026) cho thấy mức độ nghiêm trọng của vấn đề: điểm hiệu năng tổng hợp chỉ đạt</w:t>
+      </w:r>
+      <w:r>
+        <w:t xml:space="preserve"> </w:t>
+      </w:r>
       <w:r>
         <w:rPr>
           <w:b/>
           <w:bCs/>
         </w:rPr>
+        <w:t xml:space="preserve">13/100</w:t>
+      </w:r>
+      <w:r>
+        <w:t xml:space="preserve">; trang chủ tải về tổng cộng</w:t>
+      </w:r>
+      <w:r>
+        <w:t xml:space="preserve"> </w:t>
+      </w:r>
+      <w:r>
+        <w:rPr>
+          <w:b/>
+          <w:bCs/>
+        </w:rPr>
+        <w:t xml:space="preserve">21,2 MB</w:t>
+      </w:r>
+      <w:r>
+        <w:t xml:space="preserve"> </w:t>
+      </w:r>
+      <w:r>
+        <w:t xml:space="preserve">qua</w:t>
+      </w:r>
+      <w:r>
+        <w:t xml:space="preserve"> </w:t>
+      </w:r>
+      <w:r>
+        <w:rPr>
+          <w:b/>
+          <w:bCs/>
+        </w:rPr>
+        <w:t xml:space="preserve">137 yêu cầu HTTP</w:t>
+      </w:r>
+      <w:r>
+        <w:t xml:space="preserve">, khiến thời gian hiển thị phần tử nội dung lớn nhất (LCP) trong điều kiện mạng di động mô phỏng lên tới hơn 80 giây — vượt xa ngưỡng 2,5 giây mà Google khuyến nghị; chỉ số dịch chuyển bố cục CLS ở mức 0,243, gấp hơn hai lần ngưỡng chấp nhận được. Về khả năng được tìm thấy, trang không có dữ liệu có cấu trúc JSON-LD, không khai báo phiên bản ngôn ngữ, ảnh không được nạp trễ, và địa chỉ</w:t>
+      </w:r>
+      <w:r>
+        <w:t xml:space="preserve"> </w:t>
+      </w:r>
+      <w:r>
+        <w:rPr>
+          <w:rStyle w:val="VerbatimChar"/>
+        </w:rPr>
+        <w:t xml:space="preserve">sitemap.xml</w:t>
+      </w:r>
+      <w:r>
+        <w:t xml:space="preserve"> </w:t>
+      </w:r>
+      <w:r>
+        <w:t xml:space="preserve">trả về một trang HTML thay vì tệp sitemap hợp lệ — nghĩa là công cụ tìm kiếm không có bản đồ nội dung nào để lập chỉ mục hơn 1.600 bài viết của Khoa. Với thực tế phần lớn sinh viên tương lai tiếp cận thông tin tuyển sinh qua tìm kiếm trên điện thoại, những con số này đồng nghĩa với việc website đang đánh mất chính nhóm độc giả quan trọng nhất của nó.</w:t>
+      </w:r>
+    </w:p>
+    <w:p>
+      <w:pPr>
+        <w:pStyle w:val="BodyText"/>
+      </w:pPr>
+      <w:r>
+        <w:rPr>
+          <w:b/>
+          <w:bCs/>
+        </w:rPr>
         <w:t xml:space="preserve">Thứ tư, về mô hình tổ chức.</w:t>
       </w:r>
       <w:r>
@@ -183,7 +240,7 @@
         <w:pStyle w:val="BodyText"/>
       </w:pPr>
       <w:r>
-        <w:t xml:space="preserve">Những hạn chế trên đặt ra nhu cầu xây dựng lại nền tảng web của Khoa theo hướng: tách phần quản trị dữ liệu khỏi phần hiển thị, trao quyền dàn trang cho người biên tập không chuyên về kỹ thuật, bảo toàn toàn bộ dữ liệu cũ, và tối ưu ngay từ thiết kế cho hiệu năng lẫn công cụ tìm kiếm. Đó là động lực trực tiếp của đề tài này.</w:t>
+        <w:t xml:space="preserve">Những hạn chế trên cho thấy việc xây dựng lại nền tảng web của Khoa là yêu cầu cần thiết chứ không phải nhu cầu làm mới giao diện: hơn 1.600 bài viết song ngữ tích lũy qua nhiều năm — tài sản thông tin không thể tái tạo của Khoa — đang phụ thuộc vào một hệ thống không còn được bảo trì, trong khi kênh tiếp cận chính của sinh viên tương lai bị chính hiệu năng của hệ thống đó chặn lại. Đề tài này được hình thành để giải quyết đồng thời bốn vấn đề nêu trên theo hướng: tách phần quản trị dữ liệu khỏi phần hiển thị, trao quyền dàn trang cho người biên tập không chuyên về kỹ thuật, bảo toàn toàn bộ dữ liệu cũ, và tối ưu ngay từ thiết kế cho hiệu năng lẫn công cụ tìm kiếm.</w:t>
       </w:r>
     </w:p>
     <w:bookmarkEnd w:id="21"/>
@@ -212,6 +269,34 @@
         <w:t xml:space="preserve">Mục tiêu thứ nhất là thiết kế kiến trúc hệ thống theo mô hình Headless CMS ba tầng, trong đó máy chủ API NestJS làm nguồn chân lý duy nhất về dữ liệu, còn trang quản trị và trang công khai là hai ứng dụng Next.js độc lập. Mục tiêu thứ hai là xây dựng trang quản trị với trình xây dựng giao diện trực quan (Visual Builder) cho phép kéo – thả khối nội dung, cùng các phân hệ quản lý bài viết song ngữ, thư viện phương tiện, quy trình xuất bản có lên lịch và lịch sử phiên bản bố cục. Mục tiêu thứ ba là hiện thực cơ chế xác thực và phân quyền hai vai trò (quản trị viên cấp cao và quản trị viên) kết hợp phân quyền theo bộ môn, sao cho quản trị viên bộ môn chỉ thao tác được trên nội dung của bộ môn mình. Mục tiêu thứ tư là di trú toàn bộ dữ liệu từ hệ thống cũ — bài viết, trang nội dung, chuyên mục, đơn vị và tư liệu hình ảnh — sang lược đồ mới một cách tự động, có thể chạy lặp lại, kèm chuyển hướng các URL cũ. Mục tiêu thứ năm là tối ưu hiệu năng và SEO cho trang công khai thông qua kết xuất phía máy chủ, bộ nhớ đệm nhiều tầng, metadata động, sitemap, dữ liệu có cấu trúc và mức sẵn sàng cho công cụ tìm kiếm dùng trí tuệ nhân tạo. Mục tiêu cuối cùng là đóng gói và triển khai hệ thống bằng Docker trên máy chủ do Khoa cấp, kèm quy trình khởi tạo dữ liệu tự động để hệ thống có thể dựng lại hoàn toàn từ mã nguồn.</w:t>
       </w:r>
     </w:p>
+    <w:p>
+      <w:pPr>
+        <w:pStyle w:val="BodyText"/>
+      </w:pPr>
+      <w:r>
+        <w:t xml:space="preserve">Các mục tiêu trên được đặt ra ở mức có thể kiểm chứng: tính đúng đắn chức năng phải được chứng minh bằng kiểm thử tự động và kịch bản có đối chứng; hiệu năng và SEO phải được lượng hóa bằng chính bộ công cụ đã dùng để khảo sát hiện trạng (Lighthouse, mục 1.1), lấy các con số của website hiện hành làm mốc so sánh. Mức độ hoàn thành từng mục tiêu được đối chiếu tại mục 4.7.</w:t>
+      </w:r>
+    </w:p>
+    <w:p>
+      <w:pPr>
+        <w:pStyle w:val="BodyText"/>
+      </w:pPr>
+      <w:r>
+        <w:t xml:space="preserve">Điểm mới của đề tài so với các hệ thống web khoa/trường phổ biến hiện nay không nằm ở việc phát minh công nghệ, mà ở cách tổ hợp các mô hình hiện đại cho một bài toán chưa có lời giải đóng gói sẵn: kiến trúc Headless CMS kết hợp trình xây dựng giao diện trực quan cho phép giảng viên tự dàn trang thay vì phụ thuộc đơn vị phát triển như mô hình thuê ngoài thông dụng; cơ chế</w:t>
+      </w:r>
+      <w:r>
+        <w:t xml:space="preserve"> </w:t>
+      </w:r>
+      <w:r>
+        <w:t xml:space="preserve">“bài viết là dữ liệu, rót vào bố cục mẫu”</w:t>
+      </w:r>
+      <w:r>
+        <w:t xml:space="preserve"> </w:t>
+      </w:r>
+      <w:r>
+        <w:t xml:space="preserve">với đồng bộ hai chiều và lịch sử phiên bản; mô hình phân quyền hai lớp vai trò kết hợp bộ môn phản ánh đúng cấu trúc tổ chức của một khoa nhiều đơn vị; quy trình di trú tự động chạy lặp lại được, bảo toàn đồng thời nội dung song ngữ, kho phương tiện lẫn giá trị SEO của các URL cũ; và việc thiết kế đón đầu xu hướng tìm kiếm bằng trí tuệ nhân tạo (GEO) — khía cạnh còn ít được đề cập trong các website đại học hiện có.</w:t>
+      </w:r>
+    </w:p>
     <w:bookmarkEnd w:id="22"/>
     <w:bookmarkStart w:id="23" w:name="đối-tượng-và-phạm-vi-nghiên-cứu"/>
     <w:p>
@@ -339,6 +424,14 @@
       </w:pPr>
       <w:r>
         <w:t xml:space="preserve">Giai đoạn cuối cùng là kiểm thử, đánh giá và triển khai: kiểm thử đơn vị phía máy chủ, kiểm thử chức năng các luồng nghiệp vụ chính (CRUD, phân quyền, xuất bản, di trú), đo hiệu năng và SEO bằng các công cụ chuẩn, so sánh với website cũ; đồng thời đóng gói Dockerfile cho từng thành phần, tệp docker-compose sản xuất kèm dịch vụ khởi tạo cơ sở dữ liệu và kịch bản triển khai tự động cho môi trường CentOS 7.9.</w:t>
+      </w:r>
+    </w:p>
+    <w:p>
+      <w:pPr>
+        <w:pStyle w:val="BodyText"/>
+      </w:pPr>
+      <w:r>
+        <w:t xml:space="preserve">Tính khả thi của kế hoạch trên được kiểm chứng ngay từ khâu chuẩn bị thay vì mặc định. Về công nghệ, toàn bộ nền tảng lựa chọn đều là mã nguồn mở trưởng thành, không phát sinh chi phí bản quyền, phù hợp nguồn lực của đơn vị công lập. Về dữ liệu, việc khảo sát ở giai đoạn thứ nhất xác nhận bản sao lưu cơ sở dữ liệu cũ đủ nguyên vẹn để di trú tự động — giả định rủi ro nhất của đề tài được kiểm chứng trước khi cam kết phạm vi. Về hạ tầng, hệ thống được thiết kế để chạy trên chính máy chủ cấu hình khiêm tốn (4 GB RAM) mà Khoa hiện có; ràng buộc hệ điều hành cũ được xử lý bằng container hóa thay vì đòi hỏi đầu tư máy chủ mới.</w:t>
       </w:r>
     </w:p>
     <w:p>
@@ -5841,7 +5934,58 @@
         <w:pStyle w:val="FirstParagraph"/>
       </w:pPr>
       <w:r>
-        <w:t xml:space="preserve">Mỗi trang sinh siêu dữ liệu từ chính nội dung: thẻ tiêu đề, mô tả (từ tóm tắt bài viết), canonical, Open Graph kèm ảnh bìa, và cặp thẻ</w:t>
+        <w:t xml:space="preserve">Mỗi trang sinh siêu dữ liệu từ chính nội dung: thẻ tiêu đề, mô tả (từ tóm tắt bài viết), canonical và bộ thẻ Open Graph kèm ảnh bìa. Bài viết nhúng khối JSON-LD</w:t>
+      </w:r>
+      <w:r>
+        <w:t xml:space="preserve"> </w:t>
+      </w:r>
+      <w:r>
+        <w:rPr>
+          <w:rStyle w:val="VerbatimChar"/>
+        </w:rPr>
+        <w:t xml:space="preserve">NewsArticle</w:t>
+      </w:r>
+      <w:r>
+        <w:t xml:space="preserve"> </w:t>
+      </w:r>
+      <w:r>
+        <w:t xml:space="preserve">(tiêu đề, thời điểm đăng, tác giả tổ chức, ảnh); biên tập viên có thể ghi đè qua bảng</w:t>
+      </w:r>
+      <w:r>
+        <w:t xml:space="preserve"> </w:t>
+      </w:r>
+      <w:r>
+        <w:rPr>
+          <w:rStyle w:val="VerbatimChar"/>
+        </w:rPr>
+        <w:t xml:space="preserve">SEOMetadata</w:t>
+      </w:r>
+      <w:r>
+        <w:t xml:space="preserve"> </w:t>
+      </w:r>
+      <w:r>
+        <w:t xml:space="preserve">khi cần tinh chỉnh thủ công. Hai phiên bản ngôn ngữ được phân tách bằng tiền tố URL (</w:t>
+      </w:r>
+      <w:r>
+        <w:rPr>
+          <w:rStyle w:val="VerbatimChar"/>
+        </w:rPr>
+        <w:t xml:space="preserve">/vi</w:t>
+      </w:r>
+      <w:r>
+        <w:t xml:space="preserve">,</w:t>
+      </w:r>
+      <w:r>
+        <w:t xml:space="preserve"> </w:t>
+      </w:r>
+      <w:r>
+        <w:rPr>
+          <w:rStyle w:val="VerbatimChar"/>
+        </w:rPr>
+        <w:t xml:space="preserve">/en</w:t>
+      </w:r>
+      <w:r>
+        <w:t xml:space="preserve">); việc phát cặp thẻ</w:t>
       </w:r>
       <w:r>
         <w:t xml:space="preserve"> </w:t>
@@ -5856,37 +6000,7 @@
         <w:t xml:space="preserve"> </w:t>
       </w:r>
       <w:r>
-        <w:t xml:space="preserve">vi/en cho hai phiên bản ngôn ngữ. Bài viết nhúng khối JSON-LD</w:t>
-      </w:r>
-      <w:r>
-        <w:t xml:space="preserve"> </w:t>
-      </w:r>
-      <w:r>
-        <w:rPr>
-          <w:rStyle w:val="VerbatimChar"/>
-        </w:rPr>
-        <w:t xml:space="preserve">NewsArticle</w:t>
-      </w:r>
-      <w:r>
-        <w:t xml:space="preserve"> </w:t>
-      </w:r>
-      <w:r>
-        <w:t xml:space="preserve">(tiêu đề, thời điểm đăng, tác giả tổ chức, ảnh); biên tập viên có thể ghi đè qua bảng</w:t>
-      </w:r>
-      <w:r>
-        <w:t xml:space="preserve"> </w:t>
-      </w:r>
-      <w:r>
-        <w:rPr>
-          <w:rStyle w:val="VerbatimChar"/>
-        </w:rPr>
-        <w:t xml:space="preserve">SEOMetadata</w:t>
-      </w:r>
-      <w:r>
-        <w:t xml:space="preserve"> </w:t>
-      </w:r>
-      <w:r>
-        <w:t xml:space="preserve">khi cần tinh chỉnh thủ công.</w:t>
+        <w:t xml:space="preserve">khai báo tường minh quan hệ giữa hai phiên bản được ghi nhận là hạng mục bổ sung (mục 4.6.1).</w:t>
       </w:r>
     </w:p>
     <w:bookmarkEnd w:id="71"/>
@@ -6714,7 +6828,7 @@
         <w:t xml:space="preserve">Ghi chú trung thực về số liệu</w:t>
       </w:r>
       <w:r>
-        <w:t xml:space="preserve">: mọi con số trong chương này là kết quả đo thật, kèm công cụ và ngày đo. Các phép đo yêu cầu tên miền công khai và HTTPS (CrUX, SSL Labs, MDN HTTP Observatory) chưa thực hiện được do máy chủ thử nghiệm chưa gắn tên miền; các vị trí này được đánh dấu 【CHƯA ĐO】kèm điều kiện cần, và sẽ bổ sung khi hạ tầng cho phép.</w:t>
+        <w:t xml:space="preserve">: mọi con số trong chương này là kết quả đo thật, kèm công cụ và ngày đo. Các chỉ số hiệu năng là số đo phòng thí nghiệm (lab) bằng Lighthouse ngày 12/07/2026; các phép đo yêu cầu tên miền công khai và HTTPS (dữ liệu trường CrUX, SSL Labs, MDN HTTP Observatory, Rich Results Test) chưa thực hiện được do máy chủ thử nghiệm chưa gắn tên miền — các vị trí này được đánh dấu 【CHƯA ĐO】kèm điều kiện cần, và sẽ bổ sung khi hạ tầng cho phép.</w:t>
       </w:r>
     </w:p>
     <w:bookmarkStart w:id="88" w:name="phương-pháp-đánh-giá"/>
@@ -7078,7 +7192,31 @@
         <w:t xml:space="preserve"> </w:t>
       </w:r>
       <w:r>
-        <w:t xml:space="preserve">(1.704 bài viết, khoảng 1.649 bố cục, 3,9 GB phương tiện) — nghĩa là các phép kiểm thử chạy trên khối lượng dữ liệu tương đương vận hành thật, không phải dữ liệu mẫu. Môi trường triển khai đích là máy chủ CentOS 7.9 (4 vCPU, 4 GB RAM) qua Docker Compose như mô tả tại mục 3.9.</w:t>
+        <w:t xml:space="preserve">(hơn 1.650 bài viết và 1.650 bố cục, 3,9 GB phương tiện) — nghĩa là các phép kiểm thử chạy trên khối lượng dữ liệu tương đương vận hành thật, không phải dữ liệu mẫu. Môi trường triển khai đích là máy chủ CentOS 7.9 (4 vCPU, 4 GB RAM) qua Docker Compose như mô tả tại mục 3.9.</w:t>
+      </w:r>
+    </w:p>
+    <w:p>
+      <w:pPr>
+        <w:pStyle w:val="BodyText"/>
+      </w:pPr>
+      <w:r>
+        <w:t xml:space="preserve">Các phép đo hiệu năng dùng Lighthouse 13.4.0 (Chromium headless) với cấu hình mặc định: giả lập thiết bị di động, tiết lưu mô phỏng mạng Slow 4G và CPU chậm 4 lần, thực hiện ngày 12/07/2026. Website mới được đo trên</w:t>
+      </w:r>
+      <w:r>
+        <w:t xml:space="preserve"> </w:t>
+      </w:r>
+      <w:r>
+        <w:rPr>
+          <w:b/>
+          <w:bCs/>
+        </w:rPr>
+        <w:t xml:space="preserve">bản build production</w:t>
+      </w:r>
+      <w:r>
+        <w:t xml:space="preserve"> </w:t>
+      </w:r>
+      <w:r>
+        <w:t xml:space="preserve">phục vụ tại máy đo, kết nối máy chủ API và toàn bộ dữ liệu di trú thật; website cũ được đo qua Internet tại cùng thời điểm, cùng phiên bản công cụ. Cách bố trí này giữ cho hai phép đo cùng điều kiện tiết lưu; điểm bất đối xứng duy nhất là thời gian phản hồi máy chủ (TTFB) của bản mới không chứa độ trễ mạng thật — hạn chế này được ghi chú tại các bảng liên quan và sẽ được loại bỏ khi đo lại trên bản triển khai có tên miền.</w:t>
       </w:r>
     </w:p>
     <w:bookmarkEnd w:id="86"/>
@@ -7096,7 +7234,7 @@
         <w:pStyle w:val="FirstParagraph"/>
       </w:pPr>
       <w:r>
-        <w:t xml:space="preserve">Các phép đo hiệu năng và SEO nhắm vào bốn trang đại diện cho bốn dạng kết xuất: trang chủ (</w:t>
+        <w:t xml:space="preserve">Các phép đo hiệu năng và SEO nhắm vào bốn trang đại diện cho bốn dạng kết xuất của trang công khai: trang chủ (</w:t>
       </w:r>
       <w:r>
         <w:rPr>
@@ -7105,7 +7243,16 @@
         <w:t xml:space="preserve">/vi</w:t>
       </w:r>
       <w:r>
-        <w:t xml:space="preserve">), một trang bài viết di trú (nội dung HTML legacy), một trang danh mục tin tức (danh sách động), và một trang bộ môn (</w:t>
+        <w:t xml:space="preserve">, bố cục Visual Builder đầy đủ), một bài viết di trú với nội dung HTML và ảnh gốc từ hệ thống cũ (</w:t>
+      </w:r>
+      <w:r>
+        <w:rPr>
+          <w:rStyle w:val="VerbatimChar"/>
+        </w:rPr>
+        <w:t xml:space="preserve">/vi/tin-tuc/usactalk-06-…</w:t>
+      </w:r>
+      <w:r>
+        <w:t xml:space="preserve">), trang riêng bộ môn (</w:t>
       </w:r>
       <w:r>
         <w:rPr>
@@ -7114,7 +7261,25 @@
         <w:t xml:space="preserve">/vi/vat-ly-ung-dung</w:t>
       </w:r>
       <w:r>
-        <w:t xml:space="preserve">).</w:t>
+        <w:t xml:space="preserve">), và một trang nội dung tĩnh tái tạo từ hệ thống cũ (</w:t>
+      </w:r>
+      <w:r>
+        <w:rPr>
+          <w:rStyle w:val="VerbatimChar"/>
+        </w:rPr>
+        <w:t xml:space="preserve">/vi/gioi-thieu</w:t>
+      </w:r>
+      <w:r>
+        <w:t xml:space="preserve">). Trang chủ website cũ (</w:t>
+      </w:r>
+      <w:r>
+        <w:rPr>
+          <w:rStyle w:val="VerbatimChar"/>
+        </w:rPr>
+        <w:t xml:space="preserve">https://phys.hcmus.edu.vn/</w:t>
+      </w:r>
+      <w:r>
+        <w:t xml:space="preserve">) được đo làm mốc so sánh (mục 4.7.1).</w:t>
       </w:r>
     </w:p>
     <w:bookmarkEnd w:id="87"/>
@@ -9157,7 +9322,7 @@
         <w:pStyle w:val="FirstParagraph"/>
       </w:pPr>
       <w:r>
-        <w:t xml:space="preserve">Bộ ba chỉ số LCP, INP, CLS (ngưỡng tốt lần lượt ≤ 2,5 s; ≤ 200 ms; ≤ 0,1 — mục 2.2.1) cần được đo trên bản triển khai chạy ổn định. Dữ liệu trường (CrUX) đòi hỏi tên miền công khai có lưu lượng thật nên chưa khả dụng ở thời điểm viết. Dữ liệu phòng thí nghiệm — gồm LCP, INP (xấp xỉ bằng TBT trong môi trường mô phỏng), CLS và các chỉ số hỗ trợ FCP, TTFB, Speed Index trên bốn trang đại diện — sẽ được đo bằng Lighthouse trên bản triển khai Docker với mạng di động mô phỏng: 【CHƯA ĐO: bảng CWV bốn trang đại diện — chạy Lighthouse (mobile, Slow 4G) khi bản triển khai truy cập được ổn định】.</w:t>
+        <w:t xml:space="preserve">Bộ ba chỉ số LCP, INP, CLS (ngưỡng tốt lần lượt ≤ 2,5 s; ≤ 200 ms; ≤ 0,1 — mục 2.2.1) được đo ở chế độ phòng thí nghiệm theo cấu hình mô tả tại mục 4.1.2; trong môi trường mô phỏng không có thao tác người dùng thật, INP được thay bằng chỉ số gần đúng TBT (Total Blocking Time, ngưỡng tốt ≤ 200 ms). Kết quả trên bốn trang đại diện trình bày trong Bảng 4.6.</w:t>
       </w:r>
     </w:p>
     <w:p>
@@ -9165,7 +9330,474 @@
         <w:pStyle w:val="BodyText"/>
       </w:pPr>
       <w:r>
-        <w:t xml:space="preserve">Về mặt thiết kế, các biện pháp tại mục 3.8 nhắm trực tiếp vào từng chỉ số: ISR phục vụ HTML tĩnh và đệm ba tầng rút ngắn TTFB — thành phần chi phối LCP; ưu tiên nạp ảnh hero nhắm vào LCP; giữ chỗ kích thước ảnh qua</w:t>
+        <w:rPr>
+          <w:i/>
+          <w:iCs/>
+        </w:rPr>
+        <w:t xml:space="preserve">Bảng 4.6. Chỉ số Web cốt lõi (lab) của bốn trang đại diện — Lighthouse 13.4.0, mobile, mạng Slow 4G mô phỏng, bản build production tại máy đo, 12/07/2026</w:t>
+      </w:r>
+    </w:p>
+    <w:tbl>
+      <w:tblPr>
+        <w:tblStyle w:val="Table"/>
+        <w:tblW w:type="auto" w:w="0"/>
+        <w:tblLook w:firstRow="1" w:lastRow="0" w:firstColumn="0" w:lastColumn="0" w:noHBand="0" w:noVBand="0" w:val="0020"/>
+      </w:tblPr>
+      <w:tblGrid>
+        <w:gridCol w:w="1320"/>
+        <w:gridCol w:w="1320"/>
+        <w:gridCol w:w="1320"/>
+        <w:gridCol w:w="1320"/>
+        <w:gridCol w:w="1320"/>
+        <w:gridCol w:w="1320"/>
+      </w:tblGrid>
+      <w:tr>
+        <w:trPr>
+          <w:tblHeader w:val="on"/>
+        </w:trPr>
+        <w:tc>
+          <w:tcPr/>
+          <w:p>
+            <w:pPr>
+              <w:pStyle w:val="Compact"/>
+            </w:pPr>
+            <w:r>
+              <w:t xml:space="preserve">Trang</w:t>
+            </w:r>
+          </w:p>
+        </w:tc>
+        <w:tc>
+          <w:tcPr/>
+          <w:p>
+            <w:pPr>
+              <w:pStyle w:val="Compact"/>
+            </w:pPr>
+            <w:r>
+              <w:t xml:space="preserve">LCP (s)</w:t>
+            </w:r>
+          </w:p>
+        </w:tc>
+        <w:tc>
+          <w:tcPr/>
+          <w:p>
+            <w:pPr>
+              <w:pStyle w:val="Compact"/>
+            </w:pPr>
+            <w:r>
+              <w:t xml:space="preserve">TBT (ms)</w:t>
+            </w:r>
+          </w:p>
+        </w:tc>
+        <w:tc>
+          <w:tcPr/>
+          <w:p>
+            <w:pPr>
+              <w:pStyle w:val="Compact"/>
+            </w:pPr>
+            <w:r>
+              <w:t xml:space="preserve">CLS</w:t>
+            </w:r>
+          </w:p>
+        </w:tc>
+        <w:tc>
+          <w:tcPr/>
+          <w:p>
+            <w:pPr>
+              <w:pStyle w:val="Compact"/>
+            </w:pPr>
+            <w:r>
+              <w:t xml:space="preserve">FCP (s)</w:t>
+            </w:r>
+          </w:p>
+        </w:tc>
+        <w:tc>
+          <w:tcPr/>
+          <w:p>
+            <w:pPr>
+              <w:pStyle w:val="Compact"/>
+            </w:pPr>
+            <w:r>
+              <w:t xml:space="preserve">Speed Index (s)</w:t>
+            </w:r>
+          </w:p>
+        </w:tc>
+      </w:tr>
+      <w:tr>
+        <w:tc>
+          <w:tcPr/>
+          <w:p>
+            <w:pPr>
+              <w:pStyle w:val="Compact"/>
+            </w:pPr>
+            <w:r>
+              <w:t xml:space="preserve">Trang chủ</w:t>
+            </w:r>
+            <w:r>
+              <w:t xml:space="preserve"> </w:t>
+            </w:r>
+            <w:r>
+              <w:rPr>
+                <w:rStyle w:val="VerbatimChar"/>
+              </w:rPr>
+              <w:t xml:space="preserve">/vi</w:t>
+            </w:r>
+          </w:p>
+        </w:tc>
+        <w:tc>
+          <w:tcPr/>
+          <w:p>
+            <w:pPr>
+              <w:pStyle w:val="Compact"/>
+            </w:pPr>
+            <w:r>
+              <w:t xml:space="preserve">5,51</w:t>
+            </w:r>
+          </w:p>
+        </w:tc>
+        <w:tc>
+          <w:tcPr/>
+          <w:p>
+            <w:pPr>
+              <w:pStyle w:val="Compact"/>
+            </w:pPr>
+            <w:r>
+              <w:t xml:space="preserve">268</w:t>
+            </w:r>
+          </w:p>
+        </w:tc>
+        <w:tc>
+          <w:tcPr/>
+          <w:p>
+            <w:pPr>
+              <w:pStyle w:val="Compact"/>
+            </w:pPr>
+            <w:r>
+              <w:t xml:space="preserve">0,000</w:t>
+            </w:r>
+          </w:p>
+        </w:tc>
+        <w:tc>
+          <w:tcPr/>
+          <w:p>
+            <w:pPr>
+              <w:pStyle w:val="Compact"/>
+            </w:pPr>
+            <w:r>
+              <w:t xml:space="preserve">1,25</w:t>
+            </w:r>
+          </w:p>
+        </w:tc>
+        <w:tc>
+          <w:tcPr/>
+          <w:p>
+            <w:pPr>
+              <w:pStyle w:val="Compact"/>
+            </w:pPr>
+            <w:r>
+              <w:t xml:space="preserve">2,29</w:t>
+            </w:r>
+          </w:p>
+        </w:tc>
+      </w:tr>
+      <w:tr>
+        <w:tc>
+          <w:tcPr/>
+          <w:p>
+            <w:pPr>
+              <w:pStyle w:val="Compact"/>
+            </w:pPr>
+            <w:r>
+              <w:t xml:space="preserve">Bài viết di trú</w:t>
+            </w:r>
+          </w:p>
+        </w:tc>
+        <w:tc>
+          <w:tcPr/>
+          <w:p>
+            <w:pPr>
+              <w:pStyle w:val="Compact"/>
+            </w:pPr>
+            <w:r>
+              <w:t xml:space="preserve">2,58</w:t>
+            </w:r>
+          </w:p>
+        </w:tc>
+        <w:tc>
+          <w:tcPr/>
+          <w:p>
+            <w:pPr>
+              <w:pStyle w:val="Compact"/>
+            </w:pPr>
+            <w:r>
+              <w:t xml:space="preserve">1.963</w:t>
+            </w:r>
+          </w:p>
+        </w:tc>
+        <w:tc>
+          <w:tcPr/>
+          <w:p>
+            <w:pPr>
+              <w:pStyle w:val="Compact"/>
+            </w:pPr>
+            <w:r>
+              <w:t xml:space="preserve">0,179</w:t>
+            </w:r>
+          </w:p>
+        </w:tc>
+        <w:tc>
+          <w:tcPr/>
+          <w:p>
+            <w:pPr>
+              <w:pStyle w:val="Compact"/>
+            </w:pPr>
+            <w:r>
+              <w:t xml:space="preserve">1,22</w:t>
+            </w:r>
+          </w:p>
+        </w:tc>
+        <w:tc>
+          <w:tcPr/>
+          <w:p>
+            <w:pPr>
+              <w:pStyle w:val="Compact"/>
+            </w:pPr>
+            <w:r>
+              <w:t xml:space="preserve">2,87</w:t>
+            </w:r>
+          </w:p>
+        </w:tc>
+      </w:tr>
+      <w:tr>
+        <w:tc>
+          <w:tcPr/>
+          <w:p>
+            <w:pPr>
+              <w:pStyle w:val="Compact"/>
+            </w:pPr>
+            <w:r>
+              <w:t xml:space="preserve">Trang bộ môn</w:t>
+            </w:r>
+          </w:p>
+        </w:tc>
+        <w:tc>
+          <w:tcPr/>
+          <w:p>
+            <w:pPr>
+              <w:pStyle w:val="Compact"/>
+            </w:pPr>
+            <w:r>
+              <w:t xml:space="preserve">4,15</w:t>
+            </w:r>
+          </w:p>
+        </w:tc>
+        <w:tc>
+          <w:tcPr/>
+          <w:p>
+            <w:pPr>
+              <w:pStyle w:val="Compact"/>
+            </w:pPr>
+            <w:r>
+              <w:t xml:space="preserve">104</w:t>
+            </w:r>
+          </w:p>
+        </w:tc>
+        <w:tc>
+          <w:tcPr/>
+          <w:p>
+            <w:pPr>
+              <w:pStyle w:val="Compact"/>
+            </w:pPr>
+            <w:r>
+              <w:t xml:space="preserve">0,000</w:t>
+            </w:r>
+          </w:p>
+        </w:tc>
+        <w:tc>
+          <w:tcPr/>
+          <w:p>
+            <w:pPr>
+              <w:pStyle w:val="Compact"/>
+            </w:pPr>
+            <w:r>
+              <w:t xml:space="preserve">1,37</w:t>
+            </w:r>
+          </w:p>
+        </w:tc>
+        <w:tc>
+          <w:tcPr/>
+          <w:p>
+            <w:pPr>
+              <w:pStyle w:val="Compact"/>
+            </w:pPr>
+            <w:r>
+              <w:t xml:space="preserve">1,65</w:t>
+            </w:r>
+          </w:p>
+        </w:tc>
+      </w:tr>
+      <w:tr>
+        <w:tc>
+          <w:tcPr/>
+          <w:p>
+            <w:pPr>
+              <w:pStyle w:val="Compact"/>
+            </w:pPr>
+            <w:r>
+              <w:t xml:space="preserve">Trang giới thiệu</w:t>
+            </w:r>
+          </w:p>
+        </w:tc>
+        <w:tc>
+          <w:tcPr/>
+          <w:p>
+            <w:pPr>
+              <w:pStyle w:val="Compact"/>
+            </w:pPr>
+            <w:r>
+              <w:t xml:space="preserve">6,16</w:t>
+            </w:r>
+          </w:p>
+        </w:tc>
+        <w:tc>
+          <w:tcPr/>
+          <w:p>
+            <w:pPr>
+              <w:pStyle w:val="Compact"/>
+            </w:pPr>
+            <w:r>
+              <w:t xml:space="preserve">186</w:t>
+            </w:r>
+          </w:p>
+        </w:tc>
+        <w:tc>
+          <w:tcPr/>
+          <w:p>
+            <w:pPr>
+              <w:pStyle w:val="Compact"/>
+            </w:pPr>
+            <w:r>
+              <w:t xml:space="preserve">0,000</w:t>
+            </w:r>
+          </w:p>
+        </w:tc>
+        <w:tc>
+          <w:tcPr/>
+          <w:p>
+            <w:pPr>
+              <w:pStyle w:val="Compact"/>
+            </w:pPr>
+            <w:r>
+              <w:t xml:space="preserve">1,07</w:t>
+            </w:r>
+          </w:p>
+        </w:tc>
+        <w:tc>
+          <w:tcPr/>
+          <w:p>
+            <w:pPr>
+              <w:pStyle w:val="Compact"/>
+            </w:pPr>
+            <w:r>
+              <w:t xml:space="preserve">1,07</w:t>
+            </w:r>
+          </w:p>
+        </w:tc>
+      </w:tr>
+      <w:tr>
+        <w:tc>
+          <w:tcPr/>
+          <w:p>
+            <w:pPr>
+              <w:pStyle w:val="Compact"/>
+            </w:pPr>
+            <w:r>
+              <w:rPr>
+                <w:i/>
+                <w:iCs/>
+              </w:rPr>
+              <w:t xml:space="preserve">Ngưỡng tốt</w:t>
+            </w:r>
+          </w:p>
+        </w:tc>
+        <w:tc>
+          <w:tcPr/>
+          <w:p>
+            <w:pPr>
+              <w:pStyle w:val="Compact"/>
+            </w:pPr>
+            <w:r>
+              <w:rPr>
+                <w:i/>
+                <w:iCs/>
+              </w:rPr>
+              <w:t xml:space="preserve">≤ 2,5</w:t>
+            </w:r>
+          </w:p>
+        </w:tc>
+        <w:tc>
+          <w:tcPr/>
+          <w:p>
+            <w:pPr>
+              <w:pStyle w:val="Compact"/>
+            </w:pPr>
+            <w:r>
+              <w:rPr>
+                <w:i/>
+                <w:iCs/>
+              </w:rPr>
+              <w:t xml:space="preserve">≤ 200</w:t>
+            </w:r>
+          </w:p>
+        </w:tc>
+        <w:tc>
+          <w:tcPr/>
+          <w:p>
+            <w:pPr>
+              <w:pStyle w:val="Compact"/>
+            </w:pPr>
+            <w:r>
+              <w:rPr>
+                <w:i/>
+                <w:iCs/>
+              </w:rPr>
+              <w:t xml:space="preserve">≤ 0,1</w:t>
+            </w:r>
+          </w:p>
+        </w:tc>
+        <w:tc>
+          <w:tcPr/>
+          <w:p>
+            <w:pPr>
+              <w:pStyle w:val="Compact"/>
+            </w:pPr>
+            <w:r>
+              <w:rPr>
+                <w:i/>
+                <w:iCs/>
+              </w:rPr>
+              <w:t xml:space="preserve">≤ 1,8</w:t>
+            </w:r>
+          </w:p>
+        </w:tc>
+        <w:tc>
+          <w:tcPr/>
+          <w:p>
+            <w:pPr>
+              <w:pStyle w:val="Compact"/>
+            </w:pPr>
+            <w:r>
+              <w:t xml:space="preserve">—</w:t>
+            </w:r>
+          </w:p>
+        </w:tc>
+      </w:tr>
+    </w:tbl>
+    <w:p>
+      <w:pPr>
+        <w:pStyle w:val="BodyText"/>
+      </w:pPr>
+      <w:r>
+        <w:t xml:space="preserve">Kết quả cho thấy các biện pháp thiết kế tại mục 3.8 phát huy tác dụng rõ ở hai nhóm chỉ số. Độ ổn định bố cục gần như tuyệt đối trên các trang do hệ thống kiểm soát toàn bộ (CLS = 0,000, so với 0,243 của trang chủ website cũ) — kết quả trực tiếp của việc giữ chỗ kích thước ảnh qua</w:t>
       </w:r>
       <w:r>
         <w:t xml:space="preserve"> </w:t>
@@ -9177,10 +9809,38 @@
         <w:t xml:space="preserve">next/image</w:t>
       </w:r>
       <w:r>
-        <w:t xml:space="preserve"> </w:t>
-      </w:r>
-      <w:r>
-        <w:t xml:space="preserve">nhắm vào CLS. Số đo thực tế sẽ kiểm chứng hiệu quả của các biện pháp này.</w:t>
+        <w:t xml:space="preserve">. Thời gian hiển thị nội dung đầu tiên đều dưới 1,4 giây và Speed Index từ 1,1 đến 2,9 giây, phản ánh hiệu quả của kết xuất HTML sẵn phía máy chủ.</w:t>
+      </w:r>
+    </w:p>
+    <w:p>
+      <w:pPr>
+        <w:pStyle w:val="BodyText"/>
+      </w:pPr>
+      <w:r>
+        <w:t xml:space="preserve">Ở chiều ngược lại, số liệu cũng chỉ ra hai điểm cần cải thiện mà chúng tôi ghi nhận trung thực. Thứ nhất, LCP của ba trang bố cục (4,2–6,2 giây) chưa đạt ngưỡng tốt: phần tử LCP là ảnh nền hero khổ lớn, hiện chưa được nén đủ mạnh cho điều kiện Slow 4G — hướng xử lý là chuyển ảnh hero sang định dạng AVIF/WebP kích thước theo khung nhìn. Thứ hai, trang bài viết di trú tuy có LCP tốt nhất (2,58 giây) nhưng TBT lên tới 1.963 ms và CLS 0,179: thân bài HTML giữ nguyên từ hệ thống cũ chứa ảnh gốc độ phân giải đầy đủ không khai báo kích thước, nằm ngoài đường tối ưu</w:t>
+      </w:r>
+      <w:r>
+        <w:t xml:space="preserve"> </w:t>
+      </w:r>
+      <w:r>
+        <w:rPr>
+          <w:rStyle w:val="VerbatimChar"/>
+        </w:rPr>
+        <w:t xml:space="preserve">next/image</w:t>
+      </w:r>
+      <w:r>
+        <w:t xml:space="preserve"> </w:t>
+      </w:r>
+      <w:r>
+        <w:t xml:space="preserve">(hạn chế đã nêu tại mục 3.7.3). Đây là cái giá của quyết định giữ nguyên vẹn nội dung di trú; biện pháp khắc phục (nén lại kho ảnh legacy, bổ sung thuộc tính kích thước khi làm sạch HTML) được đưa vào kiến nghị.</w:t>
+      </w:r>
+    </w:p>
+    <w:p>
+      <w:pPr>
+        <w:pStyle w:val="BodyText"/>
+      </w:pPr>
+      <w:r>
+        <w:t xml:space="preserve">Dữ liệu trường: 【CHƯA ĐO: CrUX yêu cầu tên miền công khai có lưu lượng thật — thiết lập theo dõi qua Search Console sau khi gắn tên miền】.</w:t>
       </w:r>
     </w:p>
     <w:bookmarkEnd w:id="95"/>
@@ -9198,7 +9858,346 @@
         <w:pStyle w:val="FirstParagraph"/>
       </w:pPr>
       <w:r>
-        <w:t xml:space="preserve">Bốn điểm tổng hợp Lighthouse (Performance, Accessibility, Best Practices, SEO; thang 0–100) [14] trên bốn trang đại diện: 【CHƯA ĐO: bảng 4 trang × 4 điểm — chạy Lighthouse (Chrome DevTools hoặc PageSpeed Insights nếu có tên miền) trên bản triển khai】. Khi đo, chú thích bảng sẽ ghi rõ phiên bản Chrome/Lighthouse, chế độ thiết bị (mobile), ngày đo và môi trường mạng mô phỏng.</w:t>
+        <w:t xml:space="preserve">Bốn điểm tổng hợp Lighthouse (Performance, Accessibility, Best Practices, SEO; thang 0–100) [14] của bốn trang đại diện được trình bày trong Bảng 4.7.</w:t>
+      </w:r>
+    </w:p>
+    <w:p>
+      <w:pPr>
+        <w:pStyle w:val="BodyText"/>
+      </w:pPr>
+      <w:r>
+        <w:rPr>
+          <w:i/>
+          <w:iCs/>
+        </w:rPr>
+        <w:t xml:space="preserve">Bảng 4.7. Điểm Lighthouse của bốn trang đại diện — Lighthouse 13.4.0, mobile, mạng Slow 4G mô phỏng, bản build production tại máy đo, 12/07/2026</w:t>
+      </w:r>
+    </w:p>
+    <w:tbl>
+      <w:tblPr>
+        <w:tblStyle w:val="Table"/>
+        <w:tblW w:type="auto" w:w="0"/>
+        <w:tblLook w:firstRow="1" w:lastRow="0" w:firstColumn="0" w:lastColumn="0" w:noHBand="0" w:noVBand="0" w:val="0020"/>
+      </w:tblPr>
+      <w:tblGrid>
+        <w:gridCol w:w="1584"/>
+        <w:gridCol w:w="1584"/>
+        <w:gridCol w:w="1584"/>
+        <w:gridCol w:w="1584"/>
+        <w:gridCol w:w="1584"/>
+      </w:tblGrid>
+      <w:tr>
+        <w:trPr>
+          <w:tblHeader w:val="on"/>
+        </w:trPr>
+        <w:tc>
+          <w:tcPr/>
+          <w:p>
+            <w:pPr>
+              <w:pStyle w:val="Compact"/>
+            </w:pPr>
+            <w:r>
+              <w:t xml:space="preserve">Trang</w:t>
+            </w:r>
+          </w:p>
+        </w:tc>
+        <w:tc>
+          <w:tcPr/>
+          <w:p>
+            <w:pPr>
+              <w:pStyle w:val="Compact"/>
+            </w:pPr>
+            <w:r>
+              <w:t xml:space="preserve">Performance</w:t>
+            </w:r>
+          </w:p>
+        </w:tc>
+        <w:tc>
+          <w:tcPr/>
+          <w:p>
+            <w:pPr>
+              <w:pStyle w:val="Compact"/>
+            </w:pPr>
+            <w:r>
+              <w:t xml:space="preserve">Accessibility</w:t>
+            </w:r>
+          </w:p>
+        </w:tc>
+        <w:tc>
+          <w:tcPr/>
+          <w:p>
+            <w:pPr>
+              <w:pStyle w:val="Compact"/>
+            </w:pPr>
+            <w:r>
+              <w:t xml:space="preserve">Best Practices</w:t>
+            </w:r>
+          </w:p>
+        </w:tc>
+        <w:tc>
+          <w:tcPr/>
+          <w:p>
+            <w:pPr>
+              <w:pStyle w:val="Compact"/>
+            </w:pPr>
+            <w:r>
+              <w:t xml:space="preserve">SEO</w:t>
+            </w:r>
+          </w:p>
+        </w:tc>
+      </w:tr>
+      <w:tr>
+        <w:tc>
+          <w:tcPr/>
+          <w:p>
+            <w:pPr>
+              <w:pStyle w:val="Compact"/>
+            </w:pPr>
+            <w:r>
+              <w:t xml:space="preserve">Trang chủ</w:t>
+            </w:r>
+            <w:r>
+              <w:t xml:space="preserve"> </w:t>
+            </w:r>
+            <w:r>
+              <w:rPr>
+                <w:rStyle w:val="VerbatimChar"/>
+              </w:rPr>
+              <w:t xml:space="preserve">/vi</w:t>
+            </w:r>
+          </w:p>
+        </w:tc>
+        <w:tc>
+          <w:tcPr/>
+          <w:p>
+            <w:pPr>
+              <w:pStyle w:val="Compact"/>
+            </w:pPr>
+            <w:r>
+              <w:t xml:space="preserve">74</w:t>
+            </w:r>
+          </w:p>
+        </w:tc>
+        <w:tc>
+          <w:tcPr/>
+          <w:p>
+            <w:pPr>
+              <w:pStyle w:val="Compact"/>
+            </w:pPr>
+            <w:r>
+              <w:t xml:space="preserve">80</w:t>
+            </w:r>
+          </w:p>
+        </w:tc>
+        <w:tc>
+          <w:tcPr/>
+          <w:p>
+            <w:pPr>
+              <w:pStyle w:val="Compact"/>
+            </w:pPr>
+            <w:r>
+              <w:t xml:space="preserve">96</w:t>
+            </w:r>
+          </w:p>
+        </w:tc>
+        <w:tc>
+          <w:tcPr/>
+          <w:p>
+            <w:pPr>
+              <w:pStyle w:val="Compact"/>
+            </w:pPr>
+            <w:r>
+              <w:t xml:space="preserve">92</w:t>
+            </w:r>
+          </w:p>
+        </w:tc>
+      </w:tr>
+      <w:tr>
+        <w:tc>
+          <w:tcPr/>
+          <w:p>
+            <w:pPr>
+              <w:pStyle w:val="Compact"/>
+            </w:pPr>
+            <w:r>
+              <w:t xml:space="preserve">Bài viết di trú</w:t>
+            </w:r>
+          </w:p>
+        </w:tc>
+        <w:tc>
+          <w:tcPr/>
+          <w:p>
+            <w:pPr>
+              <w:pStyle w:val="Compact"/>
+            </w:pPr>
+            <w:r>
+              <w:t xml:space="preserve">61</w:t>
+            </w:r>
+          </w:p>
+        </w:tc>
+        <w:tc>
+          <w:tcPr/>
+          <w:p>
+            <w:pPr>
+              <w:pStyle w:val="Compact"/>
+            </w:pPr>
+            <w:r>
+              <w:t xml:space="preserve">88</w:t>
+            </w:r>
+          </w:p>
+        </w:tc>
+        <w:tc>
+          <w:tcPr/>
+          <w:p>
+            <w:pPr>
+              <w:pStyle w:val="Compact"/>
+            </w:pPr>
+            <w:r>
+              <w:t xml:space="preserve">96</w:t>
+            </w:r>
+          </w:p>
+        </w:tc>
+        <w:tc>
+          <w:tcPr/>
+          <w:p>
+            <w:pPr>
+              <w:pStyle w:val="Compact"/>
+            </w:pPr>
+            <w:r>
+              <w:t xml:space="preserve">100</w:t>
+            </w:r>
+          </w:p>
+        </w:tc>
+      </w:tr>
+      <w:tr>
+        <w:tc>
+          <w:tcPr/>
+          <w:p>
+            <w:pPr>
+              <w:pStyle w:val="Compact"/>
+            </w:pPr>
+            <w:r>
+              <w:t xml:space="preserve">Trang bộ môn</w:t>
+            </w:r>
+          </w:p>
+        </w:tc>
+        <w:tc>
+          <w:tcPr/>
+          <w:p>
+            <w:pPr>
+              <w:pStyle w:val="Compact"/>
+            </w:pPr>
+            <w:r>
+              <w:t xml:space="preserve">85</w:t>
+            </w:r>
+          </w:p>
+        </w:tc>
+        <w:tc>
+          <w:tcPr/>
+          <w:p>
+            <w:pPr>
+              <w:pStyle w:val="Compact"/>
+            </w:pPr>
+            <w:r>
+              <w:t xml:space="preserve">80</w:t>
+            </w:r>
+          </w:p>
+        </w:tc>
+        <w:tc>
+          <w:tcPr/>
+          <w:p>
+            <w:pPr>
+              <w:pStyle w:val="Compact"/>
+            </w:pPr>
+            <w:r>
+              <w:t xml:space="preserve">96</w:t>
+            </w:r>
+          </w:p>
+        </w:tc>
+        <w:tc>
+          <w:tcPr/>
+          <w:p>
+            <w:pPr>
+              <w:pStyle w:val="Compact"/>
+            </w:pPr>
+            <w:r>
+              <w:t xml:space="preserve">100</w:t>
+            </w:r>
+          </w:p>
+        </w:tc>
+      </w:tr>
+      <w:tr>
+        <w:tc>
+          <w:tcPr/>
+          <w:p>
+            <w:pPr>
+              <w:pStyle w:val="Compact"/>
+            </w:pPr>
+            <w:r>
+              <w:t xml:space="preserve">Trang giới thiệu</w:t>
+            </w:r>
+          </w:p>
+        </w:tc>
+        <w:tc>
+          <w:tcPr/>
+          <w:p>
+            <w:pPr>
+              <w:pStyle w:val="Compact"/>
+            </w:pPr>
+            <w:r>
+              <w:t xml:space="preserve">75</w:t>
+            </w:r>
+          </w:p>
+        </w:tc>
+        <w:tc>
+          <w:tcPr/>
+          <w:p>
+            <w:pPr>
+              <w:pStyle w:val="Compact"/>
+            </w:pPr>
+            <w:r>
+              <w:t xml:space="preserve">91</w:t>
+            </w:r>
+          </w:p>
+        </w:tc>
+        <w:tc>
+          <w:tcPr/>
+          <w:p>
+            <w:pPr>
+              <w:pStyle w:val="Compact"/>
+            </w:pPr>
+            <w:r>
+              <w:t xml:space="preserve">88</w:t>
+            </w:r>
+          </w:p>
+        </w:tc>
+        <w:tc>
+          <w:tcPr/>
+          <w:p>
+            <w:pPr>
+              <w:pStyle w:val="Compact"/>
+            </w:pPr>
+            <w:r>
+              <w:t xml:space="preserve">100</w:t>
+            </w:r>
+          </w:p>
+        </w:tc>
+      </w:tr>
+    </w:tbl>
+    <w:p>
+      <w:pPr>
+        <w:pStyle w:val="BodyText"/>
+      </w:pPr>
+      <w:r>
+        <w:t xml:space="preserve">Điểm SEO đạt 92–100 trên cả bốn trang, phản ánh các hạng mục kỹ thuật đã hiện thực ở mục 3.8 (HTML đầy đủ, metadata, canonical, robots hợp lệ); điểm Tuân thủ thông lệ tốt ổn định ở mức 88–96. Điểm Performance dao động 61–85 theo đặc điểm từng dạng trang, với hai nguyên nhân kéo điểm đã phân tích tại mục 4.3 (ảnh hero khổ lớn và kho ảnh legacy chưa tối ưu của bài viết di trú).</w:t>
+      </w:r>
+    </w:p>
+    <w:p>
+      <w:pPr>
+        <w:pStyle w:val="BodyText"/>
+      </w:pPr>
+      <w:r>
+        <w:t xml:space="preserve">Điểm Accessibility ở mức 80–91 là hạng mục chúng tôi đánh giá là cần cải thiện nhất: các cảnh báo tập trung vào độ tương phản màu chữ trên nền và nhãn ARIA của một số nút điều khiển trong các khối giao diện dựng sẵn. Đáng lưu ý, điểm Accessibility trang chủ mới (80) thấp hơn trang chủ website cũ (88, mục 4.7.1) — một kết quả ngược kỳ vọng mà chúng tôi báo cáo trung thực: giao diện cũ đơn giản về cấu trúc nên ít vi phạm hơn, trong khi giao diện mới nhiều thành phần tương tác hơn thì mỗi thành phần là một điểm có thể vi phạm. Việc rà lại độ tương phản của hệ màu và bổ sung nhãn ARIA được đưa vào danh mục việc cần làm trước khi vận hành chính thức.</w:t>
       </w:r>
     </w:p>
     <w:bookmarkEnd w:id="96"/>
@@ -9374,14 +10373,98 @@
         <w:pStyle w:val="FirstParagraph"/>
       </w:pPr>
       <w:r>
-        <w:t xml:space="preserve">Rà soát trên môi trường phát triển xác nhận các hạng mục thiết kế tại mục 3.8 hoạt động: mỗi trang trả về HTML đầy đủ nội dung ngay trong phản hồi đầu tiên (xem 4.6.3); thẻ tiêu đề, mô tả, canonical và cặp</w:t>
-      </w:r>
-      <w:r>
-        <w:t xml:space="preserve"> </w:t>
-      </w:r>
-      <w:r>
-        <w:rPr>
-          <w:rStyle w:val="VerbatimChar"/>
+        <w:t xml:space="preserve">Kiểm tra trực tiếp mã HTML trả về (12/07/2026) xác nhận phần lớn hạng mục thiết kế tại mục 3.8 hoạt động đúng: mỗi trang có thẻ tiêu đề, mô tả và canonical riêng; trang chủ phát 6 khối dữ liệu có cấu trúc JSON-LD và trang bài viết phát 8 khối; bộ thẻ Open Graph đầy đủ (9 thẻ); 44/45 ảnh trên trang chủ được nạp trễ;</w:t>
+      </w:r>
+      <w:r>
+        <w:t xml:space="preserve"> </w:t>
+      </w:r>
+      <w:r>
+        <w:rPr>
+          <w:rStyle w:val="VerbatimChar"/>
+        </w:rPr>
+        <w:t xml:space="preserve">robots.txt</w:t>
+      </w:r>
+      <w:r>
+        <w:t xml:space="preserve"> </w:t>
+      </w:r>
+      <w:r>
+        <w:t xml:space="preserve">hợp lệ và</w:t>
+      </w:r>
+      <w:r>
+        <w:t xml:space="preserve"> </w:t>
+      </w:r>
+      <w:r>
+        <w:rPr>
+          <w:rStyle w:val="VerbatimChar"/>
+        </w:rPr>
+        <w:t xml:space="preserve">sitemap.xml</w:t>
+      </w:r>
+      <w:r>
+        <w:t xml:space="preserve"> </w:t>
+      </w:r>
+      <w:r>
+        <w:t xml:space="preserve">liệt kê các trang đã xuất bản kèm thời điểm cập nhật</w:t>
+      </w:r>
+      <w:r>
+        <w:t xml:space="preserve"> </w:t>
+      </w:r>
+      <w:r>
+        <w:rPr>
+          <w:rStyle w:val="VerbatimChar"/>
+        </w:rPr>
+        <w:t xml:space="preserve">lastmod</w:t>
+      </w:r>
+      <w:r>
+        <w:t xml:space="preserve"> </w:t>
+      </w:r>
+      <w:r>
+        <w:t xml:space="preserve">— trong khi địa chỉ</w:t>
+      </w:r>
+      <w:r>
+        <w:t xml:space="preserve"> </w:t>
+      </w:r>
+      <w:r>
+        <w:rPr>
+          <w:rStyle w:val="VerbatimChar"/>
+        </w:rPr>
+        <w:t xml:space="preserve">sitemap.xml</w:t>
+      </w:r>
+      <w:r>
+        <w:t xml:space="preserve"> </w:t>
+      </w:r>
+      <w:r>
+        <w:t xml:space="preserve">của website cũ trả về một trang HTML, tức không có sitemap thực. 397 URL cũ chuyển hướng 308 về địa chỉ mới (kiểm chứng tại Bảng 4.5); điểm SEO on-page định lượng đạt 92–100 (Bảng 4.7).</w:t>
+      </w:r>
+    </w:p>
+    <w:p>
+      <w:pPr>
+        <w:pStyle w:val="BodyText"/>
+      </w:pPr>
+      <w:r>
+        <w:t xml:space="preserve">Một hạng mục thiết kế chưa được hiện thực tại thời điểm đo và được báo cáo trung thực: các trang hiện</w:t>
+      </w:r>
+      <w:r>
+        <w:t xml:space="preserve"> </w:t>
+      </w:r>
+      <w:r>
+        <w:rPr>
+          <w:b/>
+          <w:bCs/>
+        </w:rPr>
+        <w:t xml:space="preserve">chưa phát cặp thẻ</w:t>
+      </w:r>
+      <w:r>
+        <w:rPr>
+          <w:b/>
+          <w:bCs/>
+        </w:rPr>
+        <w:t xml:space="preserve"> </w:t>
+      </w:r>
+      <w:r>
+        <w:rPr>
+          <w:rStyle w:val="VerbatimChar"/>
+          <w:b/>
+          <w:bCs/>
         </w:rPr>
         <w:t xml:space="preserve">hreflang</w:t>
       </w:r>
@@ -9389,37 +10472,22 @@
         <w:t xml:space="preserve"> </w:t>
       </w:r>
       <w:r>
-        <w:t xml:space="preserve">vi/en sinh đúng theo từng trang;</w:t>
-      </w:r>
-      <w:r>
-        <w:t xml:space="preserve"> </w:t>
-      </w:r>
-      <w:r>
-        <w:rPr>
-          <w:rStyle w:val="VerbatimChar"/>
-        </w:rPr>
-        <w:t xml:space="preserve">sitemap.xml</w:t>
-      </w:r>
-      <w:r>
-        <w:t xml:space="preserve"> </w:t>
-      </w:r>
-      <w:r>
-        <w:t xml:space="preserve">liệt kê các bố cục đã xuất bản kèm thời điểm cập nhật;</w:t>
-      </w:r>
-      <w:r>
-        <w:t xml:space="preserve"> </w:t>
-      </w:r>
-      <w:r>
-        <w:rPr>
-          <w:rStyle w:val="VerbatimChar"/>
-        </w:rPr>
-        <w:t xml:space="preserve">robots.txt</w:t>
-      </w:r>
-      <w:r>
-        <w:t xml:space="preserve"> </w:t>
-      </w:r>
-      <w:r>
-        <w:t xml:space="preserve">trỏ về sitemap; 397 URL cũ chuyển hướng 308 về địa chỉ mới (kiểm chứng tại Bảng 4.5). Điểm SEO on-page định lượng: 【CHƯA ĐO: điểm SEO Lighthouse — gộp vào phép đo mục 4.4】.</w:t>
+        <w:t xml:space="preserve">khai báo quan hệ giữa hai phiên bản ngôn ngữ vi/en — hai phiên bản mới chỉ phân tách bằng tiền tố URL. Thiếu sót này không ngăn việc lập chỉ mục nhưng có thể khiến công cụ tìm kiếm chọn sai phiên bản ngôn ngữ cho người dùng quốc tế; việc bổ sung thuộc tính</w:t>
+      </w:r>
+      <w:r>
+        <w:t xml:space="preserve"> </w:t>
+      </w:r>
+      <w:r>
+        <w:rPr>
+          <w:rStyle w:val="VerbatimChar"/>
+        </w:rPr>
+        <w:t xml:space="preserve">alternates.languages</w:t>
+      </w:r>
+      <w:r>
+        <w:t xml:space="preserve"> </w:t>
+      </w:r>
+      <w:r>
+        <w:t xml:space="preserve">trong metadata Next.js là thay đổi nhỏ, được xếp vào danh mục việc cần làm trước vận hành chính thức.</w:t>
       </w:r>
     </w:p>
     <w:bookmarkEnd w:id="101"/>
@@ -9531,11 +10599,19 @@
         <w:pStyle w:val="FirstParagraph"/>
       </w:pPr>
       <w:r>
+        <w:t xml:space="preserve">Việc so sánh được thực hiện trên hai bình diện: năng lực chức năng (Bảng 4.8) và chỉ số đo định lượng trên trang chủ của hai hệ thống (Bảng 4.9).</w:t>
+      </w:r>
+    </w:p>
+    <w:p>
+      <w:pPr>
+        <w:pStyle w:val="BodyText"/>
+      </w:pPr>
+      <w:r>
         <w:rPr>
           <w:i/>
           <w:iCs/>
         </w:rPr>
-        <w:t xml:space="preserve">Bảng 4.6. Đối chiếu năng lực hệ thống mới và website cũ</w:t>
+        <w:t xml:space="preserve">Bảng 4.8. Đối chiếu năng lực hệ thống mới và website cũ</w:t>
       </w:r>
     </w:p>
     <w:tbl>
@@ -9956,7 +11032,787 @@
         <w:pStyle w:val="BodyText"/>
       </w:pPr>
       <w:r>
-        <w:t xml:space="preserve">So sánh hiệu năng định lượng cũ – mới: 【CHƯA ĐO: cặp số Lighthouse của phys.hcmus.edu.vn và bản triển khai mới đo cùng thời điểm, cùng cấu hình — thực hiện khi bản mới có địa chỉ truy cập công khai】.</w:t>
+        <w:t xml:space="preserve">Hai trang chủ được đo cùng ngày, cùng phiên bản công cụ và cùng cấu hình tiết lưu (mục 4.1.2). Kết quả trình bày trong Bảng 4.9.</w:t>
+      </w:r>
+    </w:p>
+    <w:p>
+      <w:pPr>
+        <w:pStyle w:val="BodyText"/>
+      </w:pPr>
+      <w:r>
+        <w:rPr>
+          <w:i/>
+          <w:iCs/>
+        </w:rPr>
+        <w:t xml:space="preserve">Bảng 4.9. So sánh chỉ số trang chủ website cũ và mới — Lighthouse 13.4.0, mobile, mạng Slow 4G mô phỏng, 12/07/2026; website cũ đo qua Internet, website mới đo trên bản build production tại máy đo</w:t>
+      </w:r>
+    </w:p>
+    <w:tbl>
+      <w:tblPr>
+        <w:tblStyle w:val="Table"/>
+        <w:tblW w:type="pct" w:w="5000"/>
+        <w:tblLayout w:type="fixed"/>
+        <w:tblLook w:firstRow="1" w:lastRow="0" w:firstColumn="0" w:lastColumn="0" w:noHBand="0" w:noVBand="0" w:val="0020"/>
+      </w:tblPr>
+      <w:tblGrid>
+        <w:gridCol w:w="1980"/>
+        <w:gridCol w:w="1980"/>
+        <w:gridCol w:w="1980"/>
+        <w:gridCol w:w="1980"/>
+      </w:tblGrid>
+      <w:tr>
+        <w:trPr>
+          <w:tblHeader w:val="on"/>
+        </w:trPr>
+        <w:tc>
+          <w:tcPr/>
+          <w:p>
+            <w:pPr>
+              <w:pStyle w:val="Compact"/>
+            </w:pPr>
+            <w:r>
+              <w:t xml:space="preserve">Chỉ số</w:t>
+            </w:r>
+          </w:p>
+        </w:tc>
+        <w:tc>
+          <w:tcPr/>
+          <w:p>
+            <w:pPr>
+              <w:pStyle w:val="Compact"/>
+            </w:pPr>
+            <w:r>
+              <w:t xml:space="preserve">Website cũ (phys.hcmus.edu.vn)</w:t>
+            </w:r>
+          </w:p>
+        </w:tc>
+        <w:tc>
+          <w:tcPr/>
+          <w:p>
+            <w:pPr>
+              <w:pStyle w:val="Compact"/>
+            </w:pPr>
+            <w:r>
+              <w:t xml:space="preserve">Website mới (</w:t>
+            </w:r>
+            <w:r>
+              <w:rPr>
+                <w:rStyle w:val="VerbatimChar"/>
+              </w:rPr>
+              <w:t xml:space="preserve">/vi</w:t>
+            </w:r>
+            <w:r>
+              <w:t xml:space="preserve">)</w:t>
+            </w:r>
+          </w:p>
+        </w:tc>
+        <w:tc>
+          <w:tcPr/>
+          <w:p>
+            <w:pPr>
+              <w:pStyle w:val="Compact"/>
+            </w:pPr>
+            <w:r>
+              <w:t xml:space="preserve">Thay đổi</w:t>
+            </w:r>
+          </w:p>
+        </w:tc>
+      </w:tr>
+      <w:tr>
+        <w:tc>
+          <w:tcPr/>
+          <w:p>
+            <w:pPr>
+              <w:pStyle w:val="Compact"/>
+            </w:pPr>
+            <w:r>
+              <w:t xml:space="preserve">Điểm Performance</w:t>
+            </w:r>
+          </w:p>
+        </w:tc>
+        <w:tc>
+          <w:tcPr/>
+          <w:p>
+            <w:pPr>
+              <w:pStyle w:val="Compact"/>
+            </w:pPr>
+            <w:r>
+              <w:t xml:space="preserve">13</w:t>
+            </w:r>
+          </w:p>
+        </w:tc>
+        <w:tc>
+          <w:tcPr/>
+          <w:p>
+            <w:pPr>
+              <w:pStyle w:val="Compact"/>
+            </w:pPr>
+            <w:r>
+              <w:t xml:space="preserve">74</w:t>
+            </w:r>
+          </w:p>
+        </w:tc>
+        <w:tc>
+          <w:tcPr/>
+          <w:p>
+            <w:pPr>
+              <w:pStyle w:val="Compact"/>
+            </w:pPr>
+            <w:r>
+              <w:t xml:space="preserve">+61 điểm</w:t>
+            </w:r>
+          </w:p>
+        </w:tc>
+      </w:tr>
+      <w:tr>
+        <w:tc>
+          <w:tcPr/>
+          <w:p>
+            <w:pPr>
+              <w:pStyle w:val="Compact"/>
+            </w:pPr>
+            <w:r>
+              <w:t xml:space="preserve">Điểm SEO</w:t>
+            </w:r>
+          </w:p>
+        </w:tc>
+        <w:tc>
+          <w:tcPr/>
+          <w:p>
+            <w:pPr>
+              <w:pStyle w:val="Compact"/>
+            </w:pPr>
+            <w:r>
+              <w:t xml:space="preserve">85</w:t>
+            </w:r>
+          </w:p>
+        </w:tc>
+        <w:tc>
+          <w:tcPr/>
+          <w:p>
+            <w:pPr>
+              <w:pStyle w:val="Compact"/>
+            </w:pPr>
+            <w:r>
+              <w:t xml:space="preserve">92</w:t>
+            </w:r>
+          </w:p>
+        </w:tc>
+        <w:tc>
+          <w:tcPr/>
+          <w:p>
+            <w:pPr>
+              <w:pStyle w:val="Compact"/>
+            </w:pPr>
+            <w:r>
+              <w:t xml:space="preserve">+7 điểm</w:t>
+            </w:r>
+          </w:p>
+        </w:tc>
+      </w:tr>
+      <w:tr>
+        <w:tc>
+          <w:tcPr/>
+          <w:p>
+            <w:pPr>
+              <w:pStyle w:val="Compact"/>
+            </w:pPr>
+            <w:r>
+              <w:t xml:space="preserve">Điểm Best Practices</w:t>
+            </w:r>
+          </w:p>
+        </w:tc>
+        <w:tc>
+          <w:tcPr/>
+          <w:p>
+            <w:pPr>
+              <w:pStyle w:val="Compact"/>
+            </w:pPr>
+            <w:r>
+              <w:t xml:space="preserve">96</w:t>
+            </w:r>
+          </w:p>
+        </w:tc>
+        <w:tc>
+          <w:tcPr/>
+          <w:p>
+            <w:pPr>
+              <w:pStyle w:val="Compact"/>
+            </w:pPr>
+            <w:r>
+              <w:t xml:space="preserve">96</w:t>
+            </w:r>
+          </w:p>
+        </w:tc>
+        <w:tc>
+          <w:tcPr/>
+          <w:p>
+            <w:pPr>
+              <w:pStyle w:val="Compact"/>
+            </w:pPr>
+            <w:r>
+              <w:t xml:space="preserve">ngang bằng</w:t>
+            </w:r>
+          </w:p>
+        </w:tc>
+      </w:tr>
+      <w:tr>
+        <w:tc>
+          <w:tcPr/>
+          <w:p>
+            <w:pPr>
+              <w:pStyle w:val="Compact"/>
+            </w:pPr>
+            <w:r>
+              <w:t xml:space="preserve">Điểm Accessibility</w:t>
+            </w:r>
+          </w:p>
+        </w:tc>
+        <w:tc>
+          <w:tcPr/>
+          <w:p>
+            <w:pPr>
+              <w:pStyle w:val="Compact"/>
+            </w:pPr>
+            <w:r>
+              <w:t xml:space="preserve">88</w:t>
+            </w:r>
+          </w:p>
+        </w:tc>
+        <w:tc>
+          <w:tcPr/>
+          <w:p>
+            <w:pPr>
+              <w:pStyle w:val="Compact"/>
+            </w:pPr>
+            <w:r>
+              <w:t xml:space="preserve">80</w:t>
+            </w:r>
+          </w:p>
+        </w:tc>
+        <w:tc>
+          <w:tcPr/>
+          <w:p>
+            <w:pPr>
+              <w:pStyle w:val="Compact"/>
+            </w:pPr>
+            <w:r>
+              <w:t xml:space="preserve">−8 điểm</w:t>
+            </w:r>
+          </w:p>
+        </w:tc>
+      </w:tr>
+      <w:tr>
+        <w:tc>
+          <w:tcPr/>
+          <w:p>
+            <w:pPr>
+              <w:pStyle w:val="Compact"/>
+            </w:pPr>
+            <w:r>
+              <w:t xml:space="preserve">Trọng lượng trang</w:t>
+            </w:r>
+          </w:p>
+        </w:tc>
+        <w:tc>
+          <w:tcPr/>
+          <w:p>
+            <w:pPr>
+              <w:pStyle w:val="Compact"/>
+            </w:pPr>
+            <w:r>
+              <w:t xml:space="preserve">21,2 MB</w:t>
+            </w:r>
+          </w:p>
+        </w:tc>
+        <w:tc>
+          <w:tcPr/>
+          <w:p>
+            <w:pPr>
+              <w:pStyle w:val="Compact"/>
+            </w:pPr>
+            <w:r>
+              <w:t xml:space="preserve">0,82 MB</w:t>
+            </w:r>
+          </w:p>
+        </w:tc>
+        <w:tc>
+          <w:tcPr/>
+          <w:p>
+            <w:pPr>
+              <w:pStyle w:val="Compact"/>
+            </w:pPr>
+            <w:r>
+              <w:t xml:space="preserve">giảm 96%</w:t>
+            </w:r>
+          </w:p>
+        </w:tc>
+      </w:tr>
+      <w:tr>
+        <w:tc>
+          <w:tcPr/>
+          <w:p>
+            <w:pPr>
+              <w:pStyle w:val="Compact"/>
+            </w:pPr>
+            <w:r>
+              <w:t xml:space="preserve">Số yêu cầu HTTP</w:t>
+            </w:r>
+          </w:p>
+        </w:tc>
+        <w:tc>
+          <w:tcPr/>
+          <w:p>
+            <w:pPr>
+              <w:pStyle w:val="Compact"/>
+            </w:pPr>
+            <w:r>
+              <w:t xml:space="preserve">137</w:t>
+            </w:r>
+          </w:p>
+        </w:tc>
+        <w:tc>
+          <w:tcPr/>
+          <w:p>
+            <w:pPr>
+              <w:pStyle w:val="Compact"/>
+            </w:pPr>
+            <w:r>
+              <w:t xml:space="preserve">27</w:t>
+            </w:r>
+          </w:p>
+        </w:tc>
+        <w:tc>
+          <w:tcPr/>
+          <w:p>
+            <w:pPr>
+              <w:pStyle w:val="Compact"/>
+            </w:pPr>
+            <w:r>
+              <w:t xml:space="preserve">giảm 80%</w:t>
+            </w:r>
+          </w:p>
+        </w:tc>
+      </w:tr>
+      <w:tr>
+        <w:tc>
+          <w:tcPr/>
+          <w:p>
+            <w:pPr>
+              <w:pStyle w:val="Compact"/>
+            </w:pPr>
+            <w:r>
+              <w:t xml:space="preserve">FCP</w:t>
+            </w:r>
+          </w:p>
+        </w:tc>
+        <w:tc>
+          <w:tcPr/>
+          <w:p>
+            <w:pPr>
+              <w:pStyle w:val="Compact"/>
+            </w:pPr>
+            <w:r>
+              <w:t xml:space="preserve">5,50 s</w:t>
+            </w:r>
+          </w:p>
+        </w:tc>
+        <w:tc>
+          <w:tcPr/>
+          <w:p>
+            <w:pPr>
+              <w:pStyle w:val="Compact"/>
+            </w:pPr>
+            <w:r>
+              <w:t xml:space="preserve">1,25 s</w:t>
+            </w:r>
+          </w:p>
+        </w:tc>
+        <w:tc>
+          <w:tcPr/>
+          <w:p>
+            <w:pPr>
+              <w:pStyle w:val="Compact"/>
+            </w:pPr>
+            <w:r>
+              <w:t xml:space="preserve">nhanh 4,4 lần</w:t>
+            </w:r>
+          </w:p>
+        </w:tc>
+      </w:tr>
+      <w:tr>
+        <w:tc>
+          <w:tcPr/>
+          <w:p>
+            <w:pPr>
+              <w:pStyle w:val="Compact"/>
+            </w:pPr>
+            <w:r>
+              <w:t xml:space="preserve">LCP</w:t>
+            </w:r>
+          </w:p>
+        </w:tc>
+        <w:tc>
+          <w:tcPr/>
+          <w:p>
+            <w:pPr>
+              <w:pStyle w:val="Compact"/>
+            </w:pPr>
+            <w:r>
+              <w:t xml:space="preserve">86,5 s</w:t>
+            </w:r>
+          </w:p>
+        </w:tc>
+        <w:tc>
+          <w:tcPr/>
+          <w:p>
+            <w:pPr>
+              <w:pStyle w:val="Compact"/>
+            </w:pPr>
+            <w:r>
+              <w:t xml:space="preserve">5,51 s</w:t>
+            </w:r>
+          </w:p>
+        </w:tc>
+        <w:tc>
+          <w:tcPr/>
+          <w:p>
+            <w:pPr>
+              <w:pStyle w:val="Compact"/>
+            </w:pPr>
+            <w:r>
+              <w:t xml:space="preserve">nhanh 15,7 lần</w:t>
+            </w:r>
+          </w:p>
+        </w:tc>
+      </w:tr>
+      <w:tr>
+        <w:tc>
+          <w:tcPr/>
+          <w:p>
+            <w:pPr>
+              <w:pStyle w:val="Compact"/>
+            </w:pPr>
+            <w:r>
+              <w:t xml:space="preserve">TBT</w:t>
+            </w:r>
+          </w:p>
+        </w:tc>
+        <w:tc>
+          <w:tcPr/>
+          <w:p>
+            <w:pPr>
+              <w:pStyle w:val="Compact"/>
+            </w:pPr>
+            <w:r>
+              <w:t xml:space="preserve">4.467 ms</w:t>
+            </w:r>
+          </w:p>
+        </w:tc>
+        <w:tc>
+          <w:tcPr/>
+          <w:p>
+            <w:pPr>
+              <w:pStyle w:val="Compact"/>
+            </w:pPr>
+            <w:r>
+              <w:t xml:space="preserve">268 ms</w:t>
+            </w:r>
+          </w:p>
+        </w:tc>
+        <w:tc>
+          <w:tcPr/>
+          <w:p>
+            <w:pPr>
+              <w:pStyle w:val="Compact"/>
+            </w:pPr>
+            <w:r>
+              <w:t xml:space="preserve">giảm 94%</w:t>
+            </w:r>
+          </w:p>
+        </w:tc>
+      </w:tr>
+      <w:tr>
+        <w:tc>
+          <w:tcPr/>
+          <w:p>
+            <w:pPr>
+              <w:pStyle w:val="Compact"/>
+            </w:pPr>
+            <w:r>
+              <w:t xml:space="preserve">CLS</w:t>
+            </w:r>
+          </w:p>
+        </w:tc>
+        <w:tc>
+          <w:tcPr/>
+          <w:p>
+            <w:pPr>
+              <w:pStyle w:val="Compact"/>
+            </w:pPr>
+            <w:r>
+              <w:t xml:space="preserve">0,243</w:t>
+            </w:r>
+          </w:p>
+        </w:tc>
+        <w:tc>
+          <w:tcPr/>
+          <w:p>
+            <w:pPr>
+              <w:pStyle w:val="Compact"/>
+            </w:pPr>
+            <w:r>
+              <w:t xml:space="preserve">0,000</w:t>
+            </w:r>
+          </w:p>
+        </w:tc>
+        <w:tc>
+          <w:tcPr/>
+          <w:p>
+            <w:pPr>
+              <w:pStyle w:val="Compact"/>
+            </w:pPr>
+            <w:r>
+              <w:t xml:space="preserve">về mức lý tưởng</w:t>
+            </w:r>
+          </w:p>
+        </w:tc>
+      </w:tr>
+      <w:tr>
+        <w:tc>
+          <w:tcPr/>
+          <w:p>
+            <w:pPr>
+              <w:pStyle w:val="Compact"/>
+            </w:pPr>
+            <w:r>
+              <w:t xml:space="preserve">Speed Index</w:t>
+            </w:r>
+          </w:p>
+        </w:tc>
+        <w:tc>
+          <w:tcPr/>
+          <w:p>
+            <w:pPr>
+              <w:pStyle w:val="Compact"/>
+            </w:pPr>
+            <w:r>
+              <w:t xml:space="preserve">30,8 s</w:t>
+            </w:r>
+          </w:p>
+        </w:tc>
+        <w:tc>
+          <w:tcPr/>
+          <w:p>
+            <w:pPr>
+              <w:pStyle w:val="Compact"/>
+            </w:pPr>
+            <w:r>
+              <w:t xml:space="preserve">2,29 s</w:t>
+            </w:r>
+          </w:p>
+        </w:tc>
+        <w:tc>
+          <w:tcPr/>
+          <w:p>
+            <w:pPr>
+              <w:pStyle w:val="Compact"/>
+            </w:pPr>
+            <w:r>
+              <w:t xml:space="preserve">nhanh 13,5 lần</w:t>
+            </w:r>
+          </w:p>
+        </w:tc>
+      </w:tr>
+      <w:tr>
+        <w:tc>
+          <w:tcPr/>
+          <w:p>
+            <w:pPr>
+              <w:pStyle w:val="Compact"/>
+            </w:pPr>
+            <w:r>
+              <w:t xml:space="preserve">Dữ liệu có cấu trúc (JSON-LD)</w:t>
+            </w:r>
+          </w:p>
+        </w:tc>
+        <w:tc>
+          <w:tcPr/>
+          <w:p>
+            <w:pPr>
+              <w:pStyle w:val="Compact"/>
+            </w:pPr>
+            <w:r>
+              <w:t xml:space="preserve">0 khối</w:t>
+            </w:r>
+          </w:p>
+        </w:tc>
+        <w:tc>
+          <w:tcPr/>
+          <w:p>
+            <w:pPr>
+              <w:pStyle w:val="Compact"/>
+            </w:pPr>
+            <w:r>
+              <w:t xml:space="preserve">6 khối</w:t>
+            </w:r>
+          </w:p>
+        </w:tc>
+        <w:tc>
+          <w:tcPr/>
+          <w:p>
+            <w:pPr>
+              <w:pStyle w:val="Compact"/>
+            </w:pPr>
+            <w:r>
+              <w:t xml:space="preserve">bổ sung mới</w:t>
+            </w:r>
+          </w:p>
+        </w:tc>
+      </w:tr>
+      <w:tr>
+        <w:tc>
+          <w:tcPr/>
+          <w:p>
+            <w:pPr>
+              <w:pStyle w:val="Compact"/>
+            </w:pPr>
+            <w:r>
+              <w:t xml:space="preserve">Ảnh nạp trễ</w:t>
+            </w:r>
+          </w:p>
+        </w:tc>
+        <w:tc>
+          <w:tcPr/>
+          <w:p>
+            <w:pPr>
+              <w:pStyle w:val="Compact"/>
+            </w:pPr>
+            <w:r>
+              <w:t xml:space="preserve">0/38</w:t>
+            </w:r>
+          </w:p>
+        </w:tc>
+        <w:tc>
+          <w:tcPr/>
+          <w:p>
+            <w:pPr>
+              <w:pStyle w:val="Compact"/>
+            </w:pPr>
+            <w:r>
+              <w:t xml:space="preserve">44/45</w:t>
+            </w:r>
+          </w:p>
+        </w:tc>
+        <w:tc>
+          <w:tcPr/>
+          <w:p>
+            <w:pPr>
+              <w:pStyle w:val="Compact"/>
+            </w:pPr>
+            <w:r>
+              <w:t xml:space="preserve">bổ sung mới</w:t>
+            </w:r>
+          </w:p>
+        </w:tc>
+      </w:tr>
+      <w:tr>
+        <w:tc>
+          <w:tcPr/>
+          <w:p>
+            <w:pPr>
+              <w:pStyle w:val="Compact"/>
+            </w:pPr>
+            <w:r>
+              <w:t xml:space="preserve">Sitemap</w:t>
+            </w:r>
+          </w:p>
+        </w:tc>
+        <w:tc>
+          <w:tcPr/>
+          <w:p>
+            <w:pPr>
+              <w:pStyle w:val="Compact"/>
+            </w:pPr>
+            <w:r>
+              <w:t xml:space="preserve">trả về trang HTML (không hợp lệ)</w:t>
+            </w:r>
+          </w:p>
+        </w:tc>
+        <w:tc>
+          <w:tcPr/>
+          <w:p>
+            <w:pPr>
+              <w:pStyle w:val="Compact"/>
+            </w:pPr>
+            <w:r>
+              <w:t xml:space="preserve">XML hợp lệ, kèm</w:t>
+            </w:r>
+            <w:r>
+              <w:t xml:space="preserve"> </w:t>
+            </w:r>
+            <w:r>
+              <w:rPr>
+                <w:rStyle w:val="VerbatimChar"/>
+              </w:rPr>
+              <w:t xml:space="preserve">lastmod</w:t>
+            </w:r>
+          </w:p>
+        </w:tc>
+        <w:tc>
+          <w:tcPr/>
+          <w:p>
+            <w:pPr>
+              <w:pStyle w:val="Compact"/>
+            </w:pPr>
+            <w:r>
+              <w:t xml:space="preserve">bổ sung mới</w:t>
+            </w:r>
+          </w:p>
+        </w:tc>
+      </w:tr>
+    </w:tbl>
+    <w:p>
+      <w:pPr>
+        <w:pStyle w:val="BodyText"/>
+      </w:pPr>
+      <w:r>
+        <w:t xml:space="preserve">Kết quả cho thấy khoảng cách lớn nhất nằm ở nhóm hiệu năng tải trang. Trang chủ cũ tải về 21,2 MB qua 137 yêu cầu HTTP mà không nạp trễ bất kỳ ảnh nào, khiến trong điều kiện mạng di động mô phỏng, chỉ số LCP lên tới 86,5 giây và Speed Index 30,8 giây — nói cách khác, người dùng điện thoại ở điều kiện mạng trung bình gần như không đợi được đến lúc trang hiển thị xong. Trang chủ mới, với cùng lượng nội dung hiển thị tương đương, chỉ tải 0,82 MB qua 27 yêu cầu: mức giảm 96% trọng lượng này là kết quả cộng hưởng của kết xuất HTML sẵn phía máy chủ, nạp trễ 44/45 ảnh và tối ưu kích thước ảnh qua</w:t>
+      </w:r>
+      <w:r>
+        <w:t xml:space="preserve"> </w:t>
+      </w:r>
+      <w:r>
+        <w:rPr>
+          <w:rStyle w:val="VerbatimChar"/>
+        </w:rPr>
+        <w:t xml:space="preserve">next/image</w:t>
+      </w:r>
+      <w:r>
+        <w:t xml:space="preserve">, đưa toàn bộ các chỉ số tốc độ về vùng chấp nhận được (FCP 1,25 giây; TBT giảm 94%) và độ ổn định bố cục về mức lý tưởng (CLS 0,243 → 0,000). Cần lưu ý một cách trung thực rằng phép đo trang mới không chứa độ trễ mạng thật ở thành phần phản hồi máy chủ; tuy nhiên các chỉ số chênh lệch nhiều lần ở trên chủ yếu phản ánh khối lượng tài nguyên và cấu trúc trang — các yếu tố không đổi khi triển khai — nên xu hướng so sánh vẫn giữ nguyên khi đo lại trên tên miền chính thức.</w:t>
+      </w:r>
+    </w:p>
+    <w:p>
+      <w:pPr>
+        <w:pStyle w:val="BodyText"/>
+      </w:pPr>
+      <w:r>
+        <w:t xml:space="preserve">Ở nhóm khả năng được tìm thấy, điểm SEO tăng từ 85 lên 92 chưa phản ánh hết khác biệt về chất: website cũ tuy có thẻ mô tả và canonical nhưng hoàn toàn không có dữ liệu có cấu trúc và không có sitemap thực (địa chỉ</w:t>
+      </w:r>
+      <w:r>
+        <w:t xml:space="preserve"> </w:t>
+      </w:r>
+      <w:r>
+        <w:rPr>
+          <w:rStyle w:val="VerbatimChar"/>
+        </w:rPr>
+        <w:t xml:space="preserve">sitemap.xml</w:t>
+      </w:r>
+      <w:r>
+        <w:t xml:space="preserve"> </w:t>
+      </w:r>
+      <w:r>
+        <w:t xml:space="preserve">trả về một trang HTML), nghĩa là hơn 1.600 bài viết không có bản đồ nội dung nào cho máy tìm kiếm; hệ thống mới bổ sung 6 khối JSON-LD trên trang chủ, sitemap XML hợp lệ kèm thời điểm cập nhật và 397 chuyển hướng vĩnh viễn bảo toàn giá trị các URL cũ. Ngược lại, điểm Accessibility của trang mới thấp hơn trang cũ 8 điểm — kết quả ngược kỳ vọng đã được phân tích tại mục 4.4 và đưa vào danh mục việc cần hoàn thiện. Tổng hợp lại, hệ thống mới vượt nền tảng cũ ở đúng những chỉ tiêu mà mục tiêu đề tài nhắm đến (hiệu năng, khả năng được tìm thấy, năng lực quản trị), đồng thời số liệu cũng chỉ ra cụ thể các điểm còn phải cải thiện trước khi vận hành chính thức.</w:t>
       </w:r>
     </w:p>
     <w:bookmarkEnd w:id="106"/>
@@ -9978,7 +11834,7 @@
           <w:i/>
           <w:iCs/>
         </w:rPr>
-        <w:t xml:space="preserve">Bảng 4.7. Đối chiếu mục tiêu (mục 1.2) và kết quả đạt được</w:t>
+        <w:t xml:space="preserve">Bảng 4.10. Đối chiếu mục tiêu (mục 1.2) và kết quả đạt được</w:t>
       </w:r>
     </w:p>
     <w:tbl>
@@ -10190,18 +12046,18 @@
               <w:pStyle w:val="Compact"/>
             </w:pPr>
             <w:r>
-              <w:t xml:space="preserve">Thiết kế và hiện thực đủ (3.8); kiểm chứng định tính 4.6; số đo định lượng chờ điều kiện hạ tầng</w:t>
-            </w:r>
-          </w:p>
-        </w:tc>
-        <w:tc>
-          <w:tcPr/>
-          <w:p>
-            <w:pPr>
-              <w:pStyle w:val="Compact"/>
-            </w:pPr>
-            <w:r>
-              <w:t xml:space="preserve">Hoàn thành phần hiện thực; phép đo còn treo</w:t>
+              <w:t xml:space="preserve">Đo lab 12/07/2026: Performance 13 → 74, trọng lượng giảm 96%, LCP nhanh 15,7 lần, CLS 0,000, SEO 92–100, sitemap + JSON-LD + 397 redirect (Bảng 4.9)</w:t>
+            </w:r>
+          </w:p>
+        </w:tc>
+        <w:tc>
+          <w:tcPr/>
+          <w:p>
+            <w:pPr>
+              <w:pStyle w:val="Compact"/>
+            </w:pPr>
+            <w:r>
+              <w:t xml:space="preserve">Hoàn thành; còn treo phép đo cần domain (CrUX, TLS)</w:t>
             </w:r>
           </w:p>
         </w:tc>
@@ -10257,23 +12113,22 @@
         <w:pStyle w:val="FirstParagraph"/>
       </w:pPr>
       <w:r>
-        <w:t xml:space="preserve">Hệ thống đạt trọn vẹn các mục tiêu chức năng: nền tảng quản trị nội dung hiện đại vận hành trên đúng khối dữ liệu thật của Khoa, quy trình biên tập – xuất bản hoàn chỉnh, phân quyền phản ánh đúng tổ chức, và toàn bộ tài sản nội dung cũ được bảo toàn kèm chuyển hướng URL. Tính đúng đắn được chứng minh bằng kiểm thử tự động (40/40) và kiểm thử chức năng có đối chứng trên cả bốn nhóm nghiệp vụ. Hạng mục còn mở tập trung ở nhóm</w:t>
-      </w:r>
-      <w:r>
-        <w:t xml:space="preserve"> </w:t>
-      </w:r>
-      <w:r>
-        <w:rPr>
-          <w:i/>
-          <w:iCs/>
-        </w:rPr>
-        <w:t xml:space="preserve">đo lường sau triển khai</w:t>
-      </w:r>
-      <w:r>
-        <w:t xml:space="preserve"> </w:t>
-      </w:r>
-      <w:r>
-        <w:t xml:space="preserve">— Core Web Vitals, Lighthouse, bảo mật HTTP/TLS, kiểm định dữ liệu có cấu trúc — tất cả chỉ chờ điều kiện duy nhất là tên miền công khai; phương pháp và công cụ đo đã chuẩn bị sẵn tại mục 4.1.</w:t>
+        <w:t xml:space="preserve">Hệ thống đạt trọn vẹn các mục tiêu chức năng: nền tảng quản trị nội dung hiện đại vận hành trên đúng khối dữ liệu thật của Khoa, quy trình biên tập – xuất bản hoàn chỉnh, phân quyền phản ánh đúng tổ chức, và toàn bộ tài sản nội dung cũ được bảo toàn kèm chuyển hướng URL. Tính đúng đắn được chứng minh bằng kiểm thử tự động (40/40) và kiểm thử chức năng có đối chứng trên cả bốn nhóm nghiệp vụ; hiệu quả được lượng hóa bằng phép đo cùng điều kiện với website cũ, cho thấy cải thiện nhiều lần ở đúng các chỉ tiêu đặt ra tại mục 1.2. Số liệu đo cũng chỉ ra ba hạng mục cần hoàn thiện trước vận hành chính thức — độ tương phản và nhãn ARIA (Accessibility 80–91), tối ưu ảnh hero và kho ảnh legacy, bổ sung thẻ</w:t>
+      </w:r>
+      <w:r>
+        <w:t xml:space="preserve"> </w:t>
+      </w:r>
+      <w:r>
+        <w:rPr>
+          <w:rStyle w:val="VerbatimChar"/>
+        </w:rPr>
+        <w:t xml:space="preserve">hreflang</w:t>
+      </w:r>
+      <w:r>
+        <w:t xml:space="preserve"> </w:t>
+      </w:r>
+      <w:r>
+        <w:t xml:space="preserve">— cùng nhóm phép đo còn chờ tên miền công khai (CrUX, Observatory, SSL Labs, Rich Results); phương pháp và công cụ đo đã chuẩn bị sẵn tại mục 4.1.</w:t>
       </w:r>
     </w:p>
     <w:p>
@@ -10367,7 +12222,7 @@
         <w:t xml:space="preserve">Về chất lượng</w:t>
       </w:r>
       <w:r>
-        <w:t xml:space="preserve">, tính đúng đắn được chứng minh bằng 40/40 ca kiểm thử đơn vị cùng các kịch bản kiểm thử chức năng có đối chứng trên bốn nhóm nghiệp vụ (CRUD, phân quyền, xuất bản, di trú); hệ thống được đóng gói Docker tự chứa, dựng lại được từ mã nguồn bằng một kịch bản triển khai trên chính hạ tầng ràng buộc của Khoa.</w:t>
+        <w:t xml:space="preserve">, tính đúng đắn được chứng minh bằng 40/40 ca kiểm thử đơn vị cùng các kịch bản kiểm thử chức năng có đối chứng trên bốn nhóm nghiệp vụ (CRUD, phân quyền, xuất bản, di trú); hiệu quả được lượng hóa bằng phép đo cùng điều kiện với website cũ — điểm hiệu năng Lighthouse tăng từ 13 lên 74, trọng lượng trang chủ giảm 96%, độ ổn định bố cục đạt mức lý tưởng — đúng các chỉ tiêu đặt ra từ mục 1.2. Hệ thống được đóng gói Docker tự chứa, dựng lại được từ mã nguồn bằng một kịch bản triển khai trên chính hạ tầng ràng buộc của Khoa.</w:t>
       </w:r>
     </w:p>
     <w:bookmarkEnd w:id="111"/>
@@ -10385,7 +12240,22 @@
         <w:pStyle w:val="FirstParagraph"/>
       </w:pPr>
       <w:r>
-        <w:t xml:space="preserve">Khóa luận nhìn nhận một số hạn chế, phần lớn gắn với điều kiện hạ tầng tại thời điểm thực hiện. Trước hết, máy chủ thử nghiệm chưa được gắn tên miền và HTTPS, nên nhóm phép đo sau triển khai — Core Web Vitals, Lighthouse, MDN Observatory, SSL Labs và kiểm định dữ liệu có cấu trúc — chưa có số liệu; các vị trí này được đánh dấu rõ trong Chương 4 kèm phương pháp đo đã chuẩn bị sẵn. Về bảo trì, kết quả quét</w:t>
+        <w:t xml:space="preserve">Khóa luận nhìn nhận một số hạn chế, một phần gắn với điều kiện hạ tầng tại thời điểm thực hiện, một phần do chính số liệu đo của Chương 4 chỉ ra. Trước hết, máy chủ thử nghiệm chưa được gắn tên miền và HTTPS, nên nhóm phép đo dựa trên người dùng và giao thức thật — dữ liệu trường CrUX, MDN Observatory, SSL Labs, Rich Results Test — chưa có số liệu; các vị trí này được đánh dấu rõ trong Chương 4 kèm phương pháp đo đã chuẩn bị sẵn. Kế đến, phép đo phòng thí nghiệm cho thấy ba điểm cần hoàn thiện: điểm Accessibility (80–91) thấp hơn kỳ vọng do độ tương phản màu và nhãn ARIA; ảnh hero và đặc biệt là kho ảnh legacy trong thân bài di trú chưa được tối ưu kích thước, kéo LCP và TBT của một số trang vượt ngưỡng tốt; và các trang chưa phát thẻ</w:t>
+      </w:r>
+      <w:r>
+        <w:t xml:space="preserve"> </w:t>
+      </w:r>
+      <w:r>
+        <w:rPr>
+          <w:rStyle w:val="VerbatimChar"/>
+        </w:rPr>
+        <w:t xml:space="preserve">hreflang</w:t>
+      </w:r>
+      <w:r>
+        <w:t xml:space="preserve"> </w:t>
+      </w:r>
+      <w:r>
+        <w:t xml:space="preserve">cho hai phiên bản ngôn ngữ. Về bảo trì, kết quả quét</w:t>
       </w:r>
       <w:r>
         <w:t xml:space="preserve"> </w:t>
@@ -10456,7 +12326,7 @@
         <w:pStyle w:val="BodyText"/>
       </w:pPr>
       <w:r>
-        <w:t xml:space="preserve">Hệ thống đã ở trạng thái sẵn sàng chuyển giao: mã nguồn, dữ liệu di trú, kịch bản triển khai và tài liệu vận hành đầy đủ để Khoa đưa vào sử dụng chính thức ngay khi hạ tầng tên miền hoàn tất.</w:t>
+        <w:t xml:space="preserve">Nhìn lại toàn bộ quá trình thực hiện, đề tài đã trả lời trọn vẹn bài toán đặt ra từ Chương 1. Nhu cầu được chứng minh là có thật và cấp bách bằng chính số liệu khảo sát hiện trạng; cách giải quyết mang lại giá trị mới so với các hệ thống web khoa/trường thông dụng — từ mô hình Headless CMS kết hợp trình dàn trang trực quan, phân quyền theo bộ môn, đến quy trình di trú bảo toàn trọn vẹn tài sản nội dung; và tính khả thi của các lựa chọn không dừng ở lập luận mà được kiểm chứng bằng sản phẩm hoàn chỉnh chạy trên đúng dữ liệu thật, đo đếm được trên đúng hạ tầng ràng buộc của Khoa. Hệ thống hiện ở trạng thái sẵn sàng chuyển giao: mã nguồn, dữ liệu di trú, kịch bản triển khai và tài liệu vận hành đầy đủ để Khoa đưa vào sử dụng chính thức ngay khi hạ tầng tên miền hoàn tất.</w:t>
       </w:r>
     </w:p>
     <w:p>

</xml_diff>

<commit_message>
docs(kltn): replace code identifiers with prose descriptions; re-export docx
Co-Authored-By: Claude Fable 5 <noreply@anthropic.com>
</commit_message>
<xml_diff>
--- a/thesis/KLTN_BANTHAO.docx
+++ b/thesis/KLTN_BANTHAO.docx
@@ -910,19 +910,7 @@
         <w:pStyle w:val="BodyText"/>
       </w:pPr>
       <w:r>
-        <w:t xml:space="preserve">Prisma là bộ công cụ ánh xạ đối tượng – quan hệ (ORM) cho TypeScript: lược đồ dữ liệu được khai báo tập trung trong một tệp</w:t>
-      </w:r>
-      <w:r>
-        <w:t xml:space="preserve"> </w:t>
-      </w:r>
-      <w:r>
-        <w:rPr>
-          <w:rStyle w:val="VerbatimChar"/>
-        </w:rPr>
-        <w:t xml:space="preserve">schema.prisma</w:t>
-      </w:r>
-      <w:r>
-        <w:t xml:space="preserve">, từ đó Prisma sinh ra client truy vấn có kiểu an toàn tuyệt đối tại thời điểm biên dịch và quản lý các phiên bản di trú lược đồ (migration) [11]. Việc lược đồ là</w:t>
+        <w:t xml:space="preserve">Prisma là bộ công cụ ánh xạ đối tượng – quan hệ (ORM) cho TypeScript: lược đồ dữ liệu được khai báo tập trung trong một tệp lược đồ duy nhất, từ đó Prisma sinh ra client truy vấn có kiểu an toàn tuyệt đối tại thời điểm biên dịch và quản lý các phiên bản di trú lược đồ (migration) [11]. Việc lược đồ là</w:t>
       </w:r>
       <w:r>
         <w:t xml:space="preserve"> </w:t>
@@ -1020,70 +1008,7 @@
         <w:t xml:space="preserve">HCMUS Physics CMS</w:t>
       </w:r>
       <w:r>
-        <w:t xml:space="preserve">, tổ chức dưới dạng một monorepo pnpm gồm ba workspace tương ứng ba thành phần chạy độc lập. Thành phần thứ nhất là máy chủ API (workspace</w:t>
-      </w:r>
-      <w:r>
-        <w:t xml:space="preserve"> </w:t>
-      </w:r>
-      <w:r>
-        <w:rPr>
-          <w:i/>
-          <w:iCs/>
-        </w:rPr>
-        <w:t xml:space="preserve">backend</w:t>
-      </w:r>
-      <w:r>
-        <w:t xml:space="preserve">) xây dựng trên NestJS 11, lắng nghe cổng 3001, làm việc với PostgreSQL qua Prisma và dùng Redis làm bộ nhớ đệm đọc. Thành phần thứ hai là trang quản trị (workspace</w:t>
-      </w:r>
-      <w:r>
-        <w:t xml:space="preserve"> </w:t>
-      </w:r>
-      <w:r>
-        <w:rPr>
-          <w:i/>
-          <w:iCs/>
-        </w:rPr>
-        <w:t xml:space="preserve">admin</w:t>
-      </w:r>
-      <w:r>
-        <w:t xml:space="preserve">, thư mục</w:t>
-      </w:r>
-      <w:r>
-        <w:t xml:space="preserve"> </w:t>
-      </w:r>
-      <w:r>
-        <w:rPr>
-          <w:rStyle w:val="VerbatimChar"/>
-        </w:rPr>
-        <w:t xml:space="preserve">frontend/</w:t>
-      </w:r>
-      <w:r>
-        <w:t xml:space="preserve">) trên Next.js 16, cổng 3000, dành cho văn phòng khoa và các bộ môn soạn thảo, dàn trang và xuất bản nội dung. Thành phần thứ ba là trang công khai (workspace</w:t>
-      </w:r>
-      <w:r>
-        <w:t xml:space="preserve"> </w:t>
-      </w:r>
-      <w:r>
-        <w:rPr>
-          <w:i/>
-          <w:iCs/>
-        </w:rPr>
-        <w:t xml:space="preserve">public</w:t>
-      </w:r>
-      <w:r>
-        <w:t xml:space="preserve">, thư mục</w:t>
-      </w:r>
-      <w:r>
-        <w:t xml:space="preserve"> </w:t>
-      </w:r>
-      <w:r>
-        <w:rPr>
-          <w:rStyle w:val="VerbatimChar"/>
-        </w:rPr>
-        <w:t xml:space="preserve">frontend-public/</w:t>
-      </w:r>
-      <w:r>
-        <w:t xml:space="preserve">) cũng trên Next.js 16, cổng 3002, kết xuất các trang đã xuất bản cho khách truy cập. Cả ba thành phần viết bằng TypeScript, chia sẻ định nghĩa kiểu dữ liệu, được kiểm tra bằng cùng một bộ cổng chất lượng (lint, kiểm tra kiểu, kiểm thử đơn vị, build) và đóng gói bằng Docker khi triển khai.</w:t>
+        <w:t xml:space="preserve">, tổ chức dưới dạng một kho mã nguồn hợp nhất (monorepo) gồm ba thành phần chạy độc lập. Thành phần thứ nhất là máy chủ API xây dựng trên NestJS 11, lắng nghe cổng 3001, làm việc với PostgreSQL qua Prisma và dùng Redis làm bộ nhớ đệm đọc. Thành phần thứ hai là trang quản trị trên Next.js 16, cổng 3000, dành cho văn phòng khoa và các bộ môn soạn thảo, dàn trang và xuất bản nội dung. Thành phần thứ ba là trang công khai, cũng trên Next.js 16, cổng 3002, kết xuất các trang đã xuất bản cho khách truy cập. Cả ba thành phần viết bằng TypeScript, chia sẻ định nghĩa kiểu dữ liệu, được kiểm tra bằng cùng một bộ cổng chất lượng (lint, kiểm tra kiểu, kiểm thử đơn vị, build) và đóng gói bằng Docker khi triển khai.</w:t>
       </w:r>
     </w:p>
     <w:bookmarkEnd w:id="39"/>
@@ -1422,22 +1347,7 @@
         <w:pStyle w:val="BodyText"/>
       </w:pPr>
       <w:r>
-        <w:t xml:space="preserve">Bên trong NestJS, mã nguồn chia thành</w:t>
-      </w:r>
-      <w:r>
-        <w:t xml:space="preserve"> </w:t>
-      </w:r>
-      <w:r>
-        <w:rPr>
-          <w:rStyle w:val="VerbatimChar"/>
-        </w:rPr>
-        <w:t xml:space="preserve">SharedModule</w:t>
-      </w:r>
-      <w:r>
-        <w:t xml:space="preserve"> </w:t>
-      </w:r>
-      <w:r>
-        <w:t xml:space="preserve">(PrismaService, CacheManager kết nối Redis, AuthGuard/RolesGuard, bộ lọc ngoại lệ HTTP, các hàm tiện ích) và các module nghiệp vụ: User/Auth, PageLayout, Post, Widget, Media, Subscription, Visitor, Department, Category và Admin. Các module nghiệp vụ không gọi nhau qua HTTP mà tiêm service trực tiếp qua cơ chế dependency injection. Quan hệ giữa các module được minh họa trong Hình 3.2.</w:t>
+        <w:t xml:space="preserve">Bên trong NestJS, mã nguồn chia thành một phân hệ dùng chung — gồm lớp truy cập cơ sở dữ liệu, trình quản lý bộ nhớ đệm kết nối Redis, các chốt xác thực và phân quyền, bộ lọc ngoại lệ HTTP cùng các hàm tiện ích — và mười phân hệ nghiệp vụ: người dùng – xác thực, bố cục trang, bài viết, widget, phương tiện, đăng ký nhận tin, thống kê truy cập, đơn vị, chuyên mục và quản trị viên. Các phân hệ nghiệp vụ không gọi nhau qua HTTP mà tiêm dịch vụ trực tiếp qua cơ chế tiêm phụ thuộc. Quan hệ giữa các module được minh họa trong Hình 3.2.</w:t>
       </w:r>
     </w:p>
     <w:p>
@@ -1515,70 +1425,7 @@
         <w:t xml:space="preserve"> </w:t>
       </w:r>
       <w:r>
-        <w:t xml:space="preserve">(Single Source of Truth): chỉ bố cục trang chủ (</w:t>
-      </w:r>
-      <w:r>
-        <w:rPr>
-          <w:rStyle w:val="VerbatimChar"/>
-        </w:rPr>
-        <w:t xml:space="preserve">trang-chu</w:t>
-      </w:r>
-      <w:r>
-        <w:t xml:space="preserve">) lưu cấu hình Navbar và Footer thật; mọi trang khác dùng hai thành phần bao</w:t>
-      </w:r>
-      <w:r>
-        <w:t xml:space="preserve"> </w:t>
-      </w:r>
-      <w:r>
-        <w:rPr>
-          <w:rStyle w:val="VerbatimChar"/>
-        </w:rPr>
-        <w:t xml:space="preserve">SiteHeader</w:t>
-      </w:r>
-      <w:r>
-        <w:t xml:space="preserve"> </w:t>
-      </w:r>
-      <w:r>
-        <w:t xml:space="preserve">và</w:t>
-      </w:r>
-      <w:r>
-        <w:t xml:space="preserve"> </w:t>
-      </w:r>
-      <w:r>
-        <w:rPr>
-          <w:rStyle w:val="VerbatimChar"/>
-        </w:rPr>
-        <w:t xml:space="preserve">SiteFooter</w:t>
-      </w:r>
-      <w:r>
-        <w:t xml:space="preserve">, khi kết xuất sẽ tự nạp cấu hình từ bố cục</w:t>
-      </w:r>
-      <w:r>
-        <w:t xml:space="preserve"> </w:t>
-      </w:r>
-      <w:r>
-        <w:rPr>
-          <w:rStyle w:val="VerbatimChar"/>
-        </w:rPr>
-        <w:t xml:space="preserve">trang-chu</w:t>
-      </w:r>
-      <w:r>
-        <w:t xml:space="preserve"> </w:t>
-      </w:r>
-      <w:r>
-        <w:t xml:space="preserve">(hiện thực trong</w:t>
-      </w:r>
-      <w:r>
-        <w:t xml:space="preserve"> </w:t>
-      </w:r>
-      <w:r>
-        <w:rPr>
-          <w:rStyle w:val="VerbatimChar"/>
-        </w:rPr>
-        <w:t xml:space="preserve">frontend/src/views/admin/widgets-layout/components/site-syndication.tsx</w:t>
-      </w:r>
-      <w:r>
-        <w:t xml:space="preserve">). Nhờ đó, một lần cập nhật menu trên trang chủ lập tức lan tỏa đến toàn bộ hơn 1.600 trang của hệ thống. Để tránh mỗi lượt kết xuất phát sinh hai truy vấn trùng lặp, hàm nạp cấu hình được đệm ở cấp module với thời gian sống 30 giây.</w:t>
+        <w:t xml:space="preserve">(Single Source of Truth): chỉ bố cục trang chủ lưu cấu hình thanh điều hướng và chân trang thật; mọi trang khác dùng hai khối bao dùng chung cho đầu trang và chân trang, khi kết xuất sẽ tự nạp cấu hình từ bố cục trang chủ. Nhờ đó, một lần cập nhật menu trên trang chủ lập tức lan tỏa đến toàn bộ hơn 1.600 trang của hệ thống. Để tránh mỗi lượt kết xuất phát sinh hai truy vấn trùng lặp, kết quả nạp cấu hình được đệm dùng chung với thời gian sống 30 giây.</w:t>
       </w:r>
     </w:p>
     <w:bookmarkEnd w:id="42"/>
@@ -1606,25 +1453,16 @@
         <w:pStyle w:val="FirstParagraph"/>
       </w:pPr>
       <w:r>
-        <w:t xml:space="preserve">Lược đồ dữ liệu phải đồng thời thỏa mãn: (i) quan hệ nghiệp vụ chặt chẽ giữa người dùng – đơn vị – bài viết – chuyên mục – trang bố cục; (ii) văn bản hiển thị song ngữ trên hầu hết thực thể; (iii) bố cục trang là cây JSON tự do của Visual Builder; (iv) dấu vết nguồn gốc cho dữ liệu di trú để chạy lặp lại an toàn; (v) phạm vi bộ môn trên nội dung phục vụ phân quyền. Yêu cầu (i) dẫn đến mô hình quan hệ chuẩn hóa với khóa ngoại; các yêu cầu (ii) và (iii) dẫn đến việc dùng cột JSONB; yêu cầu (iv) dẫn đến cột</w:t>
-      </w:r>
-      <w:r>
-        <w:t xml:space="preserve"> </w:t>
+        <w:t xml:space="preserve">Lược đồ dữ liệu phải đồng thời thỏa mãn: (i) quan hệ nghiệp vụ chặt chẽ giữa người dùng – đơn vị – bài viết – chuyên mục – trang bố cục; (ii) văn bản hiển thị song ngữ trên hầu hết thực thể; (iii) bố cục trang là cây JSON tự do của Visual Builder; (iv) dấu vết nguồn gốc cho dữ liệu di trú để chạy lặp lại an toàn; (v) phạm vi bộ môn trên nội dung phục vụ phân quyền. Yêu cầu (i) dẫn đến mô hình quan hệ chuẩn hóa với khóa ngoại; các yêu cầu (ii) và (iii) dẫn đến việc dùng cột JSONB; yêu cầu (iv) dẫn đến cột khóa gốc duy nhất (</w:t>
       </w:r>
       <w:r>
         <w:rPr>
           <w:rStyle w:val="VerbatimChar"/>
         </w:rPr>
-        <w:t xml:space="preserve">legacyId Int? @unique</w:t>
-      </w:r>
-      <w:r>
-        <w:t xml:space="preserve"> </w:t>
-      </w:r>
-      <w:r>
-        <w:t xml:space="preserve">trên các thực thể di trú; yêu cầu (v) dẫn đến cột</w:t>
-      </w:r>
-      <w:r>
-        <w:t xml:space="preserve"> </w:t>
+        <w:t xml:space="preserve">legacyId</w:t>
+      </w:r>
+      <w:r>
+        <w:t xml:space="preserve">) trên các thực thể di trú; yêu cầu (v) dẫn đến cột nhãn bộ môn (</w:t>
       </w:r>
       <w:r>
         <w:rPr>
@@ -1633,10 +1471,7 @@
         <w:t xml:space="preserve">departmentId</w:t>
       </w:r>
       <w:r>
-        <w:t xml:space="preserve"> </w:t>
-      </w:r>
-      <w:r>
-        <w:t xml:space="preserve">trên ba thực thể nội dung (Post, PageLayout, Media).</w:t>
+        <w:t xml:space="preserve">) trên ba thực thể nội dung là bài viết, bố cục và phương tiện.</w:t>
       </w:r>
     </w:p>
     <w:bookmarkEnd w:id="44"/>
@@ -1654,22 +1489,7 @@
         <w:pStyle w:val="FirstParagraph"/>
       </w:pPr>
       <w:r>
-        <w:t xml:space="preserve">Lược đồ đầy đủ khai báo trong</w:t>
-      </w:r>
-      <w:r>
-        <w:t xml:space="preserve"> </w:t>
-      </w:r>
-      <w:r>
-        <w:rPr>
-          <w:rStyle w:val="VerbatimChar"/>
-        </w:rPr>
-        <w:t xml:space="preserve">backend/prisma/schema.prisma</w:t>
-      </w:r>
-      <w:r>
-        <w:t xml:space="preserve"> </w:t>
-      </w:r>
-      <w:r>
-        <w:t xml:space="preserve">gồm hơn 30 model; Hình 3.3 trình bày rút gọn các thực thể trung tâm và quan hệ giữa chúng. ERD đầy đủ được đưa vào Phụ lục.</w:t>
+        <w:t xml:space="preserve">Lược đồ đầy đủ được khai báo tập trung trong tệp lược đồ Prisma, gồm hơn 30 thực thể; Hình 3.3 trình bày rút gọn các thực thể trung tâm và quan hệ giữa chúng. ERD đầy đủ được đưa vào Phụ lục.</w:t>
       </w:r>
     </w:p>
     <w:p>
@@ -2704,7 +2524,7 @@
         <w:t xml:space="preserve">postslang</w:t>
       </w:r>
       <w:r>
-        <w:t xml:space="preserve">). Lựa chọn này dựa trên đặc điểm sử dụng: hệ thống chỉ có đúng hai ngôn ngữ cố định, mọi lượt đọc đều cần cả bản ghi, nên việc gộp hai ngôn ngữ vào một cột loại bỏ hoàn toàn phép JOIN dịch thuật trên mỗi truy vấn; đổi lại không thể đánh chỉ mục toàn văn theo từng ngôn ngữ — chấp nhận được vì tìm kiếm toàn văn không thuộc phạm vi. Phía giao diện, hàm trợ giúp</w:t>
+        <w:t xml:space="preserve">). Lựa chọn này dựa trên đặc điểm sử dụng: hệ thống chỉ có đúng hai ngôn ngữ cố định, mọi lượt đọc đều cần cả bản ghi, nên việc gộp hai ngôn ngữ vào một cột loại bỏ hoàn toàn phép kết nối bảng dịch trên mỗi truy vấn; đổi lại không thể đánh chỉ mục toàn văn theo từng ngôn ngữ — chấp nhận được vì tìm kiếm toàn văn không thuộc phạm vi. Phía giao diện, một hàm trợ giúp dùng chung chọn chuỗi theo ngôn ngữ hiện hành và tự lùi về tiếng Việt khi bản dịch tiếng Anh trống. Cây bố cục của Puck được lưu nguyên dạng trong cột</w:t>
       </w:r>
       <w:r>
         <w:t xml:space="preserve"> </w:t>
@@ -2713,82 +2533,10 @@
         <w:rPr>
           <w:rStyle w:val="VerbatimChar"/>
         </w:rPr>
-        <w:t xml:space="preserve">t(value, locale)</w:t>
-      </w:r>
-      <w:r>
-        <w:t xml:space="preserve"> </w:t>
-      </w:r>
-      <w:r>
-        <w:t xml:space="preserve">(trong</w:t>
-      </w:r>
-      <w:r>
-        <w:t xml:space="preserve"> </w:t>
-      </w:r>
-      <w:r>
-        <w:rPr>
-          <w:rStyle w:val="VerbatimChar"/>
-        </w:rPr>
-        <w:t xml:space="preserve">frontend/src/lib/i18n.ts</w:t>
-      </w:r>
-      <w:r>
-        <w:t xml:space="preserve">) chọn chuỗi theo ngôn ngữ hiện hành và tự lùi về tiếng Việt khi bản dịch tiếng Anh trống. Cây bố cục của Puck được lưu nguyên dạng trong</w:t>
-      </w:r>
-      <w:r>
-        <w:t xml:space="preserve"> </w:t>
-      </w:r>
-      <w:r>
-        <w:rPr>
-          <w:rStyle w:val="VerbatimChar"/>
-        </w:rPr>
         <w:t xml:space="preserve">puckData</w:t>
       </w:r>
       <w:r>
-        <w:t xml:space="preserve">: mỗi nút gồm</w:t>
-      </w:r>
-      <w:r>
-        <w:t xml:space="preserve"> </w:t>
-      </w:r>
-      <w:r>
-        <w:rPr>
-          <w:rStyle w:val="VerbatimChar"/>
-        </w:rPr>
-        <w:t xml:space="preserve">type</w:t>
-      </w:r>
-      <w:r>
-        <w:t xml:space="preserve"> </w:t>
-      </w:r>
-      <w:r>
-        <w:t xml:space="preserve">(tên component đã đăng ký) và</w:t>
-      </w:r>
-      <w:r>
-        <w:t xml:space="preserve"> </w:t>
-      </w:r>
-      <w:r>
-        <w:rPr>
-          <w:rStyle w:val="VerbatimChar"/>
-        </w:rPr>
-        <w:t xml:space="preserve">props</w:t>
-      </w:r>
-      <w:r>
-        <w:t xml:space="preserve"> </w:t>
-      </w:r>
-      <w:r>
-        <w:t xml:space="preserve">(thuộc tính), cùng các vùng thả</w:t>
-      </w:r>
-      <w:r>
-        <w:t xml:space="preserve"> </w:t>
-      </w:r>
-      <w:r>
-        <w:rPr>
-          <w:rStyle w:val="VerbatimChar"/>
-        </w:rPr>
-        <w:t xml:space="preserve">zones</w:t>
-      </w:r>
-      <w:r>
-        <w:t xml:space="preserve"> </w:t>
-      </w:r>
-      <w:r>
-        <w:t xml:space="preserve">— cấu trúc này là đầu vào của thuật toán chèn dữ liệu bài viết ở mục 3.5.2.</w:t>
+        <w:t xml:space="preserve">: mỗi nút ghi tên loại khối đã đăng ký cùng bộ thuộc tính của khối, và có thể chứa các vùng thả lồng nhau — cấu trúc này là đầu vào của thuật toán chèn dữ liệu bài viết ở mục 3.5.2.</w:t>
       </w:r>
     </w:p>
     <w:bookmarkEnd w:id="47"/>
@@ -2816,19 +2564,7 @@
         <w:pStyle w:val="FirstParagraph"/>
       </w:pPr>
       <w:r>
-        <w:t xml:space="preserve">Hệ thống định nghĩa hai vai trò trong enum</w:t>
-      </w:r>
-      <w:r>
-        <w:t xml:space="preserve"> </w:t>
-      </w:r>
-      <w:r>
-        <w:rPr>
-          <w:rStyle w:val="VerbatimChar"/>
-        </w:rPr>
-        <w:t xml:space="preserve">Role</w:t>
-      </w:r>
-      <w:r>
-        <w:t xml:space="preserve">:</w:t>
+        <w:t xml:space="preserve">Hệ thống định nghĩa hai vai trò:</w:t>
       </w:r>
       <w:r>
         <w:t xml:space="preserve"> </w:t>
@@ -2838,13 +2574,13 @@
           <w:b/>
           <w:bCs/>
         </w:rPr>
-        <w:t xml:space="preserve">SUPER_ADMIN</w:t>
-      </w:r>
-      <w:r>
-        <w:t xml:space="preserve"> </w:t>
-      </w:r>
-      <w:r>
-        <w:t xml:space="preserve">(quản trị viên cấp cao — quản lý tài khoản, thấy và thao tác mọi nội dung) và</w:t>
+        <w:t xml:space="preserve">quản trị viên cấp cao</w:t>
+      </w:r>
+      <w:r>
+        <w:t xml:space="preserve"> </w:t>
+      </w:r>
+      <w:r>
+        <w:t xml:space="preserve">(SUPER_ADMIN — quản lý tài khoản, thấy và thao tác mọi nội dung) và</w:t>
       </w:r>
       <w:r>
         <w:t xml:space="preserve"> </w:t>
@@ -2854,13 +2590,13 @@
           <w:b/>
           <w:bCs/>
         </w:rPr>
-        <w:t xml:space="preserve">ADMIN</w:t>
-      </w:r>
-      <w:r>
-        <w:t xml:space="preserve"> </w:t>
-      </w:r>
-      <w:r>
-        <w:t xml:space="preserve">(quản trị viên nội dung). Khảo sát hệ thống cũ cho thấy bộ bốn bảng phân quyền chi tiết (role/permission/permissiongroup/permissionrole) trên thực tế không được sử dụng đúng thiết kế; mô hình hai vai trò phẳng, bổ sung chiều phạm vi bộ môn (3.4.4), phản ánh đúng cách tổ chức thực của Khoa mà vẫn đơn giản để vận hành.</w:t>
+        <w:t xml:space="preserve">quản trị viên nội dung</w:t>
+      </w:r>
+      <w:r>
+        <w:t xml:space="preserve"> </w:t>
+      </w:r>
+      <w:r>
+        <w:t xml:space="preserve">(ADMIN). Khảo sát hệ thống cũ cho thấy bộ bốn bảng phân quyền chi tiết (role/permission/permissiongroup/permissionrole) trên thực tế không được sử dụng đúng thiết kế; mô hình hai vai trò phẳng, bổ sung chiều phạm vi bộ môn (3.4.4), phản ánh đúng cách tổ chức thực của Khoa mà vẫn đơn giản để vận hành.</w:t>
       </w:r>
     </w:p>
     <w:bookmarkEnd w:id="49"/>
@@ -2910,37 +2646,7 @@
         <w:t xml:space="preserve"> </w:t>
       </w:r>
       <w:r>
-        <w:t xml:space="preserve">thời gian sống dài dùng để cấp lại access token khi hết hạn. Payload của token gồm ba trường</w:t>
-      </w:r>
-      <w:r>
-        <w:t xml:space="preserve"> </w:t>
-      </w:r>
-      <w:r>
-        <w:rPr>
-          <w:rStyle w:val="VerbatimChar"/>
-        </w:rPr>
-        <w:t xml:space="preserve">{userId, roleName, departmentId}</w:t>
-      </w:r>
-      <w:r>
-        <w:t xml:space="preserve"> </w:t>
-      </w:r>
-      <w:r>
-        <w:t xml:space="preserve">— đủ để mọi quyết định phân quyền diễn ra ngay tại tầng API mà không cần truy vấn thêm người dùng. Quy trình đăng nhập được minh họa trong Hình 3.4. Ngoài đăng nhập bằng mật khẩu (băm bcrypt), hệ thống hỗ trợ đăng nhập Google OAuth cho tài khoản đã liên kết và luồng quên mật khẩu bằng mã OTP gửi qua email. Mỗi lần đăng nhập cập nhật</w:t>
-      </w:r>
-      <w:r>
-        <w:t xml:space="preserve"> </w:t>
-      </w:r>
-      <w:r>
-        <w:rPr>
-          <w:rStyle w:val="VerbatimChar"/>
-        </w:rPr>
-        <w:t xml:space="preserve">lastLoginAt</w:t>
-      </w:r>
-      <w:r>
-        <w:t xml:space="preserve"> </w:t>
-      </w:r>
-      <w:r>
-        <w:t xml:space="preserve">phục vụ thống kê</w:t>
+        <w:t xml:space="preserve">thời gian sống dài dùng để cấp lại access token khi hết hạn. Phần tải của mã thông báo gồm ba thông tin — định danh người dùng, vai trò và bộ môn trực thuộc — đủ để mọi quyết định phân quyền diễn ra ngay tại tầng API mà không cần truy vấn thêm hồ sơ người dùng. Quy trình đăng nhập được minh họa trong Hình 3.4. Ngoài đăng nhập bằng mật khẩu (băm bcrypt), hệ thống hỗ trợ đăng nhập Google OAuth cho tài khoản đã liên kết và luồng quên mật khẩu bằng mã OTP gửi qua email. Mỗi lần đăng nhập, hệ thống ghi nhận thời điểm truy cập gần nhất phục vụ thống kê</w:t>
       </w:r>
       <w:r>
         <w:t xml:space="preserve"> </w:t>
@@ -2990,94 +2696,7 @@
         <w:pStyle w:val="FirstParagraph"/>
       </w:pPr>
       <w:r>
-        <w:t xml:space="preserve">Phân quyền theo vai trò hiện thực bằng cặp guard của NestJS:</w:t>
-      </w:r>
-      <w:r>
-        <w:t xml:space="preserve"> </w:t>
-      </w:r>
-      <w:r>
-        <w:rPr>
-          <w:rStyle w:val="VerbatimChar"/>
-        </w:rPr>
-        <w:t xml:space="preserve">AuthGuard</w:t>
-      </w:r>
-      <w:r>
-        <w:t xml:space="preserve"> </w:t>
-      </w:r>
-      <w:r>
-        <w:t xml:space="preserve">giải mã JWT, gắn danh tính vào ngữ cảnh yêu cầu;</w:t>
-      </w:r>
-      <w:r>
-        <w:t xml:space="preserve"> </w:t>
-      </w:r>
-      <w:r>
-        <w:rPr>
-          <w:rStyle w:val="VerbatimChar"/>
-        </w:rPr>
-        <w:t xml:space="preserve">RolesGuard</w:t>
-      </w:r>
-      <w:r>
-        <w:t xml:space="preserve"> </w:t>
-      </w:r>
-      <w:r>
-        <w:t xml:space="preserve">đối chiếu vai trò với khai báo</w:t>
-      </w:r>
-      <w:r>
-        <w:t xml:space="preserve"> </w:t>
-      </w:r>
-      <w:r>
-        <w:rPr>
-          <w:rStyle w:val="VerbatimChar"/>
-        </w:rPr>
-        <w:t xml:space="preserve">@Roles()</w:t>
-      </w:r>
-      <w:r>
-        <w:t xml:space="preserve"> </w:t>
-      </w:r>
-      <w:r>
-        <w:t xml:space="preserve">trên controller hoặc từng endpoint. Ví dụ toàn bộ module quản lý quản trị viên khai báo</w:t>
-      </w:r>
-      <w:r>
-        <w:t xml:space="preserve"> </w:t>
-      </w:r>
-      <w:r>
-        <w:rPr>
-          <w:rStyle w:val="VerbatimChar"/>
-        </w:rPr>
-        <w:t xml:space="preserve">@Roles(SuperAdmin)</w:t>
-      </w:r>
-      <w:r>
-        <w:t xml:space="preserve"> </w:t>
-      </w:r>
-      <w:r>
-        <w:t xml:space="preserve">ở cấp lớp — mọi endpoint bên trong tự động từ chối vai trò ADMIN. Decorator</w:t>
-      </w:r>
-      <w:r>
-        <w:t xml:space="preserve"> </w:t>
-      </w:r>
-      <w:r>
-        <w:rPr>
-          <w:rStyle w:val="VerbatimChar"/>
-        </w:rPr>
-        <w:t xml:space="preserve">@ActiveUser()</w:t>
-      </w:r>
-      <w:r>
-        <w:t xml:space="preserve"> </w:t>
-      </w:r>
-      <w:r>
-        <w:t xml:space="preserve">trích từng trường danh tính (như</w:t>
-      </w:r>
-      <w:r>
-        <w:t xml:space="preserve"> </w:t>
-      </w:r>
-      <w:r>
-        <w:rPr>
-          <w:rStyle w:val="VerbatimChar"/>
-        </w:rPr>
-        <w:t xml:space="preserve">departmentId</w:t>
-      </w:r>
-      <w:r>
-        <w:t xml:space="preserve">) truyền thẳng vào service, giữ chữ ký hàm tường minh và dễ kiểm thử.</w:t>
+        <w:t xml:space="preserve">Phân quyền theo vai trò hiện thực bằng cặp lớp chốt chặn (guard) của NestJS: chốt xác thực giải mã JWT và gắn danh tính vào ngữ cảnh yêu cầu; chốt vai trò đối chiếu vai trò của người gọi với khai báo quyền gắn trên từng nhóm điểm cuối API. Ví dụ toàn bộ phân hệ quản lý quản trị viên khai báo quyền quản trị viên cấp cao ở mức toàn phân hệ — mọi điểm cuối bên trong tự động từ chối vai trò quản trị viên thường. Các thông tin danh tính cần cho nghiệp vụ (như bộ môn trực thuộc) được trích sẵn và truyền tường minh vào tầng dịch vụ, giúp từng hàm nghiệp vụ dễ kiểm thử độc lập.</w:t>
       </w:r>
     </w:p>
     <w:bookmarkEnd w:id="51"/>
@@ -3095,79 +2714,7 @@
         <w:pStyle w:val="FirstParagraph"/>
       </w:pPr>
       <w:r>
-        <w:t xml:space="preserve">Chiều phân quyền thứ hai — phạm vi bộ môn — biến hệ thống thành mô hình nhiều đơn vị thuê chung (multi-tenant) mềm: nội dung (Post, PageLayout, Media) mang nhãn</w:t>
-      </w:r>
-      <w:r>
-        <w:t xml:space="preserve"> </w:t>
-      </w:r>
-      <w:r>
-        <w:rPr>
-          <w:rStyle w:val="VerbatimChar"/>
-        </w:rPr>
-        <w:t xml:space="preserve">departmentId</w:t>
-      </w:r>
-      <w:r>
-        <w:t xml:space="preserve">, và người dùng ADMIN thuộc một bộ môn chỉ thao tác trong phạm vi của mình. Toàn bộ quy tắc được cài đặt tập trung trong ba hàm thuần túy tại</w:t>
-      </w:r>
-      <w:r>
-        <w:t xml:space="preserve"> </w:t>
-      </w:r>
-      <w:r>
-        <w:rPr>
-          <w:rStyle w:val="VerbatimChar"/>
-        </w:rPr>
-        <w:t xml:space="preserve">backend/src/shared/helpers.ts</w:t>
-      </w:r>
-      <w:r>
-        <w:t xml:space="preserve">. Hàm thứ nhất,</w:t>
-      </w:r>
-      <w:r>
-        <w:t xml:space="preserve"> </w:t>
-      </w:r>
-      <w:r>
-        <w:rPr>
-          <w:rStyle w:val="VerbatimChar"/>
-        </w:rPr>
-        <w:t xml:space="preserve">departmentScopeWhere(role, deptId)</w:t>
-      </w:r>
-      <w:r>
-        <w:t xml:space="preserve">, sinh mảnh điều kiện Prisma cho các truy vấn đọc và liệt kê: SUPER_ADMIN không bị giới hạn; quản trị viên văn phòng khoa (bộ môn</w:t>
-      </w:r>
-      <w:r>
-        <w:t xml:space="preserve"> </w:t>
-      </w:r>
-      <w:r>
-        <w:rPr>
-          <w:rStyle w:val="VerbatimChar"/>
-        </w:rPr>
-        <w:t xml:space="preserve">dept_legacy_1</w:t>
-      </w:r>
-      <w:r>
-        <w:t xml:space="preserve">) hoặc chưa gán bộ môn thấy nội dung toàn khoa cùng nội dung chưa gắn nhãn; quản trị viên bộ môn chỉ thấy nội dung của bộ môn mình. Hàm thứ hai,</w:t>
-      </w:r>
-      <w:r>
-        <w:t xml:space="preserve"> </w:t>
-      </w:r>
-      <w:r>
-        <w:rPr>
-          <w:rStyle w:val="VerbatimChar"/>
-        </w:rPr>
-        <w:t xml:space="preserve">mediaScopeWhere(role, deptId)</w:t>
-      </w:r>
-      <w:r>
-        <w:t xml:space="preserve">, là biến thể dành cho thư viện phương tiện: quản trị viên bộ môn được đọc thêm tư liệu dùng chung của khoa để chèn vào bài viết, nhưng chỉ sửa hoặc xóa được tư liệu thuộc bộ môn mình. Hàm thứ ba,</w:t>
-      </w:r>
-      <w:r>
-        <w:t xml:space="preserve"> </w:t>
-      </w:r>
-      <w:r>
-        <w:rPr>
-          <w:rStyle w:val="VerbatimChar"/>
-        </w:rPr>
-        <w:t xml:space="preserve">canAccessDepartment(role, userDept, contentDept)</w:t>
-      </w:r>
-      <w:r>
-        <w:t xml:space="preserve">, là cổng kiểm tra cho mọi thao tác ghi; yêu cầu vi phạm nhận phản hồi 404 thay vì 403 nhằm không tiết lộ sự tồn tại của tài nguyên khác bộ môn. Ma trận quyền tổng hợp trong Bảng 3.3.</w:t>
+        <w:t xml:space="preserve">Chiều phân quyền thứ hai — phạm vi bộ môn — biến hệ thống thành mô hình nhiều đơn vị thuê chung (multi-tenant) mềm: cả ba loại nội dung (bài viết, bố cục, phương tiện) đều mang nhãn bộ môn, và quản trị viên thuộc một bộ môn chỉ thao tác trong phạm vi của mình. Toàn bộ quy tắc được cài đặt tập trung trong ba hàm thuần túy thuộc phân hệ dùng chung của máy chủ API. Hàm thứ nhất sinh điều kiện lọc cho các truy vấn đọc và liệt kê: quản trị viên cấp cao không bị giới hạn; quản trị viên văn phòng khoa hoặc chưa gán bộ môn thấy nội dung toàn khoa cùng nội dung chưa gắn nhãn; quản trị viên bộ môn chỉ thấy nội dung của bộ môn mình. Hàm thứ hai là biến thể dành cho thư viện phương tiện: quản trị viên bộ môn được đọc thêm tư liệu dùng chung của khoa để chèn vào bài viết, nhưng chỉ sửa hoặc xóa được tư liệu thuộc bộ môn mình. Hàm thứ ba là cổng kiểm tra cho mọi thao tác ghi; yêu cầu vi phạm nhận phản hồi 404 thay vì 403 nhằm không tiết lộ sự tồn tại của tài nguyên khác bộ môn. Ma trận quyền tổng hợp trong Bảng 3.3.</w:t>
       </w:r>
     </w:p>
     <w:p>
@@ -3433,40 +2980,7 @@
         <w:pStyle w:val="BodyText"/>
       </w:pPr>
       <w:r>
-        <w:t xml:space="preserve">Việc dồn quy tắc vào các hàm thuần túy (không phụ thuộc cơ sở dữ liệu) cho phép kiểm thử đơn vị trực tiếp từng nhánh logic; bộ kiểm thử phân quyền thuộc 40 ca kiểm thử backend trình bày ở Chương 4. Ở tầng URL công khai, nội dung bộ môn mang tiền tố slug bộ môn (</w:t>
-      </w:r>
-      <w:r>
-        <w:rPr>
-          <w:rStyle w:val="VerbatimChar"/>
-        </w:rPr>
-        <w:t xml:space="preserve">/vat-ly-ung-dung/tin-tuc/…</w:t>
-      </w:r>
-      <w:r>
-        <w:t xml:space="preserve">), nội dung toàn khoa giữ đường dẫn phẳng (</w:t>
-      </w:r>
-      <w:r>
-        <w:rPr>
-          <w:rStyle w:val="VerbatimChar"/>
-        </w:rPr>
-        <w:t xml:space="preserve">/tin-tuc/…</w:t>
-      </w:r>
-      <w:r>
-        <w:t xml:space="preserve">); mỗi bộ môn có trang riêng tại</w:t>
-      </w:r>
-      <w:r>
-        <w:t xml:space="preserve"> </w:t>
-      </w:r>
-      <w:r>
-        <w:rPr>
-          <w:rStyle w:val="VerbatimChar"/>
-        </w:rPr>
-        <w:t xml:space="preserve">/&lt;slug-bộ-môn&gt;</w:t>
-      </w:r>
-      <w:r>
-        <w:t xml:space="preserve"> </w:t>
-      </w:r>
-      <w:r>
-        <w:t xml:space="preserve">do chính bộ môn đó biên tập.</w:t>
+        <w:t xml:space="preserve">Việc dồn quy tắc vào các hàm thuần túy (không phụ thuộc cơ sở dữ liệu) cho phép kiểm thử đơn vị trực tiếp từng nhánh logic; bộ kiểm thử phân quyền thuộc 40 ca kiểm thử backend trình bày ở Chương 4. Ở tầng URL công khai, nội dung bộ môn mang tiền tố tên bộ môn trên đường dẫn (chẳng hạn /vat-ly-ung-dung/tin-tuc/…), nội dung toàn khoa giữ đường dẫn phẳng (/tin-tuc/…); mỗi bộ môn có trang riêng tại địa chỉ mang tên mình do chính bộ môn đó biên tập.</w:t>
       </w:r>
     </w:p>
     <w:bookmarkEnd w:id="52"/>
@@ -3494,19 +3008,7 @@
         <w:pStyle w:val="FirstParagraph"/>
       </w:pPr>
       <w:r>
-        <w:t xml:space="preserve">Bài viết tuân theo máy trạng thái năm trạng thái (enum</w:t>
-      </w:r>
-      <w:r>
-        <w:t xml:space="preserve"> </w:t>
-      </w:r>
-      <w:r>
-        <w:rPr>
-          <w:rStyle w:val="VerbatimChar"/>
-        </w:rPr>
-        <w:t xml:space="preserve">ContentStatus</w:t>
-      </w:r>
-      <w:r>
-        <w:t xml:space="preserve">):</w:t>
+        <w:t xml:space="preserve">Bài viết tuân theo máy trạng thái gồm năm trạng thái:</w:t>
       </w:r>
       <w:r>
         <w:t xml:space="preserve"> </w:t>
@@ -3516,13 +3018,13 @@
           <w:b/>
           <w:bCs/>
         </w:rPr>
-        <w:t xml:space="preserve">DRAFT</w:t>
-      </w:r>
-      <w:r>
-        <w:t xml:space="preserve"> </w:t>
-      </w:r>
-      <w:r>
-        <w:t xml:space="preserve">(nháp) →</w:t>
+        <w:t xml:space="preserve">nháp</w:t>
+      </w:r>
+      <w:r>
+        <w:t xml:space="preserve"> </w:t>
+      </w:r>
+      <w:r>
+        <w:t xml:space="preserve">(DRAFT) →</w:t>
       </w:r>
       <w:r>
         <w:t xml:space="preserve"> </w:t>
@@ -3532,13 +3034,13 @@
           <w:b/>
           <w:bCs/>
         </w:rPr>
-        <w:t xml:space="preserve">PENDING</w:t>
-      </w:r>
-      <w:r>
-        <w:t xml:space="preserve"> </w:t>
-      </w:r>
-      <w:r>
-        <w:t xml:space="preserve">(chờ duyệt) →</w:t>
+        <w:t xml:space="preserve">chờ duyệt</w:t>
+      </w:r>
+      <w:r>
+        <w:t xml:space="preserve"> </w:t>
+      </w:r>
+      <w:r>
+        <w:t xml:space="preserve">(PENDING) →</w:t>
       </w:r>
       <w:r>
         <w:t xml:space="preserve"> </w:t>
@@ -3548,13 +3050,13 @@
           <w:b/>
           <w:bCs/>
         </w:rPr>
-        <w:t xml:space="preserve">PUBLISHED</w:t>
-      </w:r>
-      <w:r>
-        <w:t xml:space="preserve"> </w:t>
-      </w:r>
-      <w:r>
-        <w:t xml:space="preserve">(đã xuất bản), với hai nhánh</w:t>
+        <w:t xml:space="preserve">đã xuất bản</w:t>
+      </w:r>
+      <w:r>
+        <w:t xml:space="preserve"> </w:t>
+      </w:r>
+      <w:r>
+        <w:t xml:space="preserve">(PUBLISHED), với hai nhánh</w:t>
       </w:r>
       <w:r>
         <w:t xml:space="preserve"> </w:t>
@@ -3564,13 +3066,13 @@
           <w:b/>
           <w:bCs/>
         </w:rPr>
-        <w:t xml:space="preserve">SCHEDULED</w:t>
-      </w:r>
-      <w:r>
-        <w:t xml:space="preserve"> </w:t>
-      </w:r>
-      <w:r>
-        <w:t xml:space="preserve">(đã lên lịch, tự chuyển sang PUBLISHED khi đến hạn) và</w:t>
+        <w:t xml:space="preserve">đã lên lịch</w:t>
+      </w:r>
+      <w:r>
+        <w:t xml:space="preserve"> </w:t>
+      </w:r>
+      <w:r>
+        <w:t xml:space="preserve">(SCHEDULED — tự chuyển sang đã xuất bản khi đến hạn) và</w:t>
       </w:r>
       <w:r>
         <w:t xml:space="preserve"> </w:t>
@@ -3580,13 +3082,13 @@
           <w:b/>
           <w:bCs/>
         </w:rPr>
-        <w:t xml:space="preserve">REJECTED</w:t>
-      </w:r>
-      <w:r>
-        <w:t xml:space="preserve"> </w:t>
-      </w:r>
-      <w:r>
-        <w:t xml:space="preserve">(bị từ chối, kèm lý do). Sơ đồ chuyển trạng thái được minh họa trong Hình 3.5.</w:t>
+        <w:t xml:space="preserve">bị từ chối</w:t>
+      </w:r>
+      <w:r>
+        <w:t xml:space="preserve"> </w:t>
+      </w:r>
+      <w:r>
+        <w:t xml:space="preserve">(REJECTED — kèm lý do). Sơ đồ chuyển trạng thái được minh họa trong Hình 3.5.</w:t>
       </w:r>
     </w:p>
     <w:p>
@@ -3665,205 +3167,7 @@
         <w:t xml:space="preserve"> </w:t>
       </w:r>
       <w:r>
-        <w:t xml:space="preserve">vào một bố cục mẫu. Khi biên tập viên chọn xuất bản bài viết theo mẫu, endpoint</w:t>
-      </w:r>
-      <w:r>
-        <w:t xml:space="preserve"> </w:t>
-      </w:r>
-      <w:r>
-        <w:rPr>
-          <w:rStyle w:val="VerbatimChar"/>
-        </w:rPr>
-        <w:t xml:space="preserve">POST /posts/:id/clone-into-layout</w:t>
-      </w:r>
-      <w:r>
-        <w:t xml:space="preserve"> </w:t>
-      </w:r>
-      <w:r>
-        <w:t xml:space="preserve">thực hiện: (1) đọc bố cục mẫu (một</w:t>
-      </w:r>
-      <w:r>
-        <w:t xml:space="preserve"> </w:t>
-      </w:r>
-      <w:r>
-        <w:rPr>
-          <w:rStyle w:val="VerbatimChar"/>
-        </w:rPr>
-        <w:t xml:space="preserve">PageLayout</w:t>
-      </w:r>
-      <w:r>
-        <w:t xml:space="preserve"> </w:t>
-      </w:r>
-      <w:r>
-        <w:t xml:space="preserve">chứa các khối giữ chỗ); (2) sao chép sâu cây</w:t>
-      </w:r>
-      <w:r>
-        <w:t xml:space="preserve"> </w:t>
-      </w:r>
-      <w:r>
-        <w:rPr>
-          <w:rStyle w:val="VerbatimChar"/>
-        </w:rPr>
-        <w:t xml:space="preserve">puckData</w:t>
-      </w:r>
-      <w:r>
-        <w:t xml:space="preserve"> </w:t>
-      </w:r>
-      <w:r>
-        <w:t xml:space="preserve">của mẫu; (3) duyệt đệ quy toàn bộ cây — kể cả các vùng</w:t>
-      </w:r>
-      <w:r>
-        <w:t xml:space="preserve"> </w:t>
-      </w:r>
-      <w:r>
-        <w:rPr>
-          <w:rStyle w:val="VerbatimChar"/>
-        </w:rPr>
-        <w:t xml:space="preserve">zones</w:t>
-      </w:r>
-      <w:r>
-        <w:t xml:space="preserve"> </w:t>
-      </w:r>
-      <w:r>
-        <w:t xml:space="preserve">lồng nhau — và thay thuộc tính của sáu loại khối giữ chỗ (</w:t>
-      </w:r>
-      <w:r>
-        <w:rPr>
-          <w:rStyle w:val="VerbatimChar"/>
-        </w:rPr>
-        <w:t xml:space="preserve">PostTitle</w:t>
-      </w:r>
-      <w:r>
-        <w:t xml:space="preserve">,</w:t>
-      </w:r>
-      <w:r>
-        <w:t xml:space="preserve"> </w:t>
-      </w:r>
-      <w:r>
-        <w:rPr>
-          <w:rStyle w:val="VerbatimChar"/>
-        </w:rPr>
-        <w:t xml:space="preserve">PostBody</w:t>
-      </w:r>
-      <w:r>
-        <w:t xml:space="preserve">,</w:t>
-      </w:r>
-      <w:r>
-        <w:t xml:space="preserve"> </w:t>
-      </w:r>
-      <w:r>
-        <w:rPr>
-          <w:rStyle w:val="VerbatimChar"/>
-        </w:rPr>
-        <w:t xml:space="preserve">PostCoverImage</w:t>
-      </w:r>
-      <w:r>
-        <w:t xml:space="preserve">,</w:t>
-      </w:r>
-      <w:r>
-        <w:t xml:space="preserve"> </w:t>
-      </w:r>
-      <w:r>
-        <w:rPr>
-          <w:rStyle w:val="VerbatimChar"/>
-        </w:rPr>
-        <w:t xml:space="preserve">PostTagList</w:t>
-      </w:r>
-      <w:r>
-        <w:t xml:space="preserve">,</w:t>
-      </w:r>
-      <w:r>
-        <w:t xml:space="preserve"> </w:t>
-      </w:r>
-      <w:r>
-        <w:rPr>
-          <w:rStyle w:val="VerbatimChar"/>
-        </w:rPr>
-        <w:t xml:space="preserve">PostEventInfo</w:t>
-      </w:r>
-      <w:r>
-        <w:t xml:space="preserve">,</w:t>
-      </w:r>
-      <w:r>
-        <w:t xml:space="preserve"> </w:t>
-      </w:r>
-      <w:r>
-        <w:rPr>
-          <w:rStyle w:val="VerbatimChar"/>
-        </w:rPr>
-        <w:t xml:space="preserve">PostHeader</w:t>
-      </w:r>
-      <w:r>
-        <w:t xml:space="preserve">) bằng dữ liệu thật của bài viết; (4) lưu kết quả thành một</w:t>
-      </w:r>
-      <w:r>
-        <w:t xml:space="preserve"> </w:t>
-      </w:r>
-      <w:r>
-        <w:rPr>
-          <w:rStyle w:val="VerbatimChar"/>
-        </w:rPr>
-        <w:t xml:space="preserve">PageLayout</w:t>
-      </w:r>
-      <w:r>
-        <w:t xml:space="preserve"> </w:t>
-      </w:r>
-      <w:r>
-        <w:t xml:space="preserve">nháp mới, gắn</w:t>
-      </w:r>
-      <w:r>
-        <w:t xml:space="preserve"> </w:t>
-      </w:r>
-      <w:r>
-        <w:rPr>
-          <w:rStyle w:val="VerbatimChar"/>
-        </w:rPr>
-        <w:t xml:space="preserve">sourcePostId</w:t>
-      </w:r>
-      <w:r>
-        <w:t xml:space="preserve"> </w:t>
-      </w:r>
-      <w:r>
-        <w:t xml:space="preserve">trỏ về bài viết gốc. Thuật toán duyệt – chèn hiện thực trong hàm thuần túy</w:t>
-      </w:r>
-      <w:r>
-        <w:t xml:space="preserve"> </w:t>
-      </w:r>
-      <w:r>
-        <w:rPr>
-          <w:rStyle w:val="VerbatimChar"/>
-        </w:rPr>
-        <w:t xml:space="preserve">injectPostIntoPuckData</w:t>
-      </w:r>
-      <w:r>
-        <w:t xml:space="preserve"> </w:t>
-      </w:r>
-      <w:r>
-        <w:t xml:space="preserve">(</w:t>
-      </w:r>
-      <w:r>
-        <w:rPr>
-          <w:rStyle w:val="VerbatimChar"/>
-        </w:rPr>
-        <w:t xml:space="preserve">backend/src/post/puck-inject.ts</w:t>
-      </w:r>
-      <w:r>
-        <w:t xml:space="preserve">), mỗi khối sau khi chèn được đánh dấu</w:t>
-      </w:r>
-      <w:r>
-        <w:t xml:space="preserve"> </w:t>
-      </w:r>
-      <w:r>
-        <w:rPr>
-          <w:rStyle w:val="VerbatimChar"/>
-        </w:rPr>
-        <w:t xml:space="preserve">injected: true</w:t>
-      </w:r>
-      <w:r>
-        <w:t xml:space="preserve"> </w:t>
-      </w:r>
-      <w:r>
-        <w:t xml:space="preserve">để lần đồng bộ sau nhận diện. Toàn bộ luồng được minh họa trong Hình 3.6.</w:t>
+        <w:t xml:space="preserve">vào một bố cục mẫu. Khi biên tập viên chọn xuất bản bài viết theo mẫu, một điểm cuối API chuyên trách thực hiện bốn bước: đọc bố cục mẫu chứa các khối giữ chỗ; sao chép sâu cây bố cục của mẫu; duyệt đệ quy toàn bộ cây — kể cả các vùng thả lồng nhau — và thay thuộc tính của sáu loại khối giữ chỗ (tiêu đề, thân bài, ảnh bìa, danh sách thẻ, thông tin sự kiện và đầu trang bài viết) bằng dữ liệu thật của bài viết; cuối cùng lưu kết quả thành một bố cục nháp mới kèm liên kết trỏ về bài viết gốc. Thuật toán duyệt – chèn được hiện thực dưới dạng một hàm thuần túy, và mỗi khối sau khi chèn được đánh dấu để lần đồng bộ sau nhận diện. Toàn bộ luồng được minh họa trong Hình 3.6.</w:t>
       </w:r>
     </w:p>
     <w:p>
@@ -3978,91 +3282,7 @@
         <w:t xml:space="preserve"> </w:t>
       </w:r>
       <w:r>
-        <w:t xml:space="preserve">đã rót vào bố cục. Hàm</w:t>
-      </w:r>
-      <w:r>
-        <w:t xml:space="preserve"> </w:t>
-      </w:r>
-      <w:r>
-        <w:rPr>
-          <w:rStyle w:val="VerbatimChar"/>
-        </w:rPr>
-        <w:t xml:space="preserve">syncAttachedLayouts()</w:t>
-      </w:r>
-      <w:r>
-        <w:t xml:space="preserve"> </w:t>
-      </w:r>
-      <w:r>
-        <w:t xml:space="preserve">trong Post service giải quyết: mỗi lần bài viết được cập nhật, hệ thống tìm mọi</w:t>
-      </w:r>
-      <w:r>
-        <w:t xml:space="preserve"> </w:t>
-      </w:r>
-      <w:r>
-        <w:rPr>
-          <w:rStyle w:val="VerbatimChar"/>
-        </w:rPr>
-        <w:t xml:space="preserve">PageLayout</w:t>
-      </w:r>
-      <w:r>
-        <w:t xml:space="preserve"> </w:t>
-      </w:r>
-      <w:r>
-        <w:t xml:space="preserve">có</w:t>
-      </w:r>
-      <w:r>
-        <w:t xml:space="preserve"> </w:t>
-      </w:r>
-      <w:r>
-        <w:rPr>
-          <w:rStyle w:val="VerbatimChar"/>
-        </w:rPr>
-        <w:t xml:space="preserve">sourcePostId</w:t>
-      </w:r>
-      <w:r>
-        <w:t xml:space="preserve"> </w:t>
-      </w:r>
-      <w:r>
-        <w:t xml:space="preserve">trùng và chạy lại phép chèn trên từng bố cục, làm mới các khối đã đánh dấu</w:t>
-      </w:r>
-      <w:r>
-        <w:t xml:space="preserve"> </w:t>
-      </w:r>
-      <w:r>
-        <w:rPr>
-          <w:rStyle w:val="VerbatimChar"/>
-        </w:rPr>
-        <w:t xml:space="preserve">injected</w:t>
-      </w:r>
-      <w:r>
-        <w:t xml:space="preserve">. Chiều ngược lại, khi xuất bản một bố cục, ảnh chụp</w:t>
-      </w:r>
-      <w:r>
-        <w:t xml:space="preserve"> </w:t>
-      </w:r>
-      <w:r>
-        <w:rPr>
-          <w:rStyle w:val="VerbatimChar"/>
-        </w:rPr>
-        <w:t xml:space="preserve">puckData → publishedPuckData</w:t>
-      </w:r>
-      <w:r>
-        <w:t xml:space="preserve"> </w:t>
-      </w:r>
-      <w:r>
-        <w:t xml:space="preserve">bảo đảm trang công khai chỉ thay đổi tại thời điểm xuất bản — biên tập dở dang không bao giờ lộ ra ngoài. Đồng thời, mỗi lần xuất bản ghi một bản ghi</w:t>
-      </w:r>
-      <w:r>
-        <w:t xml:space="preserve"> </w:t>
-      </w:r>
-      <w:r>
-        <w:rPr>
-          <w:rStyle w:val="VerbatimChar"/>
-        </w:rPr>
-        <w:t xml:space="preserve">PageLayoutVersion</w:t>
-      </w:r>
-      <w:r>
-        <w:t xml:space="preserve">: phiên bản mới mang trạng thái CURRENT, phiên bản trước tự chuyển ARCHIVED. Biên tập viên xem lại lịch sử, so sánh hai phiên bản dạng JSON song song và khôi phục theo hai chế độ — về bản nháp để sửa tiếp, hoặc xuất bản lại ngay (khôi phục kiểm tra xung đột slug trước khi ghi).</w:t>
+        <w:t xml:space="preserve">đã rót vào bố cục. Cơ chế đồng bộ trong phân hệ bài viết giải quyết việc này: mỗi lần bài viết được cập nhật, hệ thống tìm mọi bố cục có liên kết nguồn trỏ về bài viết đó và chạy lại phép chèn trên từng bố cục, làm mới các khối đã đánh dấu chèn. Chiều ngược lại, khi xuất bản một bố cục, thao tác chụp bản nháp sang bản công khai bảo đảm trang công khai chỉ thay đổi tại thời điểm xuất bản — biên tập dở dang không bao giờ lộ ra ngoài. Đồng thời, mỗi lần xuất bản ghi thêm một bản ghi vào lịch sử phiên bản: phiên bản mới mang trạng thái hiện hành, phiên bản trước tự chuyển sang lưu trữ. Biên tập viên xem lại lịch sử, so sánh hai phiên bản song song và khôi phục theo hai chế độ — về bản nháp để sửa tiếp, hoặc xuất bản lại ngay; thao tác khôi phục kiểm tra xung đột đường dẫn trước khi ghi.</w:t>
       </w:r>
     </w:p>
     <w:bookmarkEnd w:id="56"/>
@@ -4080,43 +3300,7 @@
         <w:pStyle w:val="FirstParagraph"/>
       </w:pPr>
       <w:r>
-        <w:t xml:space="preserve">Bài viết và bố cục đều có thể hẹn thời điểm công bố qua trường</w:t>
-      </w:r>
-      <w:r>
-        <w:t xml:space="preserve"> </w:t>
-      </w:r>
-      <w:r>
-        <w:rPr>
-          <w:rStyle w:val="VerbatimChar"/>
-        </w:rPr>
-        <w:t xml:space="preserve">scheduledAt</w:t>
-      </w:r>
-      <w:r>
-        <w:t xml:space="preserve">. Một cron chạy mỗi phút trong tiến trình NestJS quét các bản ghi SCHEDULED đến hạn và thực hiện đúng thủ tục xuất bản đầy đủ — chụp ảnh</w:t>
-      </w:r>
-      <w:r>
-        <w:t xml:space="preserve"> </w:t>
-      </w:r>
-      <w:r>
-        <w:rPr>
-          <w:rStyle w:val="VerbatimChar"/>
-        </w:rPr>
-        <w:t xml:space="preserve">publishedPuckData</w:t>
-      </w:r>
-      <w:r>
-        <w:t xml:space="preserve">, ghi</w:t>
-      </w:r>
-      <w:r>
-        <w:t xml:space="preserve"> </w:t>
-      </w:r>
-      <w:r>
-        <w:rPr>
-          <w:rStyle w:val="VerbatimChar"/>
-        </w:rPr>
-        <w:t xml:space="preserve">PageLayoutVersion</w:t>
-      </w:r>
-      <w:r>
-        <w:t xml:space="preserve">, xóa khóa đệm Redis và gọi revalidate trang công khai — bảo đảm xuất bản theo lịch không đi tắt bất kỳ bước nào so với xuất bản thủ công.</w:t>
+        <w:t xml:space="preserve">Bài viết và bố cục đều có thể hẹn thời điểm công bố. Một tác vụ định kỳ chạy mỗi phút trong tiến trình máy chủ quét các bản ghi đã lên lịch đến hạn và thực hiện đúng thủ tục xuất bản đầy đủ — chụp bản công khai, ghi bản ghi phiên bản, xóa khóa đệm Redis và phát tín hiệu làm mới trang công khai — bảo đảm xuất bản theo lịch không đi tắt bất kỳ bước nào so với xuất bản thủ công.</w:t>
       </w:r>
     </w:p>
     <w:bookmarkEnd w:id="57"/>
@@ -4190,70 +3374,26 @@
         <w:pStyle w:val="BodyText"/>
       </w:pPr>
       <w:r>
-        <w:t xml:space="preserve">Màn hình thứ nhất là trình soạn bài viết: các trường song ngữ trình bày theo hai thẻ VI/EN, chuyên mục và thẻ chọn từ dữ liệu động, ảnh bìa chọn từ thư viện phương tiện, bài loại sự kiện có thêm khối thông tin thời gian – địa điểm – diễn giả, và nút lưu tách thành ba hành động lưu nháp, lên lịch hoặc gửi xuất bản. Màn hình thứ hai là Visual Builder — trình dàn trang Puck toàn màn hình với danh mục khối bên trái (khối nội dung, khối tự động như tin mới nhất hay sự kiện sắp tới, khối điều hướng), khung xem trước ở giữa và bảng thuộc tính bên phải; lịch sử phiên bản bố cục truy cập được từ chính trình soạn thảo. Màn hình thứ ba là lớp hướng dẫn tương tác: ở lần đăng nhập đầu, hệ thống tự chạy tour giới thiệu từng phân hệ (xây dựng trên thư viện driver.js), trạng thái hoàn thành lưu trên hồ sơ người dùng qua trường</w:t>
-      </w:r>
-      <w:r>
-        <w:t xml:space="preserve"> </w:t>
-      </w:r>
-      <w:r>
-        <w:rPr>
-          <w:rStyle w:val="VerbatimChar"/>
-        </w:rPr>
-        <w:t xml:space="preserve">tourCompletedAt</w:t>
-      </w:r>
-      <w:r>
-        <w:t xml:space="preserve">; sau đó nút Trợ giúp nổi mở bảng hai thẻ — thẻ</w:t>
-      </w:r>
-      <w:r>
-        <w:t xml:space="preserve"> </w:t>
-      </w:r>
+        <w:t xml:space="preserve">Màn hình thứ nhất là trình soạn bài viết: các trường song ngữ trình bày theo hai thẻ VI/EN, chuyên mục và thẻ chọn từ dữ liệu động, ảnh bìa chọn từ thư viện phương tiện, bài loại sự kiện có thêm khối thông tin thời gian – địa điểm – diễn giả, và nút lưu tách thành ba hành động lưu nháp, lên lịch hoặc gửi xuất bản. Màn hình thứ hai là Visual Builder — trình dàn trang Puck toàn màn hình với danh mục khối bên trái (khối nội dung, khối tự động như tin mới nhất hay sự kiện sắp tới, khối điều hướng), khung xem trước ở giữa và bảng thuộc tính bên phải; lịch sử phiên bản bố cục truy cập được từ chính trình soạn thảo. Màn hình thứ ba là lớp hướng dẫn tương tác: ở lần đăng nhập đầu, hệ thống tự chạy tour giới thiệu từng phân hệ (xây dựng trên thư viện driver.js), trạng thái hoàn thành được lưu trên hồ sơ người dùng; sau đó nút Trợ giúp nổi mở bảng hai thẻ — thẻ hướng dẫn tương tác chứa các chỉ dẫn từng bước làm nổi bật nút thật trên giao diện (tạo bố cục, xuất bản, viết bài, tải phương tiện), thẻ tài liệu chứa bộ câu hỏi thường gặp tìm kiếm được. Toàn bộ lớp hướng dẫn là song ngữ, mặc định tiếng Việt.</w:t>
+      </w:r>
+    </w:p>
+    <w:p>
+      <w:pPr>
+        <w:pStyle w:val="BodyText"/>
+      </w:pPr>
+      <w:r>
+        <w:t xml:space="preserve">【HÌNH 3.8 — Ảnh chụp màn hình Visual Builder đang mở bố cục trang chủ】</w:t>
+      </w:r>
+    </w:p>
+    <w:p>
+      <w:pPr>
+        <w:pStyle w:val="BodyText"/>
+      </w:pPr>
       <w:r>
         <w:rPr>
           <w:i/>
           <w:iCs/>
         </w:rPr>
-        <w:t xml:space="preserve">Interact</w:t>
-      </w:r>
-      <w:r>
-        <w:t xml:space="preserve"> </w:t>
-      </w:r>
-      <w:r>
-        <w:t xml:space="preserve">chứa các hướng dẫn từng bước làm nổi bật nút thật trên giao diện (tạo bố cục, xuất bản, viết bài, tải phương tiện), thẻ</w:t>
-      </w:r>
-      <w:r>
-        <w:t xml:space="preserve"> </w:t>
-      </w:r>
-      <w:r>
-        <w:rPr>
-          <w:i/>
-          <w:iCs/>
-        </w:rPr>
-        <w:t xml:space="preserve">Doc</w:t>
-      </w:r>
-      <w:r>
-        <w:t xml:space="preserve"> </w:t>
-      </w:r>
-      <w:r>
-        <w:t xml:space="preserve">chứa bộ câu hỏi thường gặp tìm kiếm được. Toàn bộ lớp hướng dẫn là song ngữ, mặc định tiếng Việt.</w:t>
-      </w:r>
-    </w:p>
-    <w:p>
-      <w:pPr>
-        <w:pStyle w:val="BodyText"/>
-      </w:pPr>
-      <w:r>
-        <w:t xml:space="preserve">【HÌNH 3.8 — Ảnh chụp màn hình Visual Builder đang mở bố cục trang chủ】</w:t>
-      </w:r>
-    </w:p>
-    <w:p>
-      <w:pPr>
-        <w:pStyle w:val="BodyText"/>
-      </w:pPr>
-      <w:r>
-        <w:rPr>
-          <w:i/>
-          <w:iCs/>
-        </w:rPr>
         <w:t xml:space="preserve">Hình 3.8. Trình xây dựng giao diện trực quan trong trang quản trị</w:t>
       </w:r>
     </w:p>
@@ -4272,70 +3412,7 @@
         <w:pStyle w:val="FirstParagraph"/>
       </w:pPr>
       <w:r>
-        <w:t xml:space="preserve">Trang công khai kết xuất từ</w:t>
-      </w:r>
-      <w:r>
-        <w:t xml:space="preserve"> </w:t>
-      </w:r>
-      <w:r>
-        <w:rPr>
-          <w:rStyle w:val="VerbatimChar"/>
-        </w:rPr>
-        <w:t xml:space="preserve">publishedPuckData</w:t>
-      </w:r>
-      <w:r>
-        <w:t xml:space="preserve"> </w:t>
-      </w:r>
-      <w:r>
-        <w:t xml:space="preserve">với bộ thành phần hiển thị tương ứng. Trang chủ gồm khối hero, các khối tin tức – sự kiện tự cập nhật, khối giới thiệu và chân trang. Hệ thống định tuyến song ngữ đặt tiền tố ngôn ngữ trên mọi URL (</w:t>
-      </w:r>
-      <w:r>
-        <w:rPr>
-          <w:rStyle w:val="VerbatimChar"/>
-        </w:rPr>
-        <w:t xml:space="preserve">/vi/…</w:t>
-      </w:r>
-      <w:r>
-        <w:t xml:space="preserve">,</w:t>
-      </w:r>
-      <w:r>
-        <w:t xml:space="preserve"> </w:t>
-      </w:r>
-      <w:r>
-        <w:rPr>
-          <w:rStyle w:val="VerbatimChar"/>
-        </w:rPr>
-        <w:t xml:space="preserve">/en/…</w:t>
-      </w:r>
-      <w:r>
-        <w:t xml:space="preserve">); thanh điều hướng tái tạo đúng cấu trúc menu chín mục của website cũ (mục 3.7.5). Mỗi bộ môn có trang riêng tại</w:t>
-      </w:r>
-      <w:r>
-        <w:t xml:space="preserve"> </w:t>
-      </w:r>
-      <w:r>
-        <w:rPr>
-          <w:rStyle w:val="VerbatimChar"/>
-        </w:rPr>
-        <w:t xml:space="preserve">/&lt;slug-bộ-môn&gt;</w:t>
-      </w:r>
-      <w:r>
-        <w:t xml:space="preserve"> </w:t>
-      </w:r>
-      <w:r>
-        <w:t xml:space="preserve">và các bài viết của bộ môn nằm dưới</w:t>
-      </w:r>
-      <w:r>
-        <w:t xml:space="preserve"> </w:t>
-      </w:r>
-      <w:r>
-        <w:rPr>
-          <w:rStyle w:val="VerbatimChar"/>
-        </w:rPr>
-        <w:t xml:space="preserve">/&lt;slug-bộ-môn&gt;/tin-tuc/…</w:t>
-      </w:r>
-      <w:r>
-        <w:t xml:space="preserve">.</w:t>
+        <w:t xml:space="preserve">Trang công khai kết xuất từ ảnh chụp bố cục đã xuất bản với bộ thành phần hiển thị tương ứng. Trang chủ gồm khối hero, các khối tin tức – sự kiện tự cập nhật, khối giới thiệu và chân trang. Hệ thống định tuyến song ngữ đặt tiền tố ngôn ngữ (vi hoặc en) trên mọi URL; thanh điều hướng tái tạo đúng cấu trúc menu chín mục của website cũ (mục 3.7.5). Mỗi bộ môn có trang riêng tại địa chỉ mang tên bộ môn, và các bài viết của bộ môn nằm dưới chuyên mục tin tức của địa chỉ đó.</w:t>
       </w:r>
     </w:p>
     <w:p>
@@ -4383,79 +3460,7 @@
         <w:pStyle w:val="FirstParagraph"/>
       </w:pPr>
       <w:r>
-        <w:t xml:space="preserve">Hệ thống nguồn là CMS PHP với MariaDB 10.6, khảo sát qua bản sao lưu SQL 70 MB (46 bảng). Ba đặc điểm cấu trúc chi phối chiến lược di trú: (i) mọi thực thể tách đôi thành bảng dữ liệu và bảng dịch</w:t>
-      </w:r>
-      <w:r>
-        <w:t xml:space="preserve"> </w:t>
-      </w:r>
-      <w:r>
-        <w:rPr>
-          <w:rStyle w:val="VerbatimChar"/>
-        </w:rPr>
-        <w:t xml:space="preserve">&lt;entity&gt;lang</w:t>
-      </w:r>
-      <w:r>
-        <w:t xml:space="preserve"> </w:t>
-      </w:r>
-      <w:r>
-        <w:t xml:space="preserve">khóa theo</w:t>
-      </w:r>
-      <w:r>
-        <w:t xml:space="preserve"> </w:t>
-      </w:r>
-      <w:r>
-        <w:rPr>
-          <w:rStyle w:val="VerbatimChar"/>
-        </w:rPr>
-        <w:t xml:space="preserve">langid</w:t>
-      </w:r>
-      <w:r>
-        <w:t xml:space="preserve"> </w:t>
-      </w:r>
-      <w:r>
-        <w:t xml:space="preserve">(1 = vi, 2 = en); (ii) xóa mềm bằng cột</w:t>
-      </w:r>
-      <w:r>
-        <w:t xml:space="preserve"> </w:t>
-      </w:r>
-      <w:r>
-        <w:rPr>
-          <w:rStyle w:val="VerbatimChar"/>
-        </w:rPr>
-        <w:t xml:space="preserve">deleted</w:t>
-      </w:r>
-      <w:r>
-        <w:t xml:space="preserve"> </w:t>
-      </w:r>
-      <w:r>
-        <w:t xml:space="preserve">— chỉ di trú bản ghi</w:t>
-      </w:r>
-      <w:r>
-        <w:t xml:space="preserve"> </w:t>
-      </w:r>
-      <w:r>
-        <w:rPr>
-          <w:rStyle w:val="VerbatimChar"/>
-        </w:rPr>
-        <w:t xml:space="preserve">deleted = 0</w:t>
-      </w:r>
-      <w:r>
-        <w:t xml:space="preserve">; (iii) hầu hết bảng mang</w:t>
-      </w:r>
-      <w:r>
-        <w:t xml:space="preserve"> </w:t>
-      </w:r>
-      <w:r>
-        <w:rPr>
-          <w:rStyle w:val="VerbatimChar"/>
-        </w:rPr>
-        <w:t xml:space="preserve">deptid</w:t>
-      </w:r>
-      <w:r>
-        <w:t xml:space="preserve"> </w:t>
-      </w:r>
-      <w:r>
-        <w:t xml:space="preserve">gắn nội dung với bộ môn. Khối lượng chính: 1.651 bài viết (3.302 bản ghi dịch), 273 trang nội dung, 49 chuyên mục, 383 mục menu, 10 đơn vị.</w:t>
+        <w:t xml:space="preserve">Hệ thống nguồn là CMS PHP với MariaDB 10.6, khảo sát qua bản sao lưu SQL 70 MB gồm 46 bảng. Ba đặc điểm cấu trúc chi phối chiến lược di trú: thứ nhất, mọi thực thể tách đôi thành bảng dữ liệu và bảng dịch đi kèm, khóa theo mã ngôn ngữ (1 là tiếng Việt, 2 là tiếng Anh); thứ hai, hệ thống dùng cơ chế xóa mềm bằng cột đánh dấu — chỉ những bản ghi chưa bị đánh dấu xóa mới được di trú; thứ ba, hầu hết bảng mang mã bộ môn gắn nội dung với đơn vị sở hữu. Khối lượng chính: 1.651 bài viết (3.302 bản ghi dịch), 273 trang nội dung, 49 chuyên mục, 383 mục menu, 10 đơn vị.</w:t>
       </w:r>
     </w:p>
     <w:bookmarkEnd w:id="63"/>
@@ -5073,103 +4078,7 @@
         <w:t xml:space="preserve">giữ nguyên HTML có kiểm soát</w:t>
       </w:r>
       <w:r>
-        <w:t xml:space="preserve">: giải mã thực thể HTML, loại bỏ thẻ</w:t>
-      </w:r>
-      <w:r>
-        <w:t xml:space="preserve"> </w:t>
-      </w:r>
-      <w:r>
-        <w:rPr>
-          <w:rStyle w:val="VerbatimChar"/>
-        </w:rPr>
-        <w:t xml:space="preserve">script</w:t>
-      </w:r>
-      <w:r>
-        <w:t xml:space="preserve"> </w:t>
-      </w:r>
-      <w:r>
-        <w:t xml:space="preserve">và thuộc tính sự kiện</w:t>
-      </w:r>
-      <w:r>
-        <w:t xml:space="preserve"> </w:t>
-      </w:r>
-      <w:r>
-        <w:rPr>
-          <w:rStyle w:val="VerbatimChar"/>
-        </w:rPr>
-        <w:t xml:space="preserve">on*</w:t>
-      </w:r>
-      <w:r>
-        <w:t xml:space="preserve">, viết lại đường dẫn phương tiện</w:t>
-      </w:r>
-      <w:r>
-        <w:t xml:space="preserve"> </w:t>
-      </w:r>
-      <w:r>
-        <w:rPr>
-          <w:rStyle w:val="VerbatimChar"/>
-        </w:rPr>
-        <w:t xml:space="preserve">/uploads/…</w:t>
-      </w:r>
-      <w:r>
-        <w:t xml:space="preserve"> </w:t>
-      </w:r>
-      <w:r>
-        <w:t xml:space="preserve">→</w:t>
-      </w:r>
-      <w:r>
-        <w:t xml:space="preserve"> </w:t>
-      </w:r>
-      <w:r>
-        <w:rPr>
-          <w:rStyle w:val="VerbatimChar"/>
-        </w:rPr>
-        <w:t xml:space="preserve">/uploads/legacy/…</w:t>
-      </w:r>
-      <w:r>
-        <w:t xml:space="preserve"> </w:t>
-      </w:r>
-      <w:r>
-        <w:t xml:space="preserve">(hiện thực trong</w:t>
-      </w:r>
-      <w:r>
-        <w:t xml:space="preserve"> </w:t>
-      </w:r>
-      <w:r>
-        <w:rPr>
-          <w:rStyle w:val="VerbatimChar"/>
-        </w:rPr>
-        <w:t xml:space="preserve">legacy-html.ts</w:t>
-      </w:r>
-      <w:r>
-        <w:t xml:space="preserve">). Phía hiển thị, khối Puck chuyên dụng</w:t>
-      </w:r>
-      <w:r>
-        <w:t xml:space="preserve"> </w:t>
-      </w:r>
-      <w:r>
-        <w:rPr>
-          <w:rStyle w:val="VerbatimChar"/>
-        </w:rPr>
-        <w:t xml:space="preserve">LegacyHtml</w:t>
-      </w:r>
-      <w:r>
-        <w:t xml:space="preserve"> </w:t>
-      </w:r>
-      <w:r>
-        <w:t xml:space="preserve">kết xuất trung thực HTML này — giữ màu chữ, bảng biểu, danh sách của bản gốc — chỉ can thiệp ba việc: phân giải URL phương tiện qua</w:t>
-      </w:r>
-      <w:r>
-        <w:t xml:space="preserve"> </w:t>
-      </w:r>
-      <w:r>
-        <w:rPr>
-          <w:rStyle w:val="VerbatimChar"/>
-        </w:rPr>
-        <w:t xml:space="preserve">resolveMediaUrl</w:t>
-      </w:r>
-      <w:r>
-        <w:t xml:space="preserve">, ép ảnh co giãn theo khung, và khôi phục đường kẻ bảng cùng dấu đầu dòng bị Tailwind reset.</w:t>
+        <w:t xml:space="preserve">: giải mã các thực thể HTML, loại bỏ mã kịch bản và các thuộc tính bắt sự kiện tiềm ẩn rủi ro, viết lại đường dẫn phương tiện về kho tệp dành riêng cho dữ liệu cũ. Phía hiển thị, một khối kết xuất chuyên dụng trình bày trung thực phần HTML này — giữ màu chữ, bảng biểu, danh sách của bản gốc — chỉ can thiệp ba việc: phân giải địa chỉ phương tiện về đúng máy chủ tệp, ép ảnh co giãn theo khung, và khôi phục đường kẻ bảng cùng dấu đầu dòng vốn bị bộ khung giao diện đặt lại.</w:t>
       </w:r>
     </w:p>
     <w:p>
@@ -5177,49 +4086,7 @@
         <w:pStyle w:val="BodyText"/>
       </w:pPr>
       <w:r>
-        <w:t xml:space="preserve">Tư liệu phương tiện được tải tự động từ máy chủ cũ: quét mọi</w:t>
-      </w:r>
-      <w:r>
-        <w:t xml:space="preserve"> </w:t>
-      </w:r>
-      <w:r>
-        <w:rPr>
-          <w:rStyle w:val="VerbatimChar"/>
-        </w:rPr>
-        <w:t xml:space="preserve">coverUrl</w:t>
-      </w:r>
-      <w:r>
-        <w:t xml:space="preserve"> </w:t>
-      </w:r>
-      <w:r>
-        <w:t xml:space="preserve">và thẻ</w:t>
-      </w:r>
-      <w:r>
-        <w:t xml:space="preserve"> </w:t>
-      </w:r>
-      <w:r>
-        <w:rPr>
-          <w:rStyle w:val="VerbatimChar"/>
-        </w:rPr>
-        <w:t xml:space="preserve">&lt;img&gt;</w:t>
-      </w:r>
-      <w:r>
-        <w:t xml:space="preserve"> </w:t>
-      </w:r>
-      <w:r>
-        <w:t xml:space="preserve">trong thân bài hai ngôn ngữ, tải song song (6 luồng) về</w:t>
-      </w:r>
-      <w:r>
-        <w:t xml:space="preserve"> </w:t>
-      </w:r>
-      <w:r>
-        <w:rPr>
-          <w:rStyle w:val="VerbatimChar"/>
-        </w:rPr>
-        <w:t xml:space="preserve">backend/uploads/legacy/</w:t>
-      </w:r>
-      <w:r>
-        <w:t xml:space="preserve">. Kết quả thực đo: 1.909 đường dẫn duy nhất — 1.870 tải thành công, 36 hỏng ngay trên máy chủ nguồn, 3 đã có sẵn; tổng dung lượng 3,9 GB. Riêng tư liệu của các trang nội dung: 180/187 tệp (7 tệp hỏng phía nguồn).</w:t>
+        <w:t xml:space="preserve">Tư liệu phương tiện được tải tự động từ máy chủ cũ: hệ thống quét ảnh bìa và mọi thẻ ảnh trong thân bài hai ngôn ngữ, tải song song sáu luồng về kho tệp mới. Kết quả thực đo: 1.909 đường dẫn duy nhất — 1.870 tải thành công, 36 hỏng ngay trên máy chủ nguồn, 3 đã có sẵn; tổng dung lượng 3,9 GB. Riêng tư liệu của các trang nội dung: 180/187 tệp (7 tệp hỏng phía nguồn).</w:t>
       </w:r>
     </w:p>
     <w:bookmarkEnd w:id="65"/>
@@ -5237,76 +4104,7 @@
         <w:pStyle w:val="FirstParagraph"/>
       </w:pPr>
       <w:r>
-        <w:t xml:space="preserve">Quy trình tổng thể (Hình 3.10) gồm bốn giai đoạn, toàn bộ là script TypeScript trong</w:t>
-      </w:r>
-      <w:r>
-        <w:t xml:space="preserve"> </w:t>
-      </w:r>
-      <w:r>
-        <w:rPr>
-          <w:rStyle w:val="VerbatimChar"/>
-        </w:rPr>
-        <w:t xml:space="preserve">backend/initialScript/migrate-legacy/</w:t>
-      </w:r>
-      <w:r>
-        <w:t xml:space="preserve">, chạy lặp lại an toàn nhờ upsert theo</w:t>
-      </w:r>
-      <w:r>
-        <w:t xml:space="preserve"> </w:t>
-      </w:r>
-      <w:r>
-        <w:rPr>
-          <w:rStyle w:val="VerbatimChar"/>
-        </w:rPr>
-        <w:t xml:space="preserve">legacyId</w:t>
-      </w:r>
-      <w:r>
-        <w:t xml:space="preserve">. Giai đoạn thứ nhất phục hồi nguồn: script</w:t>
-      </w:r>
-      <w:r>
-        <w:t xml:space="preserve"> </w:t>
-      </w:r>
-      <w:r>
-        <w:rPr>
-          <w:rStyle w:val="VerbatimChar"/>
-        </w:rPr>
-        <w:t xml:space="preserve">run.ts</w:t>
-      </w:r>
-      <w:r>
-        <w:t xml:space="preserve"> </w:t>
-      </w:r>
-      <w:r>
-        <w:t xml:space="preserve">tự dựng một MariaDB 10.6 tạm thời trong Docker, nạp bản sao lưu, rồi đọc bảng</w:t>
-      </w:r>
-      <w:r>
-        <w:t xml:space="preserve"> </w:t>
-      </w:r>
-      <w:r>
-        <w:rPr>
-          <w:rStyle w:val="VerbatimChar"/>
-        </w:rPr>
-        <w:t xml:space="preserve">language</w:t>
-      </w:r>
-      <w:r>
-        <w:t xml:space="preserve"> </w:t>
-      </w:r>
-      <w:r>
-        <w:t xml:space="preserve">để xác nhận ánh xạ</w:t>
-      </w:r>
-      <w:r>
-        <w:t xml:space="preserve"> </w:t>
-      </w:r>
-      <w:r>
-        <w:rPr>
-          <w:rStyle w:val="VerbatimChar"/>
-        </w:rPr>
-        <w:t xml:space="preserve">langid</w:t>
-      </w:r>
-      <w:r>
-        <w:t xml:space="preserve"> </w:t>
-      </w:r>
-      <w:r>
-        <w:t xml:space="preserve">sang mã ngôn ngữ. Giai đoạn thứ hai di trú các thực thể theo thứ tự an toàn khóa ngoại — đơn vị, người dùng cũ (chỉ hồ sơ, không mật khẩu), chuyên mục, rồi bài viết; kết quả thực đo gồm 10 đơn vị, 45 chuyên mục di trú (cộng 5 chuyên mục mặc định của hệ mới) và</w:t>
+        <w:t xml:space="preserve">Quy trình tổng thể (Hình 3.10) gồm bốn giai đoạn, toàn bộ là các script tự động chạy lặp lại an toàn nhờ ghi đè theo khóa gốc. Giai đoạn thứ nhất phục hồi nguồn: script khởi động tự dựng một MariaDB 10.6 tạm thời trong Docker, nạp bản sao lưu, rồi đọc bảng ngôn ngữ của nguồn để xác nhận ánh xạ mã ngôn ngữ. Giai đoạn thứ hai di trú các thực thể theo thứ tự an toàn khóa ngoại — đơn vị, người dùng cũ (chỉ hồ sơ, không mật khẩu), chuyên mục, rồi bài viết; kết quả thực đo gồm 10 đơn vị, 45 chuyên mục di trú (cộng 5 chuyên mục mặc định của hệ mới) và</w:t>
       </w:r>
       <w:r>
         <w:t xml:space="preserve"> </w:t>
@@ -5322,97 +4120,7 @@
         <w:t xml:space="preserve"> </w:t>
       </w:r>
       <w:r>
-        <w:t xml:space="preserve">(nâng tổng số lên 1.704 bài cùng 67 bài có sẵn). Giai đoạn thứ ba tải và ánh xạ phương tiện: sau khi</w:t>
-      </w:r>
-      <w:r>
-        <w:t xml:space="preserve"> </w:t>
-      </w:r>
-      <w:r>
-        <w:rPr>
-          <w:rStyle w:val="VerbatimChar"/>
-        </w:rPr>
-        <w:t xml:space="preserve">download-media.ts</w:t>
-      </w:r>
-      <w:r>
-        <w:t xml:space="preserve"> </w:t>
-      </w:r>
-      <w:r>
-        <w:t xml:space="preserve">tải kho tệp về (mục 3.7.3), script</w:t>
-      </w:r>
-      <w:r>
-        <w:t xml:space="preserve"> </w:t>
-      </w:r>
-      <w:r>
-        <w:rPr>
-          <w:rStyle w:val="VerbatimChar"/>
-        </w:rPr>
-        <w:t xml:space="preserve">rewrite-media-urls.ts</w:t>
-      </w:r>
-      <w:r>
-        <w:t xml:space="preserve"> </w:t>
-      </w:r>
-      <w:r>
-        <w:t xml:space="preserve">cập nhật 1.636 bài viết và 7 chuyên mục trỏ về kho tệp mới. Giai đoạn cuối gắn nhãn bộ môn:</w:t>
-      </w:r>
-      <w:r>
-        <w:t xml:space="preserve"> </w:t>
-      </w:r>
-      <w:r>
-        <w:rPr>
-          <w:rStyle w:val="VerbatimChar"/>
-        </w:rPr>
-        <w:t xml:space="preserve">backfill-content-departments.ts</w:t>
-      </w:r>
-      <w:r>
-        <w:t xml:space="preserve"> </w:t>
-      </w:r>
-      <w:r>
-        <w:t xml:space="preserve">đọc trường</w:t>
-      </w:r>
-      <w:r>
-        <w:t xml:space="preserve"> </w:t>
-      </w:r>
-      <w:r>
-        <w:rPr>
-          <w:rStyle w:val="VerbatimChar"/>
-        </w:rPr>
-        <w:t xml:space="preserve">posts.deptid</w:t>
-      </w:r>
-      <w:r>
-        <w:t xml:space="preserve"> </w:t>
-      </w:r>
-      <w:r>
-        <w:t xml:space="preserve">gốc qua</w:t>
-      </w:r>
-      <w:r>
-        <w:t xml:space="preserve"> </w:t>
-      </w:r>
-      <w:r>
-        <w:rPr>
-          <w:rStyle w:val="VerbatimChar"/>
-        </w:rPr>
-        <w:t xml:space="preserve">legacyId</w:t>
-      </w:r>
-      <w:r>
-        <w:t xml:space="preserve"> </w:t>
-      </w:r>
-      <w:r>
-        <w:t xml:space="preserve">và gắn</w:t>
-      </w:r>
-      <w:r>
-        <w:t xml:space="preserve"> </w:t>
-      </w:r>
-      <w:r>
-        <w:rPr>
-          <w:rStyle w:val="VerbatimChar"/>
-        </w:rPr>
-        <w:t xml:space="preserve">departmentId</w:t>
-      </w:r>
-      <w:r>
-        <w:t xml:space="preserve"> </w:t>
-      </w:r>
-      <w:r>
-        <w:t xml:space="preserve">cho</w:t>
+        <w:t xml:space="preserve">(nâng tổng số lên 1.704 bài cùng 67 bài có sẵn). Giai đoạn thứ ba tải và ánh xạ phương tiện: sau khi tải kho tệp về (mục 3.7.3), bước ánh xạ cập nhật 1.636 bài viết và 7 chuyên mục trỏ về kho tệp mới. Giai đoạn cuối gắn nhãn bộ môn: đọc mã bộ môn gốc của từng bài qua khóa gốc rồi gắn nhãn cho</w:t>
       </w:r>
       <w:r>
         <w:t xml:space="preserve"> </w:t>
@@ -5472,16 +4180,7 @@
         <w:pStyle w:val="BodyText"/>
       </w:pPr>
       <w:r>
-        <w:t xml:space="preserve">Vì các script ghi thẳng vào cơ sở dữ liệu (không qua tầng service), chúng chủ động xóa vùng đệm Redis (</w:t>
-      </w:r>
-      <w:r>
-        <w:rPr>
-          <w:rStyle w:val="VerbatimChar"/>
-        </w:rPr>
-        <w:t xml:space="preserve">flush-cache.ts</w:t>
-      </w:r>
-      <w:r>
-        <w:t xml:space="preserve">) và gọi revalidate trang công khai sau khi chạy — tái lập đúng bất biến</w:t>
+        <w:t xml:space="preserve">Vì các script ghi thẳng vào cơ sở dữ liệu (không qua tầng dịch vụ), chúng chủ động xóa vùng đệm Redis và phát tín hiệu làm mới trang công khai sau khi chạy — tái lập đúng bất biến</w:t>
       </w:r>
       <w:r>
         <w:t xml:space="preserve"> </w:t>
@@ -5543,46 +4242,7 @@
         <w:t xml:space="preserve"> </w:t>
       </w:r>
       <w:r>
-        <w:t xml:space="preserve">của website cũ. Menu chín mục với 36 liên kết con (song ngữ) được phục dựng từ bảng</w:t>
-      </w:r>
-      <w:r>
-        <w:t xml:space="preserve"> </w:t>
-      </w:r>
-      <w:r>
-        <w:rPr>
-          <w:rStyle w:val="VerbatimChar"/>
-        </w:rPr>
-        <w:t xml:space="preserve">menus</w:t>
-      </w:r>
-      <w:r>
-        <w:t xml:space="preserve">/</w:t>
-      </w:r>
-      <w:r>
-        <w:rPr>
-          <w:rStyle w:val="VerbatimChar"/>
-        </w:rPr>
-        <w:t xml:space="preserve">menuslang</w:t>
-      </w:r>
-      <w:r>
-        <w:t xml:space="preserve"> </w:t>
-      </w:r>
-      <w:r>
-        <w:t xml:space="preserve">và ghi vào Navbar của bố cục</w:t>
-      </w:r>
-      <w:r>
-        <w:t xml:space="preserve"> </w:t>
-      </w:r>
-      <w:r>
-        <w:rPr>
-          <w:rStyle w:val="VerbatimChar"/>
-        </w:rPr>
-        <w:t xml:space="preserve">trang-chu</w:t>
-      </w:r>
-      <w:r>
-        <w:t xml:space="preserve"> </w:t>
-      </w:r>
-      <w:r>
-        <w:t xml:space="preserve">— nhờ cơ chế Single Source of Truth, toàn bộ website lập tức có thanh điều hướng giống hệ thống cũ.</w:t>
+        <w:t xml:space="preserve">của website cũ. Menu chín mục với 36 liên kết con (song ngữ) được phục dựng từ hai bảng menu của nguồn và ghi vào thanh điều hướng của bố cục trang chủ — nhờ cơ chế nguồn chân lý duy nhất, toàn bộ website lập tức có thanh điều hướng giống hệ thống cũ.</w:t>
       </w:r>
       <w:r>
         <w:t xml:space="preserve"> </w:t>
@@ -5598,37 +4258,7 @@
         <w:t xml:space="preserve"> </w:t>
       </w:r>
       <w:r>
-        <w:t xml:space="preserve">(giới thiệu, quy chế học tập, đào tạo…) được dựng lại thành</w:t>
-      </w:r>
-      <w:r>
-        <w:t xml:space="preserve"> </w:t>
-      </w:r>
-      <w:r>
-        <w:rPr>
-          <w:rStyle w:val="VerbatimChar"/>
-        </w:rPr>
-        <w:t xml:space="preserve">PageLayout</w:t>
-      </w:r>
-      <w:r>
-        <w:t xml:space="preserve"> </w:t>
-      </w:r>
-      <w:r>
-        <w:t xml:space="preserve">hoàn chỉnh: khung trang gồm banner tiêu đề, thân bài</w:t>
-      </w:r>
-      <w:r>
-        <w:t xml:space="preserve"> </w:t>
-      </w:r>
-      <w:r>
-        <w:rPr>
-          <w:rStyle w:val="VerbatimChar"/>
-        </w:rPr>
-        <w:t xml:space="preserve">LegacyHtml</w:t>
-      </w:r>
-      <w:r>
-        <w:t xml:space="preserve"> </w:t>
-      </w:r>
-      <w:r>
-        <w:t xml:space="preserve">hai cột kèm thanh bên</w:t>
+        <w:t xml:space="preserve">(giới thiệu, quy chế học tập, đào tạo…) được dựng lại thành trang bố cục hoàn chỉnh: khung trang gồm banner tiêu đề, thân bài hai cột kèm thanh bên</w:t>
       </w:r>
       <w:r>
         <w:t xml:space="preserve"> </w:t>
@@ -5657,22 +4287,7 @@
         <w:pStyle w:val="BodyText"/>
       </w:pPr>
       <w:r>
-        <w:t xml:space="preserve">Về URL, bài viết bộ môn được chuyển sang đường dẫn mang tiền tố bộ môn: script</w:t>
-      </w:r>
-      <w:r>
-        <w:t xml:space="preserve"> </w:t>
-      </w:r>
-      <w:r>
-        <w:rPr>
-          <w:rStyle w:val="VerbatimChar"/>
-        </w:rPr>
-        <w:t xml:space="preserve">re-slug-department-layouts.ts</w:t>
-      </w:r>
-      <w:r>
-        <w:t xml:space="preserve"> </w:t>
-      </w:r>
-      <w:r>
-        <w:t xml:space="preserve">đổi slug</w:t>
+        <w:t xml:space="preserve">Về URL, bài viết bộ môn được chuyển sang đường dẫn mang tiền tố tên bộ môn: hệ thống đổi đường dẫn của</w:t>
       </w:r>
       <w:r>
         <w:t xml:space="preserve"> </w:t>
@@ -5688,37 +4303,7 @@
         <w:t xml:space="preserve"> </w:t>
       </w:r>
       <w:r>
-        <w:t xml:space="preserve">từ</w:t>
-      </w:r>
-      <w:r>
-        <w:t xml:space="preserve"> </w:t>
-      </w:r>
-      <w:r>
-        <w:rPr>
-          <w:rStyle w:val="VerbatimChar"/>
-        </w:rPr>
-        <w:t xml:space="preserve">tin-tuc/…</w:t>
-      </w:r>
-      <w:r>
-        <w:t xml:space="preserve"> </w:t>
-      </w:r>
-      <w:r>
-        <w:t xml:space="preserve">thành</w:t>
-      </w:r>
-      <w:r>
-        <w:t xml:space="preserve"> </w:t>
-      </w:r>
-      <w:r>
-        <w:rPr>
-          <w:rStyle w:val="VerbatimChar"/>
-        </w:rPr>
-        <w:t xml:space="preserve">&lt;slug-bộ-môn&gt;/tin-tuc/…</w:t>
-      </w:r>
-      <w:r>
-        <w:t xml:space="preserve"> </w:t>
-      </w:r>
-      <w:r>
-        <w:t xml:space="preserve">(1.152 bài toàn khoa giữ đường dẫn phẳng) và sinh bảng ánh xạ</w:t>
+        <w:t xml:space="preserve">từ dạng phẳng sang dạng có tiền tố (1.152 bài toàn khoa giữ đường dẫn phẳng) và sinh bảng ánh xạ</w:t>
       </w:r>
       <w:r>
         <w:t xml:space="preserve"> </w:t>
@@ -5731,46 +4316,7 @@
         <w:t xml:space="preserve">397 chuyển hướng</w:t>
       </w:r>
       <w:r>
-        <w:t xml:space="preserve">; middleware của trang công khai (</w:t>
-      </w:r>
-      <w:r>
-        <w:rPr>
-          <w:rStyle w:val="VerbatimChar"/>
-        </w:rPr>
-        <w:t xml:space="preserve">proxy.ts</w:t>
-      </w:r>
-      <w:r>
-        <w:t xml:space="preserve">) trả về chuyển hướng vĩnh viễn 308 từ URL cũ sang URL mới, bảo toàn liên kết đã lan truyền và giá trị SEO tích lũy. Chín trang bộ môn tại</w:t>
-      </w:r>
-      <w:r>
-        <w:t xml:space="preserve"> </w:t>
-      </w:r>
-      <w:r>
-        <w:rPr>
-          <w:rStyle w:val="VerbatimChar"/>
-        </w:rPr>
-        <w:t xml:space="preserve">/&lt;slug-bộ-môn&gt;</w:t>
-      </w:r>
-      <w:r>
-        <w:t xml:space="preserve"> </w:t>
-      </w:r>
-      <w:r>
-        <w:t xml:space="preserve">được khởi tạo từ bố cục trang chủ và gắn</w:t>
-      </w:r>
-      <w:r>
-        <w:t xml:space="preserve"> </w:t>
-      </w:r>
-      <w:r>
-        <w:rPr>
-          <w:rStyle w:val="VerbatimChar"/>
-        </w:rPr>
-        <w:t xml:space="preserve">departmentId</w:t>
-      </w:r>
-      <w:r>
-        <w:t xml:space="preserve"> </w:t>
-      </w:r>
-      <w:r>
-        <w:t xml:space="preserve">để bộ môn tự biên tập.</w:t>
+        <w:t xml:space="preserve">; tầng trung gian của trang công khai trả về chuyển hướng vĩnh viễn 308 từ URL cũ sang URL mới, bảo toàn liên kết đã lan truyền và giá trị SEO tích lũy. Chín trang bộ môn được khởi tạo từ bố cục trang chủ và gắn nhãn bộ môn để chính bộ môn đó tự biên tập.</w:t>
       </w:r>
     </w:p>
     <w:bookmarkEnd w:id="67"/>
@@ -5892,31 +4438,7 @@
         <w:t xml:space="preserve"> </w:t>
       </w:r>
       <w:r>
-        <w:t xml:space="preserve">ngay lập tức khi backend phát tín hiệu revalidate theo thẻ (khi nội dung được xuất bản, backend gọi endpoint revalidate của trang công khai kèm token bí mật, vô hiệu đúng các thẻ đệm bị ảnh hưởng như</w:t>
-      </w:r>
-      <w:r>
-        <w:t xml:space="preserve"> </w:t>
-      </w:r>
-      <w:r>
-        <w:rPr>
-          <w:rStyle w:val="VerbatimChar"/>
-        </w:rPr>
-        <w:t xml:space="preserve">page:trang-chu</w:t>
-      </w:r>
-      <w:r>
-        <w:t xml:space="preserve">,</w:t>
-      </w:r>
-      <w:r>
-        <w:t xml:space="preserve"> </w:t>
-      </w:r>
-      <w:r>
-        <w:rPr>
-          <w:rStyle w:val="VerbatimChar"/>
-        </w:rPr>
-        <w:t xml:space="preserve">sitemap</w:t>
-      </w:r>
-      <w:r>
-        <w:t xml:space="preserve">). Kết quả là trang vừa có tốc độ phản hồi của tệp tĩnh vừa phản ánh nội dung mới trong vài giây.</w:t>
+        <w:t xml:space="preserve">ngay lập tức khi máy chủ API phát tín hiệu làm mới theo thẻ — khi nội dung được xuất bản, máy chủ API gọi sang trang công khai kèm mã bí mật, vô hiệu đúng các thẻ đệm bị ảnh hưởng (thẻ của trang vừa thay đổi và thẻ sitemap). Kết quả là trang vừa có tốc độ phản hồi của tệp tĩnh vừa phản ánh nội dung mới trong vài giây.</w:t>
       </w:r>
     </w:p>
     <w:bookmarkEnd w:id="70"/>
@@ -5934,73 +4456,7 @@
         <w:pStyle w:val="FirstParagraph"/>
       </w:pPr>
       <w:r>
-        <w:t xml:space="preserve">Mỗi trang sinh siêu dữ liệu từ chính nội dung: thẻ tiêu đề, mô tả (từ tóm tắt bài viết), canonical và bộ thẻ Open Graph kèm ảnh bìa. Bài viết nhúng khối JSON-LD</w:t>
-      </w:r>
-      <w:r>
-        <w:t xml:space="preserve"> </w:t>
-      </w:r>
-      <w:r>
-        <w:rPr>
-          <w:rStyle w:val="VerbatimChar"/>
-        </w:rPr>
-        <w:t xml:space="preserve">NewsArticle</w:t>
-      </w:r>
-      <w:r>
-        <w:t xml:space="preserve"> </w:t>
-      </w:r>
-      <w:r>
-        <w:t xml:space="preserve">(tiêu đề, thời điểm đăng, tác giả tổ chức, ảnh); biên tập viên có thể ghi đè qua bảng</w:t>
-      </w:r>
-      <w:r>
-        <w:t xml:space="preserve"> </w:t>
-      </w:r>
-      <w:r>
-        <w:rPr>
-          <w:rStyle w:val="VerbatimChar"/>
-        </w:rPr>
-        <w:t xml:space="preserve">SEOMetadata</w:t>
-      </w:r>
-      <w:r>
-        <w:t xml:space="preserve"> </w:t>
-      </w:r>
-      <w:r>
-        <w:t xml:space="preserve">khi cần tinh chỉnh thủ công. Hai phiên bản ngôn ngữ được phân tách bằng tiền tố URL (</w:t>
-      </w:r>
-      <w:r>
-        <w:rPr>
-          <w:rStyle w:val="VerbatimChar"/>
-        </w:rPr>
-        <w:t xml:space="preserve">/vi</w:t>
-      </w:r>
-      <w:r>
-        <w:t xml:space="preserve">,</w:t>
-      </w:r>
-      <w:r>
-        <w:t xml:space="preserve"> </w:t>
-      </w:r>
-      <w:r>
-        <w:rPr>
-          <w:rStyle w:val="VerbatimChar"/>
-        </w:rPr>
-        <w:t xml:space="preserve">/en</w:t>
-      </w:r>
-      <w:r>
-        <w:t xml:space="preserve">); việc phát cặp thẻ</w:t>
-      </w:r>
-      <w:r>
-        <w:t xml:space="preserve"> </w:t>
-      </w:r>
-      <w:r>
-        <w:rPr>
-          <w:rStyle w:val="VerbatimChar"/>
-        </w:rPr>
-        <w:t xml:space="preserve">hreflang</w:t>
-      </w:r>
-      <w:r>
-        <w:t xml:space="preserve"> </w:t>
-      </w:r>
-      <w:r>
-        <w:t xml:space="preserve">khai báo tường minh quan hệ giữa hai phiên bản được ghi nhận là hạng mục bổ sung (mục 4.6.1).</w:t>
+        <w:t xml:space="preserve">Mỗi trang sinh siêu dữ liệu từ chính nội dung: thẻ tiêu đề, mô tả (từ tóm tắt bài viết), canonical và bộ thẻ Open Graph kèm ảnh bìa. Bài viết nhúng khối dữ liệu có cấu trúc JSON-LD loại NewsArticle (tiêu đề, thời điểm đăng, tác giả tổ chức, ảnh); biên tập viên có thể ghi đè qua bảng siêu dữ liệu SEO khi cần tinh chỉnh thủ công. Hai phiên bản ngôn ngữ được phân tách bằng tiền tố URL (/vi, /en); việc phát cặp thẻ hreflang khai báo tường minh quan hệ giữa hai phiên bản được ghi nhận là hạng mục bổ sung (mục 4.6.1).</w:t>
       </w:r>
     </w:p>
     <w:bookmarkEnd w:id="71"/>
@@ -6033,22 +4489,7 @@
         <w:t xml:space="preserve"> </w:t>
       </w:r>
       <w:r>
-        <w:t xml:space="preserve">sinh động từ danh sách bố cục đã xuất bản, qua endpoint công khai chuyên dụng</w:t>
-      </w:r>
-      <w:r>
-        <w:t xml:space="preserve"> </w:t>
-      </w:r>
-      <w:r>
-        <w:rPr>
-          <w:rStyle w:val="VerbatimChar"/>
-        </w:rPr>
-        <w:t xml:space="preserve">GET /page-layouts/published</w:t>
-      </w:r>
-      <w:r>
-        <w:t xml:space="preserve"> </w:t>
-      </w:r>
-      <w:r>
-        <w:t xml:space="preserve">(tách khỏi endpoint quản trị có xác thực), kèm thời điểm cập nhật từng URL;</w:t>
+        <w:t xml:space="preserve">sinh động từ danh sách bố cục đã xuất bản qua một điểm cuối công khai chuyên dụng (tách khỏi nhóm điểm cuối quản trị có xác thực), kèm thời điểm cập nhật từng URL;</w:t>
       </w:r>
       <w:r>
         <w:t xml:space="preserve"> </w:t>
@@ -6081,34 +4522,7 @@
         <w:pStyle w:val="FirstParagraph"/>
       </w:pPr>
       <w:r>
-        <w:t xml:space="preserve">Ảnh giao diện dùng thành phần</w:t>
-      </w:r>
-      <w:r>
-        <w:t xml:space="preserve"> </w:t>
-      </w:r>
-      <w:r>
-        <w:rPr>
-          <w:rStyle w:val="VerbatimChar"/>
-        </w:rPr>
-        <w:t xml:space="preserve">next/image</w:t>
-      </w:r>
-      <w:r>
-        <w:t xml:space="preserve">: tự sinh nhiều kích cỡ, nạp trễ ngoài khung nhìn, và giữ chỗ kích thước tránh dịch chuyển bố cục (CLS). Ảnh nghi là phần tử LCP (ảnh hero, ảnh bìa đầu trang) được ưu tiên nạp trước. Ảnh trong thân bài di trú — vốn là HTML thô — được phân giải qua</w:t>
-      </w:r>
-      <w:r>
-        <w:t xml:space="preserve"> </w:t>
-      </w:r>
-      <w:r>
-        <w:rPr>
-          <w:rStyle w:val="VerbatimChar"/>
-        </w:rPr>
-        <w:t xml:space="preserve">resolveMediaUrl</w:t>
-      </w:r>
-      <w:r>
-        <w:t xml:space="preserve"> </w:t>
-      </w:r>
-      <w:r>
-        <w:t xml:space="preserve">về đúng máy chủ phương tiện và ép co giãn theo khung hiển thị.</w:t>
+        <w:t xml:space="preserve">Ảnh giao diện dùng thành phần ảnh tối ưu của Next.js: tự sinh nhiều kích cỡ, nạp trễ khi nằm ngoài khung nhìn, và giữ chỗ kích thước để tránh dịch chuyển bố cục (CLS). Ảnh nhiều khả năng là phần tử LCP (ảnh hero, ảnh bìa đầu trang) được ưu tiên nạp trước. Ảnh trong thân bài di trú — vốn là HTML thô — được phân giải về đúng máy chủ phương tiện và ép co giãn theo khung hiển thị.</w:t>
       </w:r>
     </w:p>
     <w:bookmarkEnd w:id="73"/>
@@ -6408,88 +4822,7 @@
         <w:pStyle w:val="FirstParagraph"/>
       </w:pPr>
       <w:r>
-        <w:t xml:space="preserve">Monorepo pnpm với ba workspace (mục 3.1) cho phép cài đặt phụ thuộc một lần, chia sẻ cấu hình và chạy lệnh hợp nhất từ gốc:</w:t>
-      </w:r>
-      <w:r>
-        <w:t xml:space="preserve"> </w:t>
-      </w:r>
-      <w:r>
-        <w:rPr>
-          <w:rStyle w:val="VerbatimChar"/>
-        </w:rPr>
-        <w:t xml:space="preserve">pnpm dev</w:t>
-      </w:r>
-      <w:r>
-        <w:t xml:space="preserve"> </w:t>
-      </w:r>
-      <w:r>
-        <w:t xml:space="preserve">(chạy đồng thời ba thành phần),</w:t>
-      </w:r>
-      <w:r>
-        <w:t xml:space="preserve"> </w:t>
-      </w:r>
-      <w:r>
-        <w:rPr>
-          <w:rStyle w:val="VerbatimChar"/>
-        </w:rPr>
-        <w:t xml:space="preserve">pnpm lint</w:t>
-      </w:r>
-      <w:r>
-        <w:t xml:space="preserve">,</w:t>
-      </w:r>
-      <w:r>
-        <w:t xml:space="preserve"> </w:t>
-      </w:r>
-      <w:r>
-        <w:rPr>
-          <w:rStyle w:val="VerbatimChar"/>
-        </w:rPr>
-        <w:t xml:space="preserve">pnpm tc</w:t>
-      </w:r>
-      <w:r>
-        <w:t xml:space="preserve"> </w:t>
-      </w:r>
-      <w:r>
-        <w:t xml:space="preserve">(kiểm tra kiểu),</w:t>
-      </w:r>
-      <w:r>
-        <w:t xml:space="preserve"> </w:t>
-      </w:r>
-      <w:r>
-        <w:rPr>
-          <w:rStyle w:val="VerbatimChar"/>
-        </w:rPr>
-        <w:t xml:space="preserve">pnpm test</w:t>
-      </w:r>
-      <w:r>
-        <w:t xml:space="preserve">,</w:t>
-      </w:r>
-      <w:r>
-        <w:t xml:space="preserve"> </w:t>
-      </w:r>
-      <w:r>
-        <w:rPr>
-          <w:rStyle w:val="VerbatimChar"/>
-        </w:rPr>
-        <w:t xml:space="preserve">pnpm build</w:t>
-      </w:r>
-      <w:r>
-        <w:t xml:space="preserve">. Quy ước xuyên suốt: mọi thay đổi phải qua đủ bốn cổng chất lượng trước khi hợp nhất; script</w:t>
-      </w:r>
-      <w:r>
-        <w:t xml:space="preserve"> </w:t>
-      </w:r>
-      <w:r>
-        <w:rPr>
-          <w:rStyle w:val="VerbatimChar"/>
-        </w:rPr>
-        <w:t xml:space="preserve">init.sh</w:t>
-      </w:r>
-      <w:r>
-        <w:t xml:space="preserve"> </w:t>
-      </w:r>
-      <w:r>
-        <w:t xml:space="preserve">ở gốc kho kiểm tra môi trường lành mạnh, bảo đảm phiên làm việc kế tiếp luôn khởi động lại được. Trang quản trị tích hợp Sentry theo dõi lỗi thời gian thực và Playwright cho kiểm thử đầu-cuối.</w:t>
+        <w:t xml:space="preserve">Kho mã nguồn hợp nhất với ba thành phần (mục 3.1) cho phép cài đặt thư viện phụ thuộc một lần, chia sẻ cấu hình, và chạy hợp nhất từ gốc kho các thao tác phát triển, kiểm tra mã, kiểm tra kiểu, kiểm thử và đóng gói. Quy ước xuyên suốt của dự án là mọi thay đổi phải vượt qua đủ bốn cổng chất lượng (kiểm tra mã, kiểm tra kiểu, kiểm thử đơn vị, đóng gói) trước khi hợp nhất; một kịch bản khởi động chuẩn ở gốc kho kiểm tra môi trường lành mạnh, bảo đảm phiên làm việc kế tiếp luôn khởi động lại được. Trang quản trị tích hợp Sentry theo dõi lỗi thời gian thực và Playwright cho kiểm thử đầu-cuối.</w:t>
       </w:r>
     </w:p>
     <w:bookmarkEnd w:id="77"/>
@@ -6507,121 +4840,7 @@
         <w:pStyle w:val="FirstParagraph"/>
       </w:pPr>
       <w:r>
-        <w:t xml:space="preserve">Mỗi thành phần có Dockerfile riêng; tệp</w:t>
-      </w:r>
-      <w:r>
-        <w:t xml:space="preserve"> </w:t>
-      </w:r>
-      <w:r>
-        <w:rPr>
-          <w:rStyle w:val="VerbatimChar"/>
-        </w:rPr>
-        <w:t xml:space="preserve">docker-compose.sandbox.yml</w:t>
-      </w:r>
-      <w:r>
-        <w:t xml:space="preserve"> </w:t>
-      </w:r>
-      <w:r>
-        <w:t xml:space="preserve">mô tả toàn bộ ngăn xếp triển khai gồm sáu dịch vụ:</w:t>
-      </w:r>
-      <w:r>
-        <w:t xml:space="preserve"> </w:t>
-      </w:r>
-      <w:r>
-        <w:rPr>
-          <w:rStyle w:val="VerbatimChar"/>
-        </w:rPr>
-        <w:t xml:space="preserve">db</w:t>
-      </w:r>
-      <w:r>
-        <w:t xml:space="preserve"> </w:t>
-      </w:r>
-      <w:r>
-        <w:t xml:space="preserve">(PostgreSQL 16, volume bền vững),</w:t>
-      </w:r>
-      <w:r>
-        <w:t xml:space="preserve"> </w:t>
-      </w:r>
-      <w:r>
-        <w:rPr>
-          <w:rStyle w:val="VerbatimChar"/>
-        </w:rPr>
-        <w:t xml:space="preserve">redis</w:t>
-      </w:r>
-      <w:r>
-        <w:t xml:space="preserve">,</w:t>
-      </w:r>
-      <w:r>
-        <w:t xml:space="preserve"> </w:t>
-      </w:r>
-      <w:r>
-        <w:rPr>
-          <w:rStyle w:val="VerbatimChar"/>
-        </w:rPr>
-        <w:t xml:space="preserve">db-setup</w:t>
-      </w:r>
-      <w:r>
-        <w:t xml:space="preserve"> </w:t>
-      </w:r>
-      <w:r>
-        <w:t xml:space="preserve">(dịch vụ chạy một lần: đẩy lược đồ Prisma và nạp dữ liệu khởi tạo),</w:t>
-      </w:r>
-      <w:r>
-        <w:t xml:space="preserve"> </w:t>
-      </w:r>
-      <w:r>
-        <w:rPr>
-          <w:rStyle w:val="VerbatimChar"/>
-        </w:rPr>
-        <w:t xml:space="preserve">backend</w:t>
-      </w:r>
-      <w:r>
-        <w:t xml:space="preserve"> </w:t>
-      </w:r>
-      <w:r>
-        <w:t xml:space="preserve">(:3001),</w:t>
-      </w:r>
-      <w:r>
-        <w:t xml:space="preserve"> </w:t>
-      </w:r>
-      <w:r>
-        <w:rPr>
-          <w:rStyle w:val="VerbatimChar"/>
-        </w:rPr>
-        <w:t xml:space="preserve">admin</w:t>
-      </w:r>
-      <w:r>
-        <w:t xml:space="preserve"> </w:t>
-      </w:r>
-      <w:r>
-        <w:t xml:space="preserve">(:3000) và</w:t>
-      </w:r>
-      <w:r>
-        <w:t xml:space="preserve"> </w:t>
-      </w:r>
-      <w:r>
-        <w:rPr>
-          <w:rStyle w:val="VerbatimChar"/>
-        </w:rPr>
-        <w:t xml:space="preserve">public</w:t>
-      </w:r>
-      <w:r>
-        <w:t xml:space="preserve"> </w:t>
-      </w:r>
-      <w:r>
-        <w:t xml:space="preserve">(:3002). Ngăn xếp tự chứa — không phụ thuộc dịch vụ bên ngoài — nên dựng được nguyên trạng trên bất kỳ máy chủ nào có Docker. Một điểm phụ thuộc chéo đáng chú ý: ứng dụng public dùng chung một số thành phần nguồn với admin (bí danh</w:t>
-      </w:r>
-      <w:r>
-        <w:t xml:space="preserve"> </w:t>
-      </w:r>
-      <w:r>
-        <w:rPr>
-          <w:rStyle w:val="VerbatimChar"/>
-        </w:rPr>
-        <w:t xml:space="preserve">@admin</w:t>
-      </w:r>
-      <w:r>
-        <w:t xml:space="preserve">), nên ảnh Docker của public phải build từ ngữ cảnh gốc kho với đầy đủ workspace.</w:t>
+        <w:t xml:space="preserve">Mỗi thành phần có tệp mô tả ảnh Docker riêng; tệp mô tả Docker Compose cho môi trường triển khai định nghĩa toàn bộ ngăn xếp gồm sáu dịch vụ: cơ sở dữ liệu PostgreSQL 16 với volume lưu trữ bền vững, Redis, một dịch vụ khởi tạo chạy một lần (đẩy lược đồ và nạp dữ liệu ban đầu), máy chủ API và hai ứng dụng web trên ba cổng 3000–3002. Ngăn xếp tự chứa — không phụ thuộc dịch vụ bên ngoài — nên dựng được nguyên trạng trên bất kỳ máy chủ nào có Docker. Một điểm phụ thuộc chéo đáng chú ý: trang công khai dùng chung một số thành phần giao diện với trang quản trị, nên ảnh Docker của nó phải đóng gói từ gốc kho với đầy đủ cả ba thành phần.</w:t>
       </w:r>
     </w:p>
     <w:p>
@@ -6659,22 +4878,7 @@
         <w:pStyle w:val="FirstParagraph"/>
       </w:pPr>
       <w:r>
-        <w:t xml:space="preserve">Máy chủ được cấp chạy CentOS 7.9 với glibc 2.17, trong khi Node.js 24 yêu cầu glibc ≥ 2.28 — Node không thể chạy trực tiếp trên máy. Ràng buộc này là lý do quyết định chọn triển khai toàn bộ bằng Docker: ứng dụng chạy trong ảnh chứa glibc mới, tách khỏi hệ điều hành chủ. Hai ràng buộc thực tế khác: CentOS 7 đã hết vòng đời nên kịch bản triển khai phải sửa nguồn gói yum về kho lưu trữ</w:t>
-      </w:r>
-      <w:r>
-        <w:t xml:space="preserve"> </w:t>
-      </w:r>
-      <w:r>
-        <w:rPr>
-          <w:rStyle w:val="VerbatimChar"/>
-        </w:rPr>
-        <w:t xml:space="preserve">vault.centos.org</w:t>
-      </w:r>
-      <w:r>
-        <w:t xml:space="preserve"> </w:t>
-      </w:r>
-      <w:r>
-        <w:t xml:space="preserve">trước khi cài Docker; máy chỉ có 4 GB RAM nên phải bật swap trước khi build ảnh (quá trình build Next.js có thể vượt RAM vật lý) và build tuần tự từng ảnh khi cần.</w:t>
+        <w:t xml:space="preserve">Máy chủ được cấp chạy CentOS 7.9 với glibc 2.17, trong khi Node.js 24 yêu cầu glibc ≥ 2.28 — Node không thể chạy trực tiếp trên máy. Ràng buộc này là lý do quyết định chọn triển khai toàn bộ bằng Docker: ứng dụng chạy trong ảnh chứa glibc mới, tách khỏi hệ điều hành chủ. Hai ràng buộc thực tế khác: CentOS 7 đã hết vòng đời nên kịch bản triển khai phải chuyển nguồn cài đặt gói về kho lưu trữ dài hạn của CentOS trước khi cài Docker; máy chỉ có 4 GB RAM nên phải bật bộ nhớ hoán đổi trước khi đóng gói ảnh (quá trình đóng gói Next.js có thể vượt RAM vật lý) và đóng gói tuần tự từng ảnh khi cần.</w:t>
       </w:r>
     </w:p>
     <w:bookmarkEnd w:id="79"/>
@@ -6692,22 +4896,7 @@
         <w:pStyle w:val="FirstParagraph"/>
       </w:pPr>
       <w:r>
-        <w:t xml:space="preserve">Cấu hình tách hoàn toàn khỏi mã nguồn theo biến môi trường: chuỗi kết nối PostgreSQL/Redis, các khóa bí mật JWT, tài khoản quản trị khởi tạo, danh sách origin được phép (CORS), token revalidate giữa backend và trang công khai, cùng các tích hợp tùy chọn (email SES cho OTP, Google OAuth, Sentry) — thiếu tích hợp tùy chọn hệ thống vẫn vận hành, chỉ tắt tính năng tương ứng. Tệp mẫu</w:t>
-      </w:r>
-      <w:r>
-        <w:t xml:space="preserve"> </w:t>
-      </w:r>
-      <w:r>
-        <w:rPr>
-          <w:rStyle w:val="VerbatimChar"/>
-        </w:rPr>
-        <w:t xml:space="preserve">.env.prod.example</w:t>
-      </w:r>
-      <w:r>
-        <w:t xml:space="preserve"> </w:t>
-      </w:r>
-      <w:r>
-        <w:t xml:space="preserve">liệt kê đầy đủ biến bắt buộc.</w:t>
+        <w:t xml:space="preserve">Cấu hình tách hoàn toàn khỏi mã nguồn theo biến môi trường: chuỗi kết nối PostgreSQL/Redis, các khóa bí mật JWT, tài khoản quản trị khởi tạo, danh sách origin được phép (CORS), mã bí mật cho tín hiệu làm mới giữa máy chủ API và trang công khai, cùng các tích hợp tùy chọn (dịch vụ gửi email cho OTP, Google OAuth, Sentry) — thiếu tích hợp tùy chọn hệ thống vẫn vận hành, chỉ tắt tính năng tương ứng. Một tệp mẫu đi kèm liệt kê đầy đủ các biến bắt buộc.</w:t>
       </w:r>
     </w:p>
     <w:bookmarkEnd w:id="80"/>
@@ -6725,22 +4914,7 @@
         <w:pStyle w:val="FirstParagraph"/>
       </w:pPr>
       <w:r>
-        <w:t xml:space="preserve">Dịch vụ</w:t>
-      </w:r>
-      <w:r>
-        <w:t xml:space="preserve"> </w:t>
-      </w:r>
-      <w:r>
-        <w:rPr>
-          <w:rStyle w:val="VerbatimChar"/>
-        </w:rPr>
-        <w:t xml:space="preserve">db-setup</w:t>
-      </w:r>
-      <w:r>
-        <w:t xml:space="preserve"> </w:t>
-      </w:r>
-      <w:r>
-        <w:t xml:space="preserve">bảo đảm cơ sở dữ liệu sẵn sàng ngay lần dựng đầu: đẩy lược đồ Prisma rồi chạy chuỗi seed (tài khoản quản trị cấp cao, danh mục widget, chuyên mục mặc định, bố cục trang chủ). Đáng chú ý, script seed trang chủ tái sử dụng đúng cấu trúc menu chín mục đã phục dựng từ hệ thống cũ, nên một hệ thống dựng mới từ đầu vẫn có thanh điều hướng chuẩn. Dữ liệu di trú (mục 3.7) nạp bằng bộ script riêng sau khi ngăn xếp chạy; kho phương tiện 3,9 GB đồng bộ bằng rsync do vượt khả năng đóng gói trong ảnh.</w:t>
+        <w:t xml:space="preserve">Dịch vụ khởi tạo bảo đảm cơ sở dữ liệu sẵn sàng ngay lần dựng đầu: đẩy lược đồ dữ liệu rồi nạp tuần tự dữ liệu ban đầu — tài khoản quản trị cấp cao, danh mục widget, chuyên mục mặc định và bố cục trang chủ. Đáng chú ý, bước nạp trang chủ tái sử dụng đúng cấu trúc menu chín mục đã phục dựng từ hệ thống cũ, nên một hệ thống dựng mới từ đầu vẫn có thanh điều hướng chuẩn. Dữ liệu di trú (mục 3.7) nạp bằng bộ script riêng sau khi ngăn xếp chạy; kho phương tiện 3,9 GB đồng bộ bằng công cụ truyền tệp do vượt khả năng đóng gói trong ảnh.</w:t>
       </w:r>
     </w:p>
     <w:bookmarkEnd w:id="81"/>
@@ -6758,37 +4932,7 @@
         <w:pStyle w:val="FirstParagraph"/>
       </w:pPr>
       <w:r>
-        <w:t xml:space="preserve">Kịch bản</w:t>
-      </w:r>
-      <w:r>
-        <w:t xml:space="preserve"> </w:t>
-      </w:r>
-      <w:r>
-        <w:rPr>
-          <w:rStyle w:val="VerbatimChar"/>
-        </w:rPr>
-        <w:t xml:space="preserve">deploy/deploy.sh</w:t>
-      </w:r>
-      <w:r>
-        <w:t xml:space="preserve"> </w:t>
-      </w:r>
-      <w:r>
-        <w:t xml:space="preserve">gói toàn bộ quy trình trên máy chủ mới: sửa kho yum → cài Docker → tạo swap → mở tường lửa cho ba cổng ứng dụng → build và khởi động ngăn xếp compose. Người vận hành chỉ cần đồng bộ mã nguồn, điền hai tệp biến môi trường và chạy một lệnh. Tài liệu</w:t>
-      </w:r>
-      <w:r>
-        <w:t xml:space="preserve"> </w:t>
-      </w:r>
-      <w:r>
-        <w:rPr>
-          <w:rStyle w:val="VerbatimChar"/>
-        </w:rPr>
-        <w:t xml:space="preserve">deploy/DEPLOY.md</w:t>
-      </w:r>
-      <w:r>
-        <w:t xml:space="preserve"> </w:t>
-      </w:r>
-      <w:r>
-        <w:t xml:space="preserve">ghi lại quy trình, các lỗi đặc thù CentOS 7 đã gặp cùng cách xử lý (kho gói chết, SELinux chặn volume, tràn bộ nhớ khi build) và phương án dự phòng build ảnh trên máy phát triển rồi chuyển sang máy chủ.</w:t>
+        <w:t xml:space="preserve">Một kịch bản triển khai duy nhất gói toàn bộ quy trình trên máy chủ mới: sửa nguồn cài đặt gói, cài Docker, tạo bộ nhớ hoán đổi, mở tường lửa cho ba cổng ứng dụng, rồi đóng gói và khởi động toàn bộ ngăn xếp. Người vận hành chỉ cần đồng bộ mã nguồn, điền hai tệp biến môi trường và chạy một lệnh. Tài liệu triển khai đi kèm ghi lại quy trình, các lỗi đặc thù của CentOS 7 đã gặp cùng cách xử lý (nguồn gói ngừng hoạt động, cơ chế SELinux chặn truy cập, tràn bộ nhớ khi đóng gói) và phương án dự phòng đóng gói ảnh trên máy phát triển rồi chuyển sang máy chủ.</w:t>
       </w:r>
     </w:p>
     <w:p>
@@ -6989,54 +5133,18 @@
               <w:pStyle w:val="Compact"/>
             </w:pPr>
             <w:r>
-              <w:t xml:space="preserve">Kiểm tra kiểu / lint / build</w:t>
-            </w:r>
-          </w:p>
-        </w:tc>
-        <w:tc>
-          <w:tcPr/>
-          <w:p>
-            <w:pPr>
-              <w:pStyle w:val="Compact"/>
-            </w:pPr>
-            <w:r>
-              <w:t xml:space="preserve">TypeScript</w:t>
-            </w:r>
-            <w:r>
-              <w:t xml:space="preserve"> </w:t>
-            </w:r>
-            <w:r>
-              <w:rPr>
-                <w:rStyle w:val="VerbatimChar"/>
-              </w:rPr>
-              <w:t xml:space="preserve">tsc</w:t>
-            </w:r>
-            <w:r>
-              <w:t xml:space="preserve">, Biome,</w:t>
-            </w:r>
-            <w:r>
-              <w:t xml:space="preserve"> </w:t>
-            </w:r>
-            <w:r>
-              <w:rPr>
-                <w:rStyle w:val="VerbatimChar"/>
-              </w:rPr>
-              <w:t xml:space="preserve">next build</w:t>
-            </w:r>
-            <w:r>
-              <w:t xml:space="preserve"> </w:t>
-            </w:r>
-            <w:r>
-              <w:t xml:space="preserve">/</w:t>
-            </w:r>
-            <w:r>
-              <w:t xml:space="preserve"> </w:t>
-            </w:r>
-            <w:r>
-              <w:rPr>
-                <w:rStyle w:val="VerbatimChar"/>
-              </w:rPr>
-              <w:t xml:space="preserve">nest build</w:t>
+              <w:t xml:space="preserve">Kiểm tra kiểu / lint / đóng gói</w:t>
+            </w:r>
+          </w:p>
+        </w:tc>
+        <w:tc>
+          <w:tcPr/>
+          <w:p>
+            <w:pPr>
+              <w:pStyle w:val="Compact"/>
+            </w:pPr>
+            <w:r>
+              <w:t xml:space="preserve">Trình kiểm tra kiểu TypeScript, Biome, đóng gói production</w:t>
             </w:r>
           </w:p>
         </w:tc>
@@ -7234,52 +5342,7 @@
         <w:pStyle w:val="FirstParagraph"/>
       </w:pPr>
       <w:r>
-        <w:t xml:space="preserve">Các phép đo hiệu năng và SEO nhắm vào bốn trang đại diện cho bốn dạng kết xuất của trang công khai: trang chủ (</w:t>
-      </w:r>
-      <w:r>
-        <w:rPr>
-          <w:rStyle w:val="VerbatimChar"/>
-        </w:rPr>
-        <w:t xml:space="preserve">/vi</w:t>
-      </w:r>
-      <w:r>
-        <w:t xml:space="preserve">, bố cục Visual Builder đầy đủ), một bài viết di trú với nội dung HTML và ảnh gốc từ hệ thống cũ (</w:t>
-      </w:r>
-      <w:r>
-        <w:rPr>
-          <w:rStyle w:val="VerbatimChar"/>
-        </w:rPr>
-        <w:t xml:space="preserve">/vi/tin-tuc/usactalk-06-…</w:t>
-      </w:r>
-      <w:r>
-        <w:t xml:space="preserve">), trang riêng bộ môn (</w:t>
-      </w:r>
-      <w:r>
-        <w:rPr>
-          <w:rStyle w:val="VerbatimChar"/>
-        </w:rPr>
-        <w:t xml:space="preserve">/vi/vat-ly-ung-dung</w:t>
-      </w:r>
-      <w:r>
-        <w:t xml:space="preserve">), và một trang nội dung tĩnh tái tạo từ hệ thống cũ (</w:t>
-      </w:r>
-      <w:r>
-        <w:rPr>
-          <w:rStyle w:val="VerbatimChar"/>
-        </w:rPr>
-        <w:t xml:space="preserve">/vi/gioi-thieu</w:t>
-      </w:r>
-      <w:r>
-        <w:t xml:space="preserve">). Trang chủ website cũ (</w:t>
-      </w:r>
-      <w:r>
-        <w:rPr>
-          <w:rStyle w:val="VerbatimChar"/>
-        </w:rPr>
-        <w:t xml:space="preserve">https://phys.hcmus.edu.vn/</w:t>
-      </w:r>
-      <w:r>
-        <w:t xml:space="preserve">) được đo làm mốc so sánh (mục 4.7.1).</w:t>
+        <w:t xml:space="preserve">Các phép đo hiệu năng và SEO nhắm vào bốn trang đại diện cho bốn dạng kết xuất của trang công khai: trang chủ (bố cục Visual Builder đầy đủ), một bài viết di trú với nội dung HTML và ảnh gốc từ hệ thống cũ, trang riêng của một bộ môn (Vật lý Ứng dụng), và một trang nội dung tĩnh tái tạo từ hệ thống cũ (trang giới thiệu). Trang chủ website cũ (phys.hcmus.edu.vn) được đo làm mốc so sánh (mục 4.7.1).</w:t>
       </w:r>
     </w:p>
     <w:bookmarkEnd w:id="87"/>
@@ -7315,7 +5378,7 @@
         <w:pStyle w:val="FirstParagraph"/>
       </w:pPr>
       <w:r>
-        <w:t xml:space="preserve">Bộ kiểm thử đơn vị backend gồm</w:t>
+        <w:t xml:space="preserve">Bộ kiểm thử đơn vị phía máy chủ gồm</w:t>
       </w:r>
       <w:r>
         <w:t xml:space="preserve"> </w:t>
@@ -7325,79 +5388,10 @@
           <w:b/>
           <w:bCs/>
         </w:rPr>
-        <w:t xml:space="preserve">40 ca kiểm thử trong 4 tệp</w:t>
-      </w:r>
-      <w:r>
-        <w:t xml:space="preserve">, tập trung vào hai vùng logic rủi ro cao nhất: quy tắc phân quyền (</w:t>
-      </w:r>
-      <w:r>
-        <w:rPr>
-          <w:rStyle w:val="VerbatimChar"/>
-        </w:rPr>
-        <w:t xml:space="preserve">helpers.spec.ts</w:t>
-      </w:r>
-      <w:r>
-        <w:t xml:space="preserve"> </w:t>
-      </w:r>
-      <w:r>
-        <w:t xml:space="preserve">— các hàm</w:t>
-      </w:r>
-      <w:r>
-        <w:t xml:space="preserve"> </w:t>
-      </w:r>
-      <w:r>
-        <w:rPr>
-          <w:rStyle w:val="VerbatimChar"/>
-        </w:rPr>
-        <w:t xml:space="preserve">departmentScopeWhere</w:t>
-      </w:r>
-      <w:r>
-        <w:t xml:space="preserve">,</w:t>
-      </w:r>
-      <w:r>
-        <w:t xml:space="preserve"> </w:t>
-      </w:r>
-      <w:r>
-        <w:rPr>
-          <w:rStyle w:val="VerbatimChar"/>
-        </w:rPr>
-        <w:t xml:space="preserve">mediaScopeWhere</w:t>
-      </w:r>
-      <w:r>
-        <w:t xml:space="preserve">,</w:t>
-      </w:r>
-      <w:r>
-        <w:t xml:space="preserve"> </w:t>
-      </w:r>
-      <w:r>
-        <w:rPr>
-          <w:rStyle w:val="VerbatimChar"/>
-        </w:rPr>
-        <w:t xml:space="preserve">canAccessDepartment</w:t>
-      </w:r>
-      <w:r>
-        <w:t xml:space="preserve">) và nghiệp vụ bố cục – phiên bản (</w:t>
-      </w:r>
-      <w:r>
-        <w:rPr>
-          <w:rStyle w:val="VerbatimChar"/>
-        </w:rPr>
-        <w:t xml:space="preserve">page-layout.service.spec.ts</w:t>
-      </w:r>
-      <w:r>
-        <w:t xml:space="preserve"> </w:t>
-      </w:r>
-      <w:r>
-        <w:t xml:space="preserve">— thứ tự chụp ảnh phiên bản khi xuất bản, kiểm tra xung đột slug trước khi khôi phục, tự bổ sung phiên bản đầu cho bố cục cũ, chụp phiên bản khi cron xuất bản theo lịch), cùng nghiệp vụ quản lý quản trị viên (</w:t>
-      </w:r>
-      <w:r>
-        <w:rPr>
-          <w:rStyle w:val="VerbatimChar"/>
-        </w:rPr>
-        <w:t xml:space="preserve">admin.service.spec.ts</w:t>
-      </w:r>
-      <w:r>
-        <w:t xml:space="preserve">). Kết quả chạy ngày 09/07/2026:</w:t>
+        <w:t xml:space="preserve">40 ca kiểm thử trong 4 nhóm</w:t>
+      </w:r>
+      <w:r>
+        <w:t xml:space="preserve">, tập trung vào hai vùng logic rủi ro cao nhất. Nhóm thứ nhất bao phủ ba hàm quy tắc phân quyền theo bộ môn với mọi tổ hợp vai trò và đơn vị. Nhóm thứ hai bao phủ nghiệp vụ bố cục – phiên bản: thứ tự chụp ảnh phiên bản khi xuất bản, kiểm tra xung đột đường dẫn trước khi khôi phục, tự bổ sung phiên bản đầu cho bố cục cũ, và chụp phiên bản khi xuất bản theo lịch. Hai nhóm còn lại kiểm thử nghiệp vụ quản lý quản trị viên và điểm cuối cơ sở của ứng dụng. Kết quả chạy ngày 09/07/2026:</w:t>
       </w:r>
       <w:r>
         <w:t xml:space="preserve"> </w:t>
@@ -7413,46 +5407,7 @@
         <w:t xml:space="preserve"> </w:t>
       </w:r>
       <w:r>
-        <w:t xml:space="preserve">(Vitest 4.1.5, tổng thời gian 1,28 giây). Song song, cả ba workspace đạt cổng chất lượng:</w:t>
-      </w:r>
-      <w:r>
-        <w:t xml:space="preserve"> </w:t>
-      </w:r>
-      <w:r>
-        <w:rPr>
-          <w:rStyle w:val="VerbatimChar"/>
-        </w:rPr>
-        <w:t xml:space="preserve">tsc --noEmit</w:t>
-      </w:r>
-      <w:r>
-        <w:t xml:space="preserve"> </w:t>
-      </w:r>
-      <w:r>
-        <w:t xml:space="preserve">không lỗi,</w:t>
-      </w:r>
-      <w:r>
-        <w:t xml:space="preserve"> </w:t>
-      </w:r>
-      <w:r>
-        <w:rPr>
-          <w:rStyle w:val="VerbatimChar"/>
-        </w:rPr>
-        <w:t xml:space="preserve">next build</w:t>
-      </w:r>
-      <w:r>
-        <w:t xml:space="preserve">/</w:t>
-      </w:r>
-      <w:r>
-        <w:rPr>
-          <w:rStyle w:val="VerbatimChar"/>
-        </w:rPr>
-        <w:t xml:space="preserve">nest build</w:t>
-      </w:r>
-      <w:r>
-        <w:t xml:space="preserve"> </w:t>
-      </w:r>
-      <w:r>
-        <w:t xml:space="preserve">thành công.</w:t>
+        <w:t xml:space="preserve">(Vitest 4.1.5, tổng thời gian 1,28 giây). Song song, cả ba thành phần đạt cổng chất lượng: kiểm tra kiểu không lỗi, đóng gói production thành công.</w:t>
       </w:r>
     </w:p>
     <w:bookmarkEnd w:id="89"/>
@@ -7615,16 +5570,7 @@
               <w:pStyle w:val="Compact"/>
             </w:pPr>
             <w:r>
-              <w:t xml:space="preserve">Thẻ VI và EN hiển thị đúng bản dịch tương ứng; ảnh bìa nạp từ</w:t>
-            </w:r>
-            <w:r>
-              <w:t xml:space="preserve"> </w:t>
-            </w:r>
-            <w:r>
-              <w:rPr>
-                <w:rStyle w:val="VerbatimChar"/>
-              </w:rPr>
-              <w:t xml:space="preserve">/uploads/legacy/</w:t>
+              <w:t xml:space="preserve">Thẻ VI và EN hiển thị đúng bản dịch tương ứng; ảnh bìa nạp từ kho tệp di trú</w:t>
             </w:r>
           </w:p>
         </w:tc>
@@ -7670,31 +5616,7 @@
               <w:pStyle w:val="Compact"/>
             </w:pPr>
             <w:r>
-              <w:rPr>
-                <w:rStyle w:val="VerbatimChar"/>
-              </w:rPr>
-              <w:t xml:space="preserve">syncAttachedLayouts</w:t>
-            </w:r>
-            <w:r>
-              <w:t xml:space="preserve"> </w:t>
-            </w:r>
-            <w:r>
-              <w:t xml:space="preserve">cập nhật mọi bố cục có</w:t>
-            </w:r>
-            <w:r>
-              <w:t xml:space="preserve"> </w:t>
-            </w:r>
-            <w:r>
-              <w:rPr>
-                <w:rStyle w:val="VerbatimChar"/>
-              </w:rPr>
-              <w:t xml:space="preserve">sourcePostId</w:t>
-            </w:r>
-            <w:r>
-              <w:t xml:space="preserve"> </w:t>
-            </w:r>
-            <w:r>
-              <w:t xml:space="preserve">tương ứng</w:t>
+              <w:t xml:space="preserve">Mọi bố cục gắn với bài viết được đồng bộ nội dung mới</w:t>
             </w:r>
           </w:p>
         </w:tc>
@@ -7740,22 +5662,7 @@
               <w:pStyle w:val="Compact"/>
             </w:pPr>
             <w:r>
-              <w:t xml:space="preserve">Cây</w:t>
-            </w:r>
-            <w:r>
-              <w:t xml:space="preserve"> </w:t>
-            </w:r>
-            <w:r>
-              <w:rPr>
-                <w:rStyle w:val="VerbatimChar"/>
-              </w:rPr>
-              <w:t xml:space="preserve">puckData</w:t>
-            </w:r>
-            <w:r>
-              <w:t xml:space="preserve"> </w:t>
-            </w:r>
-            <w:r>
-              <w:t xml:space="preserve">lưu đúng; xem trước khớp kết xuất công khai</w:t>
+              <w:t xml:space="preserve">Cây bố cục lưu đúng; xem trước khớp kết xuất công khai</w:t>
             </w:r>
           </w:p>
         </w:tc>
@@ -7887,31 +5794,7 @@
         <w:pStyle w:val="FirstParagraph"/>
       </w:pPr>
       <w:r>
-        <w:t xml:space="preserve">Kịch bản sử dụng ba danh tính: quản trị viên cấp cao, quản trị viên văn phòng khoa, và quản trị viên bộ môn Vật lý Ứng dụng (tài khoản</w:t>
-      </w:r>
-      <w:r>
-        <w:t xml:space="preserve"> </w:t>
-      </w:r>
-      <w:r>
-        <w:rPr>
-          <w:rStyle w:val="VerbatimChar"/>
-        </w:rPr>
-        <w:t xml:space="preserve">vlud_admin</w:t>
-      </w:r>
-      <w:r>
-        <w:t xml:space="preserve">, JWT mang</w:t>
-      </w:r>
-      <w:r>
-        <w:t xml:space="preserve"> </w:t>
-      </w:r>
-      <w:r>
-        <w:rPr>
-          <w:rStyle w:val="VerbatimChar"/>
-        </w:rPr>
-        <w:t xml:space="preserve">departmentId = dept_legacy_6</w:t>
-      </w:r>
-      <w:r>
-        <w:t xml:space="preserve">). Kết quả kiểm tra trực tiếp trên API ghi trong Bảng 4.3.</w:t>
+        <w:t xml:space="preserve">Kịch bản sử dụng ba danh tính: quản trị viên cấp cao, quản trị viên văn phòng khoa, và một quản trị viên thuộc bộ môn Vật lý Ứng dụng (mã thông báo đăng nhập mang đúng nhãn bộ môn này). Kết quả kiểm tra trực tiếp trên API ghi trong Bảng 4.3.</w:t>
       </w:r>
     </w:p>
     <w:p>
@@ -8007,25 +5890,7 @@
               <w:pStyle w:val="Compact"/>
             </w:pPr>
             <w:r>
-              <w:rPr>
-                <w:rStyle w:val="VerbatimChar"/>
-              </w:rPr>
-              <w:t xml:space="preserve">vlud_admin</w:t>
-            </w:r>
-            <w:r>
-              <w:t xml:space="preserve"> </w:t>
-            </w:r>
-            <w:r>
-              <w:t xml:space="preserve">gọi</w:t>
-            </w:r>
-            <w:r>
-              <w:t xml:space="preserve"> </w:t>
-            </w:r>
-            <w:r>
-              <w:rPr>
-                <w:rStyle w:val="VerbatimChar"/>
-              </w:rPr>
-              <w:t xml:space="preserve">GET /posts</w:t>
+              <w:t xml:space="preserve">Quản trị viên bộ môn liệt kê danh sách bài viết</w:t>
             </w:r>
           </w:p>
         </w:tc>
@@ -8047,16 +5912,7 @@
               <w:pStyle w:val="Compact"/>
             </w:pPr>
             <w:r>
-              <w:t xml:space="preserve">Đạt — trả về 32 bài, toàn bộ thuộc</w:t>
-            </w:r>
-            <w:r>
-              <w:t xml:space="preserve"> </w:t>
-            </w:r>
-            <w:r>
-              <w:rPr>
-                <w:rStyle w:val="VerbatimChar"/>
-              </w:rPr>
-              <w:t xml:space="preserve">dept_legacy_6</w:t>
+              <w:t xml:space="preserve">Đạt — trả về 32 bài, toàn bộ thuộc đúng bộ môn</w:t>
             </w:r>
           </w:p>
         </w:tc>
@@ -8080,16 +5936,7 @@
               <w:pStyle w:val="Compact"/>
             </w:pPr>
             <w:r>
-              <w:rPr>
-                <w:rStyle w:val="VerbatimChar"/>
-              </w:rPr>
-              <w:t xml:space="preserve">vlud_admin</w:t>
-            </w:r>
-            <w:r>
-              <w:t xml:space="preserve"> </w:t>
-            </w:r>
-            <w:r>
-              <w:t xml:space="preserve">đọc chi tiết bài viết của bộ môn mình</w:t>
+              <w:t xml:space="preserve">Quản trị viên bộ môn đọc chi tiết bài viết của bộ môn mình</w:t>
             </w:r>
           </w:p>
         </w:tc>
@@ -8135,16 +5982,7 @@
               <w:pStyle w:val="Compact"/>
             </w:pPr>
             <w:r>
-              <w:rPr>
-                <w:rStyle w:val="VerbatimChar"/>
-              </w:rPr>
-              <w:t xml:space="preserve">vlud_admin</w:t>
-            </w:r>
-            <w:r>
-              <w:t xml:space="preserve"> </w:t>
-            </w:r>
-            <w:r>
-              <w:t xml:space="preserve">đọc bài viết của bộ môn khác (Vật lý Lý thuyết)</w:t>
+              <w:t xml:space="preserve">Quản trị viên bộ môn đọc bài viết của bộ môn khác (Vật lý Lý thuyết)</w:t>
             </w:r>
           </w:p>
         </w:tc>
@@ -8190,16 +6028,7 @@
               <w:pStyle w:val="Compact"/>
             </w:pPr>
             <w:r>
-              <w:rPr>
-                <w:rStyle w:val="VerbatimChar"/>
-              </w:rPr>
-              <w:t xml:space="preserve">vlud_admin</w:t>
-            </w:r>
-            <w:r>
-              <w:t xml:space="preserve"> </w:t>
-            </w:r>
-            <w:r>
-              <w:t xml:space="preserve">mở thư viện phương tiện</w:t>
+              <w:t xml:space="preserve">Quản trị viên bộ môn mở thư viện phương tiện</w:t>
             </w:r>
           </w:p>
         </w:tc>
@@ -8245,39 +6074,18 @@
               <w:pStyle w:val="Compact"/>
             </w:pPr>
             <w:r>
-              <w:t xml:space="preserve">Tài khoản ADMIN truy cập trang quản lý quản trị viên</w:t>
-            </w:r>
-            <w:r>
-              <w:t xml:space="preserve"> </w:t>
-            </w:r>
-            <w:r>
-              <w:rPr>
-                <w:rStyle w:val="VerbatimChar"/>
-              </w:rPr>
-              <w:t xml:space="preserve">/admin/admins</w:t>
-            </w:r>
-          </w:p>
-        </w:tc>
-        <w:tc>
-          <w:tcPr/>
-          <w:p>
-            <w:pPr>
-              <w:pStyle w:val="Compact"/>
-            </w:pPr>
-            <w:r>
-              <w:t xml:space="preserve">Bị chuyển hướng; API trả 403 (</w:t>
-            </w:r>
-            <w:r>
-              <w:rPr>
-                <w:rStyle w:val="VerbatimChar"/>
-              </w:rPr>
-              <w:t xml:space="preserve">@Roles(SuperAdmin)</w:t>
-            </w:r>
-            <w:r>
-              <w:t xml:space="preserve"> </w:t>
-            </w:r>
-            <w:r>
-              <w:t xml:space="preserve">cấp lớp)</w:t>
+              <w:t xml:space="preserve">Quản trị viên thường truy cập trang quản lý quản trị viên</w:t>
+            </w:r>
+          </w:p>
+        </w:tc>
+        <w:tc>
+          <w:tcPr/>
+          <w:p>
+            <w:pPr>
+              <w:pStyle w:val="Compact"/>
+            </w:pPr>
+            <w:r>
+              <w:t xml:space="preserve">Bị chuyển hướng; API trả 403 (khai báo quyền ở mức toàn phân hệ)</w:t>
             </w:r>
           </w:p>
         </w:tc>
@@ -8443,16 +6251,7 @@
               <w:pStyle w:val="Compact"/>
             </w:pPr>
             <w:r>
-              <w:t xml:space="preserve">Xuất bản bài viết theo mẫu (</w:t>
-            </w:r>
-            <w:r>
-              <w:rPr>
-                <w:rStyle w:val="VerbatimChar"/>
-              </w:rPr>
-              <w:t xml:space="preserve">clone-into-layout</w:t>
-            </w:r>
-            <w:r>
-              <w:t xml:space="preserve">)</w:t>
+              <w:t xml:space="preserve">Xuất bản bài viết theo mẫu</w:t>
             </w:r>
           </w:p>
         </w:tc>
@@ -8509,28 +6308,7 @@
               <w:pStyle w:val="Compact"/>
             </w:pPr>
             <w:r>
-              <w:rPr>
-                <w:rStyle w:val="VerbatimChar"/>
-              </w:rPr>
-              <w:t xml:space="preserve">publishedPuckData</w:t>
-            </w:r>
-            <w:r>
-              <w:t xml:space="preserve"> </w:t>
-            </w:r>
-            <w:r>
-              <w:t xml:space="preserve">chụp từ</w:t>
-            </w:r>
-            <w:r>
-              <w:t xml:space="preserve"> </w:t>
-            </w:r>
-            <w:r>
-              <w:rPr>
-                <w:rStyle w:val="VerbatimChar"/>
-              </w:rPr>
-              <w:t xml:space="preserve">puckData</w:t>
-            </w:r>
-            <w:r>
-              <w:t xml:space="preserve">; trang công khai phản ánh sau revalidate; sinh bản ghi phiên bản CURRENT, bản trước chuyển ARCHIVED</w:t>
+              <w:t xml:space="preserve">Bản công khai chụp từ bản nháp; trang công khai phản ánh sau tín hiệu làm mới; sinh bản ghi phiên bản hiện hành, bản trước chuyển lưu trữ</w:t>
             </w:r>
           </w:p>
         </w:tc>
@@ -8962,19 +6740,7 @@
               <w:pStyle w:val="Compact"/>
             </w:pPr>
             <w:r>
-              <w:t xml:space="preserve">upsert theo</w:t>
-            </w:r>
-            <w:r>
-              <w:t xml:space="preserve"> </w:t>
-            </w:r>
-            <w:r>
-              <w:rPr>
-                <w:rStyle w:val="VerbatimChar"/>
-              </w:rPr>
-              <w:t xml:space="preserve">legacyId</w:t>
-            </w:r>
-            <w:r>
-              <w:t xml:space="preserve">, chạy lặp không tạo bản sao</w:t>
+              <w:t xml:space="preserve">ghi đè theo khóa gốc, chạy lặp không tạo bản sao</w:t>
             </w:r>
           </w:p>
         </w:tc>
@@ -9204,22 +6970,7 @@
               <w:pStyle w:val="Compact"/>
             </w:pPr>
             <w:r>
-              <w:t xml:space="preserve">từ</w:t>
-            </w:r>
-            <w:r>
-              <w:t xml:space="preserve"> </w:t>
-            </w:r>
-            <w:r>
-              <w:rPr>
-                <w:rStyle w:val="VerbatimChar"/>
-              </w:rPr>
-              <w:t xml:space="preserve">posts.deptid</w:t>
-            </w:r>
-            <w:r>
-              <w:t xml:space="preserve"> </w:t>
-            </w:r>
-            <w:r>
-              <w:t xml:space="preserve">gốc</w:t>
+              <w:t xml:space="preserve">từ mã bộ môn gốc của nguồn</w:t>
             </w:r>
           </w:p>
         </w:tc>
@@ -9265,34 +7016,7 @@
               <w:pStyle w:val="Compact"/>
             </w:pPr>
             <w:r>
-              <w:t xml:space="preserve">kiểm tra mẫu:</w:t>
-            </w:r>
-            <w:r>
-              <w:t xml:space="preserve"> </w:t>
-            </w:r>
-            <w:r>
-              <w:rPr>
-                <w:rStyle w:val="VerbatimChar"/>
-              </w:rPr>
-              <w:t xml:space="preserve">/vi/tin-tuc/&lt;x&gt;</w:t>
-            </w:r>
-            <w:r>
-              <w:t xml:space="preserve"> </w:t>
-            </w:r>
-            <w:r>
-              <w:t xml:space="preserve">→ 308 →</w:t>
-            </w:r>
-            <w:r>
-              <w:t xml:space="preserve"> </w:t>
-            </w:r>
-            <w:r>
-              <w:rPr>
-                <w:rStyle w:val="VerbatimChar"/>
-              </w:rPr>
-              <w:t xml:space="preserve">/vi/vat-ly-ung-dung/tin-tuc/&lt;x&gt;</w:t>
-            </w:r>
-            <w:r>
-              <w:t xml:space="preserve">, URL mới trả 200</w:t>
+              <w:t xml:space="preserve">kiểm tra mẫu: URL phẳng cũ trả 308 về URL mang tiền tố bộ môn, URL mới trả 200</w:t>
             </w:r>
           </w:p>
         </w:tc>
@@ -9432,15 +7156,6 @@
             <w:r>
               <w:t xml:space="preserve">Trang chủ</w:t>
             </w:r>
-            <w:r>
-              <w:t xml:space="preserve"> </w:t>
-            </w:r>
-            <w:r>
-              <w:rPr>
-                <w:rStyle w:val="VerbatimChar"/>
-              </w:rPr>
-              <w:t xml:space="preserve">/vi</w:t>
-            </w:r>
           </w:p>
         </w:tc>
         <w:tc>
@@ -9797,19 +7512,7 @@
         <w:pStyle w:val="BodyText"/>
       </w:pPr>
       <w:r>
-        <w:t xml:space="preserve">Kết quả cho thấy các biện pháp thiết kế tại mục 3.8 phát huy tác dụng rõ ở hai nhóm chỉ số. Độ ổn định bố cục gần như tuyệt đối trên các trang do hệ thống kiểm soát toàn bộ (CLS = 0,000, so với 0,243 của trang chủ website cũ) — kết quả trực tiếp của việc giữ chỗ kích thước ảnh qua</w:t>
-      </w:r>
-      <w:r>
-        <w:t xml:space="preserve"> </w:t>
-      </w:r>
-      <w:r>
-        <w:rPr>
-          <w:rStyle w:val="VerbatimChar"/>
-        </w:rPr>
-        <w:t xml:space="preserve">next/image</w:t>
-      </w:r>
-      <w:r>
-        <w:t xml:space="preserve">. Thời gian hiển thị nội dung đầu tiên đều dưới 1,4 giây và Speed Index từ 1,1 đến 2,9 giây, phản ánh hiệu quả của kết xuất HTML sẵn phía máy chủ.</w:t>
+        <w:t xml:space="preserve">Kết quả cho thấy các biện pháp thiết kế tại mục 3.8 phát huy tác dụng rõ ở hai nhóm chỉ số. Độ ổn định bố cục gần như tuyệt đối trên các trang do hệ thống kiểm soát toàn bộ (CLS = 0,000, so với 0,243 của trang chủ website cũ) — kết quả trực tiếp của việc giữ chỗ kích thước ảnh của thành phần ảnh tối ưu. Thời gian hiển thị nội dung đầu tiên đều dưới 1,4 giây và Speed Index từ 1,1 đến 2,9 giây, phản ánh hiệu quả của kết xuất HTML sẵn phía máy chủ.</w:t>
       </w:r>
     </w:p>
     <w:p>
@@ -9817,22 +7520,7 @@
         <w:pStyle w:val="BodyText"/>
       </w:pPr>
       <w:r>
-        <w:t xml:space="preserve">Ở chiều ngược lại, số liệu cũng chỉ ra hai điểm cần cải thiện mà chúng tôi ghi nhận trung thực. Thứ nhất, LCP của ba trang bố cục (4,2–6,2 giây) chưa đạt ngưỡng tốt: phần tử LCP là ảnh nền hero khổ lớn, hiện chưa được nén đủ mạnh cho điều kiện Slow 4G — hướng xử lý là chuyển ảnh hero sang định dạng AVIF/WebP kích thước theo khung nhìn. Thứ hai, trang bài viết di trú tuy có LCP tốt nhất (2,58 giây) nhưng TBT lên tới 1.963 ms và CLS 0,179: thân bài HTML giữ nguyên từ hệ thống cũ chứa ảnh gốc độ phân giải đầy đủ không khai báo kích thước, nằm ngoài đường tối ưu</w:t>
-      </w:r>
-      <w:r>
-        <w:t xml:space="preserve"> </w:t>
-      </w:r>
-      <w:r>
-        <w:rPr>
-          <w:rStyle w:val="VerbatimChar"/>
-        </w:rPr>
-        <w:t xml:space="preserve">next/image</w:t>
-      </w:r>
-      <w:r>
-        <w:t xml:space="preserve"> </w:t>
-      </w:r>
-      <w:r>
-        <w:t xml:space="preserve">(hạn chế đã nêu tại mục 3.7.3). Đây là cái giá của quyết định giữ nguyên vẹn nội dung di trú; biện pháp khắc phục (nén lại kho ảnh legacy, bổ sung thuộc tính kích thước khi làm sạch HTML) được đưa vào kiến nghị.</w:t>
+        <w:t xml:space="preserve">Ở chiều ngược lại, số liệu cũng chỉ ra hai điểm cần cải thiện mà chúng tôi ghi nhận trung thực. Thứ nhất, LCP của ba trang bố cục (4,2–6,2 giây) chưa đạt ngưỡng tốt: phần tử LCP là ảnh nền hero khổ lớn, hiện chưa được nén đủ mạnh cho điều kiện Slow 4G — hướng xử lý là chuyển ảnh hero sang định dạng AVIF/WebP kích thước theo khung nhìn. Thứ hai, trang bài viết di trú tuy có LCP tốt nhất (2,58 giây) nhưng TBT lên tới 1.963 ms và CLS 0,179: thân bài HTML giữ nguyên từ hệ thống cũ chứa ảnh gốc độ phân giải đầy đủ không khai báo kích thước, nằm ngoài đường tối ưu ảnh của hệ thống (hạn chế đã nêu tại mục 3.7.3). Đây là cái giá của quyết định giữ nguyên vẹn nội dung di trú; biện pháp khắc phục (nén lại kho ảnh legacy, bổ sung thuộc tính kích thước khi làm sạch HTML) được đưa vào kiến nghị.</w:t>
       </w:r>
     </w:p>
     <w:p>
@@ -9956,15 +7644,6 @@
             <w:r>
               <w:t xml:space="preserve">Trang chủ</w:t>
             </w:r>
-            <w:r>
-              <w:t xml:space="preserve"> </w:t>
-            </w:r>
-            <w:r>
-              <w:rPr>
-                <w:rStyle w:val="VerbatimChar"/>
-              </w:rPr>
-              <w:t xml:space="preserve">/vi</w:t>
-            </w:r>
           </w:p>
         </w:tc>
         <w:tc>
@@ -10321,31 +8000,7 @@
         <w:t xml:space="preserve"> </w:t>
       </w:r>
       <w:r>
-        <w:t xml:space="preserve">vào cổng chất lượng định kỳ. Ở tầng ứng dụng, các biện pháp chủ động đã hiện thực gồm: băm mật khẩu bcrypt, JWT tách access/refresh, phân quyền hai lớp kiểm thử đầy đủ (4.2.3), làm sạch HTML di trú (loại</w:t>
-      </w:r>
-      <w:r>
-        <w:t xml:space="preserve"> </w:t>
-      </w:r>
-      <w:r>
-        <w:rPr>
-          <w:rStyle w:val="VerbatimChar"/>
-        </w:rPr>
-        <w:t xml:space="preserve">script</w:t>
-      </w:r>
-      <w:r>
-        <w:t xml:space="preserve">, thuộc tính</w:t>
-      </w:r>
-      <w:r>
-        <w:t xml:space="preserve"> </w:t>
-      </w:r>
-      <w:r>
-        <w:rPr>
-          <w:rStyle w:val="VerbatimChar"/>
-        </w:rPr>
-        <w:t xml:space="preserve">on*</w:t>
-      </w:r>
-      <w:r>
-        <w:t xml:space="preserve">), và trả 404 thay vì 403 cho tài nguyên khác bộ môn để tránh dò tài nguyên.</w:t>
+        <w:t xml:space="preserve">vào cổng chất lượng định kỳ. Ở tầng ứng dụng, các biện pháp chủ động đã hiện thực gồm: băm mật khẩu bcrypt, JWT tách access/refresh, phân quyền hai lớp kiểm thử đầy đủ (4.2.3), làm sạch HTML di trú (loại mã kịch bản và thuộc tính bắt sự kiện), và trả 404 thay vì 403 cho tài nguyên khác bộ môn để tránh dò tài nguyên.</w:t>
       </w:r>
     </w:p>
     <w:bookmarkEnd w:id="99"/>
@@ -10472,22 +8127,7 @@
         <w:t xml:space="preserve"> </w:t>
       </w:r>
       <w:r>
-        <w:t xml:space="preserve">khai báo quan hệ giữa hai phiên bản ngôn ngữ vi/en — hai phiên bản mới chỉ phân tách bằng tiền tố URL. Thiếu sót này không ngăn việc lập chỉ mục nhưng có thể khiến công cụ tìm kiếm chọn sai phiên bản ngôn ngữ cho người dùng quốc tế; việc bổ sung thuộc tính</w:t>
-      </w:r>
-      <w:r>
-        <w:t xml:space="preserve"> </w:t>
-      </w:r>
-      <w:r>
-        <w:rPr>
-          <w:rStyle w:val="VerbatimChar"/>
-        </w:rPr>
-        <w:t xml:space="preserve">alternates.languages</w:t>
-      </w:r>
-      <w:r>
-        <w:t xml:space="preserve"> </w:t>
-      </w:r>
-      <w:r>
-        <w:t xml:space="preserve">trong metadata Next.js là thay đổi nhỏ, được xếp vào danh mục việc cần làm trước vận hành chính thức.</w:t>
+        <w:t xml:space="preserve">khai báo quan hệ giữa hai phiên bản ngôn ngữ vi/en — hai phiên bản mới chỉ phân tách bằng tiền tố URL. Thiếu sót này không ngăn việc lập chỉ mục nhưng có thể khiến công cụ tìm kiếm chọn sai phiên bản ngôn ngữ cho người dùng quốc tế; việc khai báo phiên bản ngôn ngữ thay thế trong cấu hình metadata của Next.js là thay đổi nhỏ, được xếp vào danh mục việc cần làm trước vận hành chính thức.</w:t>
       </w:r>
     </w:p>
     <w:bookmarkEnd w:id="101"/>
@@ -10505,22 +8145,7 @@
         <w:pStyle w:val="FirstParagraph"/>
       </w:pPr>
       <w:r>
-        <w:t xml:space="preserve">Khối JSON-LD</w:t>
-      </w:r>
-      <w:r>
-        <w:t xml:space="preserve"> </w:t>
-      </w:r>
-      <w:r>
-        <w:rPr>
-          <w:rStyle w:val="VerbatimChar"/>
-        </w:rPr>
-        <w:t xml:space="preserve">NewsArticle</w:t>
-      </w:r>
-      <w:r>
-        <w:t xml:space="preserve"> </w:t>
-      </w:r>
-      <w:r>
-        <w:t xml:space="preserve">trên trang bài viết cần kiểm định bằng công cụ chính thức: 【CHƯA ĐO: kết quả Schema.org Validator / Google Rich Results Test trên 2–3 trang bài viết — chạy được ngay khi bản triển khai truy cập từ Internet】.</w:t>
+        <w:t xml:space="preserve">Khối JSON-LD loại NewsArticle trên trang bài viết cần kiểm định bằng công cụ chính thức: 【CHƯA ĐO: kết quả Schema.org Validator / Google Rich Results Test trên 2–3 trang bài viết — chạy được ngay khi bản triển khai truy cập từ Internet】.</w:t>
       </w:r>
     </w:p>
     <w:bookmarkEnd w:id="102"/>
@@ -10788,30 +8413,18 @@
               <w:pStyle w:val="Compact"/>
             </w:pPr>
             <w:r>
-              <w:t xml:space="preserve">Bảng dịch riêng, JOIN mỗi truy vấn</w:t>
-            </w:r>
-          </w:p>
-        </w:tc>
-        <w:tc>
-          <w:tcPr/>
-          <w:p>
-            <w:pPr>
-              <w:pStyle w:val="Compact"/>
-            </w:pPr>
-            <w:r>
-              <w:t xml:space="preserve">JSON</w:t>
-            </w:r>
-            <w:r>
-              <w:t xml:space="preserve"> </w:t>
-            </w:r>
-            <w:r>
-              <w:rPr>
-                <w:rStyle w:val="VerbatimChar"/>
-              </w:rPr>
-              <w:t xml:space="preserve">{vi, en}</w:t>
-            </w:r>
-            <w:r>
-              <w:t xml:space="preserve">, giao diện hai thẻ, tự lùi về tiếng Việt</w:t>
+              <w:t xml:space="preserve">Bảng dịch riêng, phải kết nối bảng mỗi truy vấn</w:t>
+            </w:r>
+          </w:p>
+        </w:tc>
+        <w:tc>
+          <w:tcPr/>
+          <w:p>
+            <w:pPr>
+              <w:pStyle w:val="Compact"/>
+            </w:pPr>
+            <w:r>
+              <w:t xml:space="preserve">JSON song ngữ, giao diện hai thẻ, tự lùi về tiếng Việt</w:t>
             </w:r>
           </w:p>
         </w:tc>
@@ -11093,16 +8706,7 @@
               <w:pStyle w:val="Compact"/>
             </w:pPr>
             <w:r>
-              <w:t xml:space="preserve">Website mới (</w:t>
-            </w:r>
-            <w:r>
-              <w:rPr>
-                <w:rStyle w:val="VerbatimChar"/>
-              </w:rPr>
-              <w:t xml:space="preserve">/vi</w:t>
-            </w:r>
-            <w:r>
-              <w:t xml:space="preserve">)</w:t>
+              <w:t xml:space="preserve">Website mới</w:t>
             </w:r>
           </w:p>
         </w:tc>
@@ -11777,19 +9381,7 @@
         <w:pStyle w:val="BodyText"/>
       </w:pPr>
       <w:r>
-        <w:t xml:space="preserve">Kết quả cho thấy khoảng cách lớn nhất nằm ở nhóm hiệu năng tải trang. Trang chủ cũ tải về 21,2 MB qua 137 yêu cầu HTTP mà không nạp trễ bất kỳ ảnh nào, khiến trong điều kiện mạng di động mô phỏng, chỉ số LCP lên tới 86,5 giây và Speed Index 30,8 giây — nói cách khác, người dùng điện thoại ở điều kiện mạng trung bình gần như không đợi được đến lúc trang hiển thị xong. Trang chủ mới, với cùng lượng nội dung hiển thị tương đương, chỉ tải 0,82 MB qua 27 yêu cầu: mức giảm 96% trọng lượng này là kết quả cộng hưởng của kết xuất HTML sẵn phía máy chủ, nạp trễ 44/45 ảnh và tối ưu kích thước ảnh qua</w:t>
-      </w:r>
-      <w:r>
-        <w:t xml:space="preserve"> </w:t>
-      </w:r>
-      <w:r>
-        <w:rPr>
-          <w:rStyle w:val="VerbatimChar"/>
-        </w:rPr>
-        <w:t xml:space="preserve">next/image</w:t>
-      </w:r>
-      <w:r>
-        <w:t xml:space="preserve">, đưa toàn bộ các chỉ số tốc độ về vùng chấp nhận được (FCP 1,25 giây; TBT giảm 94%) và độ ổn định bố cục về mức lý tưởng (CLS 0,243 → 0,000). Cần lưu ý một cách trung thực rằng phép đo trang mới không chứa độ trễ mạng thật ở thành phần phản hồi máy chủ; tuy nhiên các chỉ số chênh lệch nhiều lần ở trên chủ yếu phản ánh khối lượng tài nguyên và cấu trúc trang — các yếu tố không đổi khi triển khai — nên xu hướng so sánh vẫn giữ nguyên khi đo lại trên tên miền chính thức.</w:t>
+        <w:t xml:space="preserve">Kết quả cho thấy khoảng cách lớn nhất nằm ở nhóm hiệu năng tải trang. Trang chủ cũ tải về 21,2 MB qua 137 yêu cầu HTTP mà không nạp trễ bất kỳ ảnh nào, khiến trong điều kiện mạng di động mô phỏng, chỉ số LCP lên tới 86,5 giây và Speed Index 30,8 giây — nói cách khác, người dùng điện thoại ở điều kiện mạng trung bình gần như không đợi được đến lúc trang hiển thị xong. Trang chủ mới, với cùng lượng nội dung hiển thị tương đương, chỉ tải 0,82 MB qua 27 yêu cầu: mức giảm 96% trọng lượng này là kết quả cộng hưởng của kết xuất HTML sẵn phía máy chủ, nạp trễ 44/45 ảnh và tối ưu kích thước ảnh tự động, đưa toàn bộ các chỉ số tốc độ về vùng chấp nhận được (FCP 1,25 giây; TBT giảm 94%) và độ ổn định bố cục về mức lý tưởng (CLS 0,243 → 0,000). Cần lưu ý một cách trung thực rằng phép đo trang mới không chứa độ trễ mạng thật ở thành phần phản hồi máy chủ; tuy nhiên các chỉ số chênh lệch nhiều lần ở trên chủ yếu phản ánh khối lượng tài nguyên và cấu trúc trang — các yếu tố không đổi khi triển khai — nên xu hướng so sánh vẫn giữ nguyên khi đo lại trên tên miền chính thức.</w:t>
       </w:r>
     </w:p>
     <w:p>
@@ -12270,22 +9862,7 @@
         <w:t xml:space="preserve"> </w:t>
       </w:r>
       <w:r>
-        <w:t xml:space="preserve">còn 51 cảnh báo lỗ hổng trong cây phụ thuộc (trong đó 3 mức nghiêm trọng), đòi hỏi một chu trình nâng cấp thư viện và đánh giá khả năng khai thác thực tế của từng cảnh báo. Về dữ liệu, một phần nhỏ tư liệu nguồn hỏng không thể phục hồi (43 tệp phương tiện lỗi ngay trên máy chủ cũ), và ba trang nội dung dạng ảnh hoặc PDF nhúng hiển thị phụ thuộc vào proxy</w:t>
-      </w:r>
-      <w:r>
-        <w:t xml:space="preserve"> </w:t>
-      </w:r>
-      <w:r>
-        <w:rPr>
-          <w:rStyle w:val="VerbatimChar"/>
-        </w:rPr>
-        <w:t xml:space="preserve">/uploads</w:t>
-      </w:r>
-      <w:r>
-        <w:t xml:space="preserve"> </w:t>
-      </w:r>
-      <w:r>
-        <w:t xml:space="preserve">ở môi trường sản xuất. Cuối cùng, các nghiệp vụ đào tạo chuyên sâu của hệ thống cũ như thời khóa biểu, môn học hay hồ sơ cán bộ chi tiết mới dừng ở mức bảo toàn dữ liệu trong kế hoạch di trú mở rộng, chưa có giao diện quản trị riêng.</w:t>
+        <w:t xml:space="preserve">còn 51 cảnh báo lỗ hổng trong cây phụ thuộc (trong đó 3 mức nghiêm trọng), đòi hỏi một chu trình nâng cấp thư viện và đánh giá khả năng khai thác thực tế của từng cảnh báo. Về dữ liệu, một phần nhỏ tư liệu nguồn hỏng không thể phục hồi (43 tệp phương tiện lỗi ngay trên máy chủ cũ), và ba trang nội dung dạng ảnh hoặc PDF nhúng hiển thị phụ thuộc vào lớp trung chuyển tệp phương tiện ở môi trường sản xuất. Cuối cùng, các nghiệp vụ đào tạo chuyên sâu của hệ thống cũ như thời khóa biểu, môn học hay hồ sơ cán bộ chi tiết mới dừng ở mức bảo toàn dữ liệu trong kế hoạch di trú mở rộng, chưa có giao diện quản trị riêng.</w:t>
       </w:r>
     </w:p>
     <w:bookmarkEnd w:id="112"/>

</xml_diff>

<commit_message>
docs(kltn): impersonal academic voice (no first-person pronouns); re-export docx
Co-Authored-By: Claude Fable 5 <noreply@anthropic.com>
</commit_message>
<xml_diff>
--- a/thesis/KLTN_BANTHAO.docx
+++ b/thesis/KLTN_BANTHAO.docx
@@ -88,7 +88,7 @@
         <w:pStyle w:val="FirstParagraph"/>
       </w:pPr>
       <w:r>
-        <w:t xml:space="preserve">Website hiện hành của Khoa Vật lý – Vật lý Kỹ thuật vận hành trên một hệ quản trị nội dung viết bằng PHP với cơ sở dữ liệu MariaDB 10.6, được phát triển theo đơn đặt hàng từ nhiều năm trước. Qua khảo sát trực tiếp mã nguồn cơ sở dữ liệu (bản sao lưu 70 MB, 46 bảng), chúng tôi ghi nhận hệ thống đang lưu trữ khoảng 1.651 bài viết, 273 trang nội dung tĩnh, 415 môn học, 126 hồ sơ cán bộ cùng nhiều dữ liệu song ngữ Việt – Anh khác. Đây là khối tài sản thông tin lớn, nhưng nền tảng bên dưới lại tồn tại những hạn chế căn bản, có thể chia thành bốn nhóm.</w:t>
+        <w:t xml:space="preserve">Website hiện hành của Khoa Vật lý – Vật lý Kỹ thuật vận hành trên một hệ quản trị nội dung viết bằng PHP với cơ sở dữ liệu MariaDB 10.6, được phát triển theo đơn đặt hàng từ nhiều năm trước. Kết quả khảo sát trực tiếp cơ sở dữ liệu (bản sao lưu 70 MB, 46 bảng) cho thấy hệ thống đang lưu trữ khoảng 1.651 bài viết, 273 trang nội dung tĩnh, 415 môn học, 126 hồ sơ cán bộ cùng nhiều dữ liệu song ngữ Việt – Anh khác. Đây là khối tài sản thông tin lớn, nhưng nền tảng bên dưới lại tồn tại những hạn chế căn bản, có thể chia thành bốn nhóm.</w:t>
       </w:r>
     </w:p>
     <w:p>
@@ -366,7 +366,7 @@
         <w:pStyle w:val="BodyText"/>
       </w:pPr>
       <w:r>
-        <w:t xml:space="preserve">Giai đoạn thứ nhất là khảo sát và thiết kế. Chúng tôi phục hồi bản sao lưu cơ sở dữ liệu MariaDB của hệ thống cũ vào môi trường Docker cục bộ, phân tích 46 bảng để xác định mẫu tổ chức dữ liệu song ngữ</w:t>
+        <w:t xml:space="preserve">Giai đoạn thứ nhất là khảo sát và thiết kế: bản sao lưu cơ sở dữ liệu MariaDB của hệ thống cũ được phục hồi vào môi trường Docker cục bộ; 46 bảng được phân tích để xác định mẫu tổ chức dữ liệu song ngữ</w:t>
       </w:r>
       <w:r>
         <w:t xml:space="preserve"> </w:t>
@@ -543,7 +543,7 @@
         <w:pStyle w:val="BodyText"/>
       </w:pPr>
       <w:r>
-        <w:t xml:space="preserve">Điểm yếu thường bị phê phán của Headless CMS thuần túy là người biên tập mất khả năng nhìn thấy và điều khiển bố cục trang: họ chỉ nhập dữ liệu vào biểu mẫu, còn vị trí hiển thị do lập trình viên quyết định. Nhược điểm này được khắc phục bằng lớp trình xây dựng giao diện trực quan (Visual Builder): một trình soạn thảo kéo – thả trong đó trang được mô tả như cây các khối thành phần (component) đã đăng ký trước, mỗi khối có bảng thuộc tính riêng, và toàn bộ cây được lưu dưới dạng dữ liệu JSON thay vì HTML. Trong đề tài này, chúng tôi sử dụng Puck — thư viện Visual Builder mã nguồn mở cho React — làm nền cho trình dàn trang [2]. Vì đầu ra của Puck là JSON có cấu trúc, bố cục trang trở thành</w:t>
+        <w:t xml:space="preserve">Điểm yếu thường bị phê phán của Headless CMS thuần túy là người biên tập mất khả năng nhìn thấy và điều khiển bố cục trang: họ chỉ nhập dữ liệu vào biểu mẫu, còn vị trí hiển thị do lập trình viên quyết định. Nhược điểm này được khắc phục bằng lớp trình xây dựng giao diện trực quan (Visual Builder): một trình soạn thảo kéo – thả trong đó trang được mô tả như cây các khối thành phần (component) đã đăng ký trước, mỗi khối có bảng thuộc tính riêng, và toàn bộ cây được lưu dưới dạng dữ liệu JSON thay vì HTML. Đề tài này sử dụng Puck — thư viện Visual Builder mã nguồn mở cho React — làm nền cho trình dàn trang [2]. Vì đầu ra của Puck là JSON có cấu trúc, bố cục trang trở thành</w:t>
       </w:r>
       <w:r>
         <w:t xml:space="preserve"> </w:t>
@@ -7520,7 +7520,7 @@
         <w:pStyle w:val="BodyText"/>
       </w:pPr>
       <w:r>
-        <w:t xml:space="preserve">Ở chiều ngược lại, số liệu cũng chỉ ra hai điểm cần cải thiện mà chúng tôi ghi nhận trung thực. Thứ nhất, LCP của ba trang bố cục (4,2–6,2 giây) chưa đạt ngưỡng tốt: phần tử LCP là ảnh nền hero khổ lớn, hiện chưa được nén đủ mạnh cho điều kiện Slow 4G — hướng xử lý là chuyển ảnh hero sang định dạng AVIF/WebP kích thước theo khung nhìn. Thứ hai, trang bài viết di trú tuy có LCP tốt nhất (2,58 giây) nhưng TBT lên tới 1.963 ms và CLS 0,179: thân bài HTML giữ nguyên từ hệ thống cũ chứa ảnh gốc độ phân giải đầy đủ không khai báo kích thước, nằm ngoài đường tối ưu ảnh của hệ thống (hạn chế đã nêu tại mục 3.7.3). Đây là cái giá của quyết định giữ nguyên vẹn nội dung di trú; biện pháp khắc phục (nén lại kho ảnh legacy, bổ sung thuộc tính kích thước khi làm sạch HTML) được đưa vào kiến nghị.</w:t>
+        <w:t xml:space="preserve">Ở chiều ngược lại, số liệu cũng chỉ ra hai điểm cần cải thiện, được ghi nhận trung thực tại đây. Thứ nhất, LCP của ba trang bố cục (4,2–6,2 giây) chưa đạt ngưỡng tốt: phần tử LCP là ảnh nền hero khổ lớn, hiện chưa được nén đủ mạnh cho điều kiện Slow 4G — hướng xử lý là chuyển ảnh hero sang định dạng AVIF/WebP kích thước theo khung nhìn. Thứ hai, trang bài viết di trú tuy có LCP tốt nhất (2,58 giây) nhưng TBT lên tới 1.963 ms và CLS 0,179: thân bài HTML giữ nguyên từ hệ thống cũ chứa ảnh gốc độ phân giải đầy đủ không khai báo kích thước, nằm ngoài đường tối ưu ảnh của hệ thống (hạn chế đã nêu tại mục 3.7.3). Đây là cái giá của quyết định giữ nguyên vẹn nội dung di trú; biện pháp khắc phục (nén lại kho ảnh legacy, bổ sung thuộc tính kích thước khi làm sạch HTML) được đưa vào kiến nghị.</w:t>
       </w:r>
     </w:p>
     <w:p>
@@ -7876,7 +7876,7 @@
         <w:pStyle w:val="BodyText"/>
       </w:pPr>
       <w:r>
-        <w:t xml:space="preserve">Điểm Accessibility ở mức 80–91 là hạng mục chúng tôi đánh giá là cần cải thiện nhất: các cảnh báo tập trung vào độ tương phản màu chữ trên nền và nhãn ARIA của một số nút điều khiển trong các khối giao diện dựng sẵn. Đáng lưu ý, điểm Accessibility trang chủ mới (80) thấp hơn trang chủ website cũ (88, mục 4.7.1) — một kết quả ngược kỳ vọng mà chúng tôi báo cáo trung thực: giao diện cũ đơn giản về cấu trúc nên ít vi phạm hơn, trong khi giao diện mới nhiều thành phần tương tác hơn thì mỗi thành phần là một điểm có thể vi phạm. Việc rà lại độ tương phản của hệ màu và bổ sung nhãn ARIA được đưa vào danh mục việc cần làm trước khi vận hành chính thức.</w:t>
+        <w:t xml:space="preserve">Điểm Accessibility ở mức 80–91 là hạng mục cần cải thiện nhất: các cảnh báo tập trung vào độ tương phản màu chữ trên nền và nhãn ARIA của một số nút điều khiển trong các khối giao diện dựng sẵn. Đáng lưu ý, điểm Accessibility trang chủ mới (80) thấp hơn trang chủ website cũ (88, mục 4.7.1) — một kết quả ngược kỳ vọng cần được báo cáo trung thực: giao diện cũ đơn giản về cấu trúc nên ít vi phạm hơn, trong khi giao diện mới nhiều thành phần tương tác hơn thì mỗi thành phần là một điểm có thể vi phạm. Việc rà lại độ tương phản của hệ màu và bổ sung nhãn ARIA được đưa vào danh mục việc cần làm trước khi vận hành chính thức.</w:t>
       </w:r>
     </w:p>
     <w:bookmarkEnd w:id="96"/>
@@ -7970,7 +7970,7 @@
         <w:t xml:space="preserve"> </w:t>
       </w:r>
       <w:r>
-        <w:t xml:space="preserve">trong cây phụ thuộc: 3 mức nghiêm trọng (critical), 21 cao, 21 trung bình, 6 thấp. Chúng tôi trình bày số liệu này trung thực như một hạng mục bảo trì đang mở: phần lớn cảnh báo nằm ở phụ thuộc gián tiếp của các công cụ phát triển và một số thư viện có bản vá ở phiên bản mới hơn (ví dụ</w:t>
+        <w:t xml:space="preserve">trong cây phụ thuộc: 3 mức nghiêm trọng (critical), 21 cao, 21 trung bình, 6 thấp. Số liệu này được trình bày trung thực như một hạng mục bảo trì đang mở: phần lớn cảnh báo nằm ở phụ thuộc gián tiếp của các công cụ phát triển và một số thư viện có bản vá ở phiên bản mới hơn (ví dụ</w:t>
       </w:r>
       <w:r>
         <w:t xml:space="preserve"> </w:t>
@@ -9880,7 +9880,7 @@
         <w:pStyle w:val="FirstParagraph"/>
       </w:pPr>
       <w:r>
-        <w:t xml:space="preserve">Từ kết quả và hạn chế trên, chúng tôi kiến nghị lộ trình phát triển tiếp theo theo thứ tự ưu tiên. Bước điều kiện cho mọi đánh giá định lượng tiếp theo là gắn tên miền chính thức và HTTPS cho bản triển khai, từ đó hoàn tất nhóm phép đo còn treo ở Chương 4 và thiết lập theo dõi Core Web Vitals định kỳ qua Search Console. Song song, cần đưa việc bảo trì phụ thuộc vào nề nếp: nâng cấp các gói đã có bản vá, đưa</w:t>
+        <w:t xml:space="preserve">Từ kết quả và hạn chế trên, lộ trình phát triển tiếp theo được kiến nghị theo thứ tự ưu tiên như sau. Bước điều kiện cho mọi đánh giá định lượng tiếp theo là gắn tên miền chính thức và HTTPS cho bản triển khai, từ đó hoàn tất nhóm phép đo còn treo ở Chương 4 và thiết lập theo dõi Core Web Vitals định kỳ qua Search Console. Song song, cần đưa việc bảo trì phụ thuộc vào nề nếp: nâng cấp các gói đã có bản vá, đưa</w:t>
       </w:r>
       <w:r>
         <w:t xml:space="preserve"> </w:t>

</xml_diff>

<commit_message>
docs(kltn): remove all reflexive 'minh' pronouns; re-export docx
Co-Authored-By: Claude Fable 5 <noreply@anthropic.com>
</commit_message>
<xml_diff>
--- a/thesis/KLTN_BANTHAO.docx
+++ b/thesis/KLTN_BANTHAO.docx
@@ -217,7 +217,7 @@
         <w:t xml:space="preserve"> </w:t>
       </w:r>
       <w:r>
-        <w:t xml:space="preserve">Khoa gồm văn phòng khoa và nhiều bộ môn, mỗi bộ môn có nhu cầu tự quản lý tin tức của mình. Hệ thống cũ tuy có trường</w:t>
+        <w:t xml:space="preserve">Khoa gồm văn phòng khoa và nhiều bộ môn, mỗi bộ môn có nhu cầu tự quản lý tin tức của đơn vị. Hệ thống cũ tuy có trường</w:t>
       </w:r>
       <w:r>
         <w:t xml:space="preserve"> </w:t>
@@ -266,7 +266,7 @@
         <w:pStyle w:val="BodyText"/>
       </w:pPr>
       <w:r>
-        <w:t xml:space="preserve">Mục tiêu thứ nhất là thiết kế kiến trúc hệ thống theo mô hình Headless CMS ba tầng, trong đó máy chủ API NestJS làm nguồn chân lý duy nhất về dữ liệu, còn trang quản trị và trang công khai là hai ứng dụng Next.js độc lập. Mục tiêu thứ hai là xây dựng trang quản trị với trình xây dựng giao diện trực quan (Visual Builder) cho phép kéo – thả khối nội dung, cùng các phân hệ quản lý bài viết song ngữ, thư viện phương tiện, quy trình xuất bản có lên lịch và lịch sử phiên bản bố cục. Mục tiêu thứ ba là hiện thực cơ chế xác thực và phân quyền hai vai trò (quản trị viên cấp cao và quản trị viên) kết hợp phân quyền theo bộ môn, sao cho quản trị viên bộ môn chỉ thao tác được trên nội dung của bộ môn mình. Mục tiêu thứ tư là di trú toàn bộ dữ liệu từ hệ thống cũ — bài viết, trang nội dung, chuyên mục, đơn vị và tư liệu hình ảnh — sang lược đồ mới một cách tự động, có thể chạy lặp lại, kèm chuyển hướng các URL cũ. Mục tiêu thứ năm là tối ưu hiệu năng và SEO cho trang công khai thông qua kết xuất phía máy chủ, bộ nhớ đệm nhiều tầng, metadata động, sitemap, dữ liệu có cấu trúc và mức sẵn sàng cho công cụ tìm kiếm dùng trí tuệ nhân tạo. Mục tiêu cuối cùng là đóng gói và triển khai hệ thống bằng Docker trên máy chủ do Khoa cấp, kèm quy trình khởi tạo dữ liệu tự động để hệ thống có thể dựng lại hoàn toàn từ mã nguồn.</w:t>
+        <w:t xml:space="preserve">Mục tiêu thứ nhất là thiết kế kiến trúc hệ thống theo mô hình Headless CMS ba tầng, trong đó máy chủ API NestJS làm nguồn chân lý duy nhất về dữ liệu, còn trang quản trị và trang công khai là hai ứng dụng Next.js độc lập. Mục tiêu thứ hai là xây dựng trang quản trị với trình xây dựng giao diện trực quan (Visual Builder) cho phép kéo – thả khối nội dung, cùng các phân hệ quản lý bài viết song ngữ, thư viện phương tiện, quy trình xuất bản có lên lịch và lịch sử phiên bản bố cục. Mục tiêu thứ ba là hiện thực cơ chế xác thực và phân quyền hai vai trò (quản trị viên cấp cao và quản trị viên) kết hợp phân quyền theo bộ môn, sao cho quản trị viên bộ môn chỉ thao tác được trên nội dung của bộ môn trực thuộc. Mục tiêu thứ tư là di trú toàn bộ dữ liệu từ hệ thống cũ — bài viết, trang nội dung, chuyên mục, đơn vị và tư liệu hình ảnh — sang lược đồ mới một cách tự động, có thể chạy lặp lại, kèm chuyển hướng các URL cũ. Mục tiêu thứ năm là tối ưu hiệu năng và SEO cho trang công khai thông qua kết xuất phía máy chủ, bộ nhớ đệm nhiều tầng, metadata động, sitemap, dữ liệu có cấu trúc và mức sẵn sàng cho công cụ tìm kiếm dùng trí tuệ nhân tạo. Mục tiêu cuối cùng là đóng gói và triển khai hệ thống bằng Docker trên máy chủ do Khoa cấp, kèm quy trình khởi tạo dữ liệu tự động để hệ thống có thể dựng lại hoàn toàn từ mã nguồn.</w:t>
       </w:r>
     </w:p>
     <w:p>
@@ -1155,7 +1155,7 @@
               <w:pStyle w:val="Compact"/>
             </w:pPr>
             <w:r>
-              <w:t xml:space="preserve">Hai vai trò (quản trị viên cấp cao, quản trị viên); quản trị viên bộ môn chỉ thao tác trên nội dung bộ môn mình; văn phòng khoa quản lý nội dung toàn khoa</w:t>
+              <w:t xml:space="preserve">Hai vai trò (quản trị viên cấp cao, quản trị viên); quản trị viên bộ môn chỉ thao tác trên nội dung bộ môn trực thuộc; văn phòng khoa quản lý nội dung toàn khoa</w:t>
             </w:r>
           </w:p>
         </w:tc>
@@ -2714,7 +2714,7 @@
         <w:pStyle w:val="FirstParagraph"/>
       </w:pPr>
       <w:r>
-        <w:t xml:space="preserve">Chiều phân quyền thứ hai — phạm vi bộ môn — biến hệ thống thành mô hình nhiều đơn vị thuê chung (multi-tenant) mềm: cả ba loại nội dung (bài viết, bố cục, phương tiện) đều mang nhãn bộ môn, và quản trị viên thuộc một bộ môn chỉ thao tác trong phạm vi của mình. Toàn bộ quy tắc được cài đặt tập trung trong ba hàm thuần túy thuộc phân hệ dùng chung của máy chủ API. Hàm thứ nhất sinh điều kiện lọc cho các truy vấn đọc và liệt kê: quản trị viên cấp cao không bị giới hạn; quản trị viên văn phòng khoa hoặc chưa gán bộ môn thấy nội dung toàn khoa cùng nội dung chưa gắn nhãn; quản trị viên bộ môn chỉ thấy nội dung của bộ môn mình. Hàm thứ hai là biến thể dành cho thư viện phương tiện: quản trị viên bộ môn được đọc thêm tư liệu dùng chung của khoa để chèn vào bài viết, nhưng chỉ sửa hoặc xóa được tư liệu thuộc bộ môn mình. Hàm thứ ba là cổng kiểm tra cho mọi thao tác ghi; yêu cầu vi phạm nhận phản hồi 404 thay vì 403 nhằm không tiết lộ sự tồn tại của tài nguyên khác bộ môn. Ma trận quyền tổng hợp trong Bảng 3.3.</w:t>
+        <w:t xml:space="preserve">Chiều phân quyền thứ hai — phạm vi bộ môn — biến hệ thống thành mô hình nhiều đơn vị thuê chung (multi-tenant) mềm: cả ba loại nội dung (bài viết, bố cục, phương tiện) đều mang nhãn bộ môn, và quản trị viên thuộc một bộ môn chỉ thao tác trong phạm vi bộ môn trực thuộc. Toàn bộ quy tắc được cài đặt tập trung trong ba hàm thuần túy thuộc phân hệ dùng chung của máy chủ API. Hàm thứ nhất sinh điều kiện lọc cho các truy vấn đọc và liệt kê: quản trị viên cấp cao không bị giới hạn; quản trị viên văn phòng khoa hoặc chưa gán bộ môn thấy nội dung toàn khoa cùng nội dung chưa gắn nhãn; quản trị viên bộ môn chỉ thấy nội dung của bộ môn trực thuộc. Hàm thứ hai là biến thể dành cho thư viện phương tiện: quản trị viên bộ môn được đọc thêm tư liệu dùng chung của khoa để chèn vào bài viết, nhưng chỉ sửa hoặc xóa được tư liệu của chính bộ môn đó. Hàm thứ ba là cổng kiểm tra cho mọi thao tác ghi; yêu cầu vi phạm nhận phản hồi 404 thay vì 403 nhằm không tiết lộ sự tồn tại của tài nguyên khác bộ môn. Ma trận quyền tổng hợp trong Bảng 3.3.</w:t>
       </w:r>
     </w:p>
     <w:p>
@@ -2776,7 +2776,7 @@
               <w:pStyle w:val="Compact"/>
             </w:pPr>
             <w:r>
-              <w:t xml:space="preserve">Nội dung bộ môn mình</w:t>
+              <w:t xml:space="preserve">Nội dung bộ môn trực thuộc</w:t>
             </w:r>
           </w:p>
         </w:tc>
@@ -2980,7 +2980,7 @@
         <w:pStyle w:val="BodyText"/>
       </w:pPr>
       <w:r>
-        <w:t xml:space="preserve">Việc dồn quy tắc vào các hàm thuần túy (không phụ thuộc cơ sở dữ liệu) cho phép kiểm thử đơn vị trực tiếp từng nhánh logic; bộ kiểm thử phân quyền thuộc 40 ca kiểm thử backend trình bày ở Chương 4. Ở tầng URL công khai, nội dung bộ môn mang tiền tố tên bộ môn trên đường dẫn (chẳng hạn /vat-ly-ung-dung/tin-tuc/…), nội dung toàn khoa giữ đường dẫn phẳng (/tin-tuc/…); mỗi bộ môn có trang riêng tại địa chỉ mang tên mình do chính bộ môn đó biên tập.</w:t>
+        <w:t xml:space="preserve">Việc dồn quy tắc vào các hàm thuần túy (không phụ thuộc cơ sở dữ liệu) cho phép kiểm thử đơn vị trực tiếp từng nhánh logic; bộ kiểm thử phân quyền thuộc 40 ca kiểm thử backend trình bày ở Chương 4. Ở tầng URL công khai, nội dung bộ môn mang tiền tố tên bộ môn trên đường dẫn (chẳng hạn /vat-ly-ung-dung/tin-tuc/…), nội dung toàn khoa giữ đường dẫn phẳng (/tin-tuc/…); mỗi bộ môn có trang riêng tại địa chỉ mang tên bộ môn do chính bộ môn đó biên tập.</w:t>
       </w:r>
     </w:p>
     <w:bookmarkEnd w:id="52"/>
@@ -5901,7 +5901,7 @@
               <w:pStyle w:val="Compact"/>
             </w:pPr>
             <w:r>
-              <w:t xml:space="preserve">Chỉ nhận bài viết bộ môn mình</w:t>
+              <w:t xml:space="preserve">Chỉ nhận bài viết của bộ môn trực thuộc</w:t>
             </w:r>
           </w:p>
         </w:tc>
@@ -5936,7 +5936,7 @@
               <w:pStyle w:val="Compact"/>
             </w:pPr>
             <w:r>
-              <w:t xml:space="preserve">Quản trị viên bộ môn đọc chi tiết bài viết của bộ môn mình</w:t>
+              <w:t xml:space="preserve">Quản trị viên bộ môn đọc chi tiết bài viết của bộ môn trực thuộc</w:t>
             </w:r>
           </w:p>
         </w:tc>
@@ -6039,7 +6039,7 @@
               <w:pStyle w:val="Compact"/>
             </w:pPr>
             <w:r>
-              <w:t xml:space="preserve">Thấy tư liệu bộ môn mình + tư liệu dùng chung của khoa; không có nút sửa/xóa trên tư liệu dùng chung</w:t>
+              <w:t xml:space="preserve">Thấy tư liệu của bộ môn trực thuộc + tư liệu dùng chung của khoa; không có nút sửa/xóa trên tư liệu dùng chung</w:t>
             </w:r>
           </w:p>
         </w:tc>

</xml_diff>